<commit_message>
fix(usp71): enforce 100% Times New Roman across all cells in Celsis-style 71 tables
</commit_message>
<xml_diff>
--- a/scratch/Tables OOS-262064 Blue Ocean Rx, LLC (E75110) - USP71.docx
+++ b/scratch/Tables OOS-262064 Blue Ocean Rx, LLC (E75110) - USP71.docx
@@ -132,7 +132,6 @@
         <w:trPr>
           <w:trHeight w:val="906"/>
           <w:jc w:val="center"/>
-          <w:trHeight w:val="220" w:hRule="atLeast"/>
         </w:trPr>
         <w:tc>
           <w:tcPr>
@@ -143,7 +142,6 @@
           <w:p>
             <w:pPr>
               <w:pStyle w:val="Default"/>
-              <w:spacing w:before="0" w:after="0"/>
               <w:jc w:val="center"/>
               <w:rPr>
                 <w:bCs/>
@@ -153,11 +151,21 @@
             </w:pPr>
             <w:r>
               <w:rPr>
-                <w:rFonts w:ascii="Times New Roman" w:hAnsi="Times New Roman"/>
-                <w:b/>
-                <w:sz w:val="15"/>
-              </w:rPr>
-              <w:t>Processing Analyst</w:t>
+                <w:bCs/>
+                <w:sz w:val="14"/>
+                <w:szCs w:val="14"/>
+                <w:rFonts w:ascii="Times New Roman" w:hAnsi="Times New Roman" w:cs="Times New Roman"/>
+              </w:rPr>
+              <w:t>Processing</w:t>
+            </w:r>
+            <w:r>
+              <w:rPr>
+                <w:bCs/>
+                <w:sz w:val="14"/>
+                <w:szCs w:val="14"/>
+                <w:rFonts w:ascii="Times New Roman" w:hAnsi="Times New Roman" w:cs="Times New Roman"/>
+              </w:rPr>
+              <w:t xml:space="preserve"> Analyst</w:t>
             </w:r>
           </w:p>
         </w:tc>
@@ -169,20 +177,18 @@
           </w:tcPr>
           <w:p>
             <w:pPr>
-              <w:pStyle w:val="Default"/>
-              <w:spacing w:before="0" w:after="0"/>
-              <w:jc w:val="center"/>
-              <w:rPr>
-                <w:bCs/>
-                <w:sz w:val="14"/>
-                <w:szCs w:val="14"/>
-              </w:rPr>
-            </w:pPr>
-            <w:r>
-              <w:rPr>
-                <w:rFonts w:ascii="Times New Roman" w:hAnsi="Times New Roman"/>
+              <w:jc w:val="center"/>
+            </w:pPr>
+            <w:r>
+              <w:rPr>
+                <w:rFonts w:ascii="Times New Roman" w:hAnsi="Times New Roman" w:cs="Times New Roman"/>
+              </w:rPr>
+            </w:r>
+            <w:r>
+              <w:rPr>
                 <w:b/>
-                <w:sz w:val="15"/>
+                <w:sz w:val="14"/>
+                <w:rFonts w:ascii="Times New Roman" w:hAnsi="Times New Roman" w:cs="Times New Roman"/>
               </w:rPr>
               <w:t>Reading Analyst</w:t>
             </w:r>
@@ -197,7 +203,6 @@
           <w:p>
             <w:pPr>
               <w:pStyle w:val="Default"/>
-              <w:spacing w:before="0" w:after="0"/>
               <w:jc w:val="center"/>
               <w:rPr>
                 <w:bCs/>
@@ -207,9 +212,10 @@
             </w:pPr>
             <w:r>
               <w:rPr>
-                <w:rFonts w:ascii="Times New Roman" w:hAnsi="Times New Roman"/>
-                <w:b/>
-                <w:sz w:val="15"/>
+                <w:bCs/>
+                <w:sz w:val="14"/>
+                <w:szCs w:val="14"/>
+                <w:rFonts w:ascii="Times New Roman" w:hAnsi="Times New Roman" w:cs="Times New Roman"/>
               </w:rPr>
               <w:t>Sample ID</w:t>
             </w:r>
@@ -224,7 +230,6 @@
           <w:p>
             <w:pPr>
               <w:pStyle w:val="Default"/>
-              <w:spacing w:before="0" w:after="0"/>
               <w:jc w:val="center"/>
               <w:rPr>
                 <w:bCs/>
@@ -234,9 +239,10 @@
             </w:pPr>
             <w:r>
               <w:rPr>
-                <w:rFonts w:ascii="Times New Roman" w:hAnsi="Times New Roman"/>
-                <w:b/>
-                <w:sz w:val="15"/>
+                <w:bCs/>
+                <w:sz w:val="14"/>
+                <w:szCs w:val="14"/>
+                <w:rFonts w:ascii="Times New Roman" w:hAnsi="Times New Roman" w:cs="Times New Roman"/>
               </w:rPr>
               <w:t>Related Microbial ID</w:t>
             </w:r>
@@ -251,7 +257,6 @@
           <w:p>
             <w:pPr>
               <w:pStyle w:val="Default"/>
-              <w:spacing w:before="0" w:after="0"/>
               <w:jc w:val="center"/>
               <w:rPr>
                 <w:bCs/>
@@ -261,9 +266,10 @@
             </w:pPr>
             <w:r>
               <w:rPr>
-                <w:rFonts w:ascii="Times New Roman" w:hAnsi="Times New Roman"/>
-                <w:b/>
-                <w:sz w:val="15"/>
+                <w:bCs/>
+                <w:sz w:val="14"/>
+                <w:szCs w:val="14"/>
+                <w:rFonts w:ascii="Times New Roman" w:hAnsi="Times New Roman" w:cs="Times New Roman"/>
               </w:rPr>
               <w:t>Media with microbial growth</w:t>
             </w:r>
@@ -278,7 +284,6 @@
           <w:p>
             <w:pPr>
               <w:pStyle w:val="Default"/>
-              <w:spacing w:before="0" w:after="0"/>
               <w:jc w:val="center"/>
               <w:rPr>
                 <w:bCs/>
@@ -288,9 +293,10 @@
             </w:pPr>
             <w:r>
               <w:rPr>
-                <w:rFonts w:ascii="Times New Roman" w:hAnsi="Times New Roman"/>
-                <w:b/>
-                <w:sz w:val="15"/>
+                <w:bCs/>
+                <w:sz w:val="14"/>
+                <w:szCs w:val="14"/>
+                <w:rFonts w:ascii="Times New Roman" w:hAnsi="Times New Roman" w:cs="Times New Roman"/>
               </w:rPr>
               <w:t>Microbial ID</w:t>
             </w:r>
@@ -302,7 +308,6 @@
           <w:cantSplit/>
           <w:trHeight w:val="744"/>
           <w:jc w:val="center"/>
-          <w:trHeight w:val="220" w:hRule="atLeast"/>
         </w:trPr>
         <w:tc>
           <w:tcPr>
@@ -311,7 +316,7 @@
           </w:tcPr>
           <w:p>
             <w:pPr>
-              <w:spacing w:line="360" w:lineRule="auto" w:before="0" w:after="0"/>
+              <w:spacing w:line="360" w:lineRule="auto"/>
               <w:jc w:val="center"/>
               <w:rPr>
                 <w:rFonts w:ascii="Times New Roman" w:hAnsi="Times New Roman"/>
@@ -321,36 +326,35 @@
             </w:pPr>
             <w:r>
               <w:rPr>
-                <w:rFonts w:ascii="Times New Roman" w:hAnsi="Times New Roman"/>
+                <w:sz w:val="14"/>
+                <w:szCs w:val="14"/>
+                <w:rFonts w:ascii="Times New Roman" w:hAnsi="Times New Roman" w:cs="Times New Roman"/>
+              </w:rPr>
+              <w:t xml:space="preserve">Pending</w:t>
+            </w:r>
+          </w:p>
+        </w:tc>
+        <w:tc>
+          <w:tcPr>
+            <w:tcW w:w="1550" w:type="dxa"/>
+            <w:vAlign w:val="center"/>
+          </w:tcPr>
+          <w:p>
+            <w:pPr>
+              <w:jc w:val="center"/>
+            </w:pPr>
+            <w:r>
+              <w:rPr>
+                <w:rFonts w:ascii="Times New Roman" w:hAnsi="Times New Roman" w:cs="Times New Roman"/>
+              </w:rPr>
+            </w:r>
+            <w:r>
+              <w:rPr>
                 <w:b w:val="0"/>
-                <w:sz w:val="15"/>
-              </w:rPr>
-              <w:t>Pending</w:t>
-            </w:r>
-          </w:p>
-        </w:tc>
-        <w:tc>
-          <w:tcPr>
-            <w:tcW w:w="1550" w:type="dxa"/>
-            <w:vAlign w:val="center"/>
-          </w:tcPr>
-          <w:p>
-            <w:pPr>
-              <w:spacing w:line="360" w:lineRule="auto" w:before="0" w:after="0"/>
-              <w:jc w:val="center"/>
-              <w:rPr>
-                <w:rFonts w:ascii="Times New Roman" w:hAnsi="Times New Roman"/>
-                <w:sz w:val="14"/>
-                <w:szCs w:val="14"/>
-              </w:rPr>
-            </w:pPr>
-            <w:r>
-              <w:rPr>
-                <w:rFonts w:ascii="Times New Roman" w:hAnsi="Times New Roman"/>
-                <w:b w:val="0"/>
-                <w:sz w:val="15"/>
-              </w:rPr>
-              <w:t>Qiyue Chen</w:t>
+                <w:sz w:val="14"/>
+                <w:rFonts w:ascii="Times New Roman" w:hAnsi="Times New Roman" w:cs="Times New Roman"/>
+              </w:rPr>
+              <w:t xml:space="preserve">Qiyue Chen</w:t>
             </w:r>
           </w:p>
         </w:tc>
@@ -363,7 +367,7 @@
             <w:pPr>
               <w:jc w:val="center"/>
               <w:rPr>
-                <w:rFonts w:ascii="Times New Roman" w:hAnsi="Times New Roman"/>
+                <w:rFonts w:ascii="Times New Roman" w:hAnsi="Times New Roman" w:cs="Times New Roman"/>
                 <w:sz w:val="14"/>
                 <w:szCs w:val="14"/>
               </w:rPr>
@@ -371,7 +375,7 @@
             <w:hyperlink r:id="rId7" w:history="1">
               <w:r>
                 <w:rPr>
-                  <w:rFonts w:ascii="Times New Roman" w:hAnsi="Times New Roman"/>
+                  <w:rFonts w:ascii="Times New Roman" w:hAnsi="Times New Roman" w:cs="Times New Roman"/>
                   <w:color w:val="0000FF"/>
                   <w:sz w:val="14"/>
                   <w:szCs w:val="14"/>
@@ -391,7 +395,7 @@
             <w:pPr>
               <w:jc w:val="center"/>
               <w:rPr>
-                <w:rFonts w:ascii="Times New Roman" w:hAnsi="Times New Roman"/>
+                <w:rFonts w:ascii="Times New Roman" w:hAnsi="Times New Roman" w:cs="Times New Roman"/>
                 <w:sz w:val="14"/>
                 <w:szCs w:val="14"/>
               </w:rPr>
@@ -399,7 +403,7 @@
             <w:hyperlink r:id="rId8" w:history="1">
               <w:r>
                 <w:rPr>
-                  <w:rFonts w:ascii="Times New Roman" w:hAnsi="Times New Roman"/>
+                  <w:rFonts w:ascii="Times New Roman" w:hAnsi="Times New Roman" w:cs="Times New Roman"/>
                   <w:color w:val="0000FF"/>
                   <w:sz w:val="14"/>
                   <w:szCs w:val="14"/>
@@ -418,7 +422,7 @@
           <w:p>
             <w:pPr>
               <w:pStyle w:val="Default"/>
-              <w:spacing w:line="360" w:lineRule="auto" w:before="0" w:after="0"/>
+              <w:spacing w:line="360" w:lineRule="auto"/>
               <w:jc w:val="center"/>
               <w:rPr>
                 <w:rFonts w:eastAsiaTheme="minorEastAsia"/>
@@ -429,11 +433,11 @@
             </w:pPr>
             <w:r>
               <w:rPr>
-                <w:rFonts w:ascii="Times New Roman" w:hAnsi="Times New Roman"/>
-                <w:b w:val="0"/>
-                <w:sz w:val="15"/>
-              </w:rPr>
-              <w:t>1 x 100mL TSB bottle</w:t>
+                <w:sz w:val="14"/>
+                <w:szCs w:val="14"/>
+                <w:rFonts w:ascii="Times New Roman" w:hAnsi="Times New Roman" w:cs="Times New Roman"/>
+              </w:rPr>
+              <w:t xml:space="preserve">1 x 100mL TSB bottle</w:t>
             </w:r>
           </w:p>
         </w:tc>
@@ -445,7 +449,7 @@
           <w:p>
             <w:pPr>
               <w:pStyle w:val="Default"/>
-              <w:spacing w:line="360" w:lineRule="auto" w:before="0" w:after="0"/>
+              <w:spacing w:line="360" w:lineRule="auto"/>
               <w:jc w:val="center"/>
               <w:rPr>
                 <w:rFonts w:eastAsiaTheme="minorEastAsia"/>
@@ -456,11 +460,11 @@
             </w:pPr>
             <w:r>
               <w:rPr>
-                <w:rFonts w:ascii="Times New Roman" w:hAnsi="Times New Roman"/>
-                <w:b w:val="0"/>
-                <w:sz w:val="15"/>
-              </w:rPr>
-              <w:t>Pending</w:t>
+                <w:sz w:val="14"/>
+                <w:szCs w:val="14"/>
+                <w:rFonts w:ascii="Times New Roman" w:hAnsi="Times New Roman" w:cs="Times New Roman"/>
+              </w:rPr>
+              <w:t xml:space="preserve">Pending</w:t>
             </w:r>
           </w:p>
         </w:tc>
@@ -579,7 +583,6 @@
       <w:tr>
         <w:trPr>
           <w:trHeight w:val="300"/>
-          <w:trHeight w:val="220" w:hRule="atLeast"/>
         </w:trPr>
         <w:tc>
           <w:tcPr>
@@ -603,12 +606,12 @@
             </w:pPr>
             <w:r>
               <w:rPr>
-                <w:rFonts w:ascii="Times New Roman" w:hAnsi="Times New Roman"/>
                 <w:b/>
                 <w:bCs/>
                 <w:color w:val="000000" w:themeColor="text1"/>
                 <w:sz w:val="12"/>
                 <w:szCs w:val="12"/>
+                <w:rFonts w:ascii="Times New Roman" w:hAnsi="Times New Roman" w:cs="Times New Roman"/>
               </w:rPr>
               <w:t>Environmental Monitoring (EM) Sampling Site</w:t>
             </w:r>
@@ -637,12 +640,12 @@
             </w:pPr>
             <w:r>
               <w:rPr>
-                <w:rFonts w:ascii="Times New Roman" w:hAnsi="Times New Roman"/>
                 <w:b/>
                 <w:bCs/>
                 <w:color w:val="000000" w:themeColor="text1"/>
                 <w:sz w:val="12"/>
                 <w:szCs w:val="12"/>
+                <w:rFonts w:ascii="Times New Roman" w:hAnsi="Times New Roman" w:cs="Times New Roman"/>
               </w:rPr>
               <w:t>Frequency</w:t>
             </w:r>
@@ -670,12 +673,12 @@
             </w:pPr>
             <w:r>
               <w:rPr>
-                <w:rFonts w:ascii="Times New Roman" w:hAnsi="Times New Roman"/>
                 <w:b/>
                 <w:bCs/>
                 <w:color w:val="000000" w:themeColor="text1"/>
                 <w:sz w:val="12"/>
                 <w:szCs w:val="12"/>
+                <w:rFonts w:ascii="Times New Roman" w:hAnsi="Times New Roman" w:cs="Times New Roman"/>
               </w:rPr>
               <w:t>Date (DDMMMYY)</w:t>
             </w:r>
@@ -704,12 +707,12 @@
             </w:pPr>
             <w:r>
               <w:rPr>
-                <w:rFonts w:ascii="Times New Roman" w:hAnsi="Times New Roman"/>
                 <w:b/>
                 <w:bCs/>
                 <w:color w:val="000000" w:themeColor="text1"/>
                 <w:sz w:val="12"/>
                 <w:szCs w:val="12"/>
+                <w:rFonts w:ascii="Times New Roman" w:hAnsi="Times New Roman" w:cs="Times New Roman"/>
               </w:rPr>
               <w:t>Analyst (Initials)</w:t>
             </w:r>
@@ -737,12 +740,12 @@
             </w:pPr>
             <w:r>
               <w:rPr>
-                <w:rFonts w:ascii="Times New Roman" w:hAnsi="Times New Roman"/>
                 <w:b/>
                 <w:bCs/>
                 <w:color w:val="000000" w:themeColor="text1"/>
                 <w:sz w:val="12"/>
                 <w:szCs w:val="12"/>
+                <w:rFonts w:ascii="Times New Roman" w:hAnsi="Times New Roman" w:cs="Times New Roman"/>
               </w:rPr>
               <w:t>Day /Week(s)</w:t>
             </w:r>
@@ -771,12 +774,12 @@
             </w:pPr>
             <w:r>
               <w:rPr>
-                <w:rFonts w:ascii="Times New Roman" w:hAnsi="Times New Roman"/>
                 <w:b/>
                 <w:bCs/>
                 <w:color w:val="000000" w:themeColor="text1"/>
                 <w:sz w:val="12"/>
                 <w:szCs w:val="12"/>
+                <w:rFonts w:ascii="Times New Roman" w:hAnsi="Times New Roman" w:cs="Times New Roman"/>
               </w:rPr>
               <w:t>Observation*</w:t>
             </w:r>
@@ -804,12 +807,12 @@
             </w:pPr>
             <w:r>
               <w:rPr>
-                <w:rFonts w:ascii="Times New Roman" w:hAnsi="Times New Roman"/>
                 <w:b/>
                 <w:bCs/>
                 <w:color w:val="000000" w:themeColor="text1"/>
                 <w:sz w:val="12"/>
                 <w:szCs w:val="12"/>
+                <w:rFonts w:ascii="Times New Roman" w:hAnsi="Times New Roman" w:cs="Times New Roman"/>
               </w:rPr>
               <w:t>Environmental Monitoring Plate ETX ID</w:t>
             </w:r>
@@ -837,12 +840,12 @@
             </w:pPr>
             <w:r>
               <w:rPr>
-                <w:rFonts w:ascii="Times New Roman" w:hAnsi="Times New Roman"/>
                 <w:b/>
                 <w:bCs/>
                 <w:color w:val="000000" w:themeColor="text1"/>
                 <w:sz w:val="12"/>
                 <w:szCs w:val="12"/>
+                <w:rFonts w:ascii="Times New Roman" w:hAnsi="Times New Roman" w:cs="Times New Roman"/>
               </w:rPr>
               <w:t>Microbial ID</w:t>
             </w:r>
@@ -871,12 +874,12 @@
             </w:pPr>
             <w:r>
               <w:rPr>
-                <w:rFonts w:ascii="Times New Roman" w:hAnsi="Times New Roman"/>
                 <w:b/>
                 <w:bCs/>
                 <w:color w:val="000000" w:themeColor="text1"/>
                 <w:sz w:val="12"/>
                 <w:szCs w:val="12"/>
+                <w:rFonts w:ascii="Times New Roman" w:hAnsi="Times New Roman" w:cs="Times New Roman"/>
               </w:rPr>
               <w:t xml:space="preserve">Notes </w:t>
             </w:r>
@@ -886,7 +889,6 @@
       <w:tr>
         <w:trPr>
           <w:trHeight w:val="300"/>
-          <w:trHeight w:val="220" w:hRule="atLeast"/>
         </w:trPr>
         <w:tc>
           <w:tcPr>
@@ -908,12 +910,12 @@
           <w:p>
             <w:r>
               <w:rPr>
-                <w:rFonts w:ascii="Times New Roman" w:hAnsi="Times New Roman"/>
                 <w:b/>
                 <w:bCs/>
                 <w:color w:val="000000" w:themeColor="text1"/>
                 <w:sz w:val="14"/>
                 <w:szCs w:val="14"/>
+                <w:rFonts w:ascii="Times New Roman" w:hAnsi="Times New Roman" w:cs="Times New Roman"/>
               </w:rPr>
               <w:t xml:space="preserve"> Personnel EM Bracketing</w:t>
             </w:r>
@@ -923,7 +925,6 @@
       <w:tr>
         <w:trPr>
           <w:trHeight w:val="300"/>
-          <w:trHeight w:val="220" w:hRule="atLeast"/>
         </w:trPr>
         <w:tc>
           <w:tcPr>
@@ -947,10 +948,10 @@
             </w:pPr>
             <w:r>
               <w:rPr>
-                <w:rFonts w:ascii="Times New Roman" w:hAnsi="Times New Roman"/>
-                <w:color w:val="000000" w:themeColor="text1"/>
-                <w:sz w:val="14"/>
-                <w:szCs w:val="14"/>
+                <w:color w:val="000000" w:themeColor="text1"/>
+                <w:sz w:val="14"/>
+                <w:szCs w:val="14"/>
+                <w:rFonts w:ascii="Times New Roman" w:hAnsi="Times New Roman" w:cs="Times New Roman"/>
               </w:rPr>
               <w:t>Personnel (Left Touch and Right Touch)</w:t>
             </w:r>
@@ -979,10 +980,10 @@
             </w:pPr>
             <w:r>
               <w:rPr>
-                <w:rFonts w:ascii="Times New Roman" w:hAnsi="Times New Roman"/>
-                <w:color w:val="000000" w:themeColor="text1"/>
-                <w:sz w:val="14"/>
-                <w:szCs w:val="14"/>
+                <w:color w:val="000000" w:themeColor="text1"/>
+                <w:sz w:val="14"/>
+                <w:szCs w:val="14"/>
+                <w:rFonts w:ascii="Times New Roman" w:hAnsi="Times New Roman" w:cs="Times New Roman"/>
               </w:rPr>
               <w:t xml:space="preserve">Daily</w:t>
             </w:r>
@@ -1016,10 +1017,10 @@
             </w:pPr>
             <w:r>
               <w:rPr>
-                <w:rFonts w:ascii="Times New Roman" w:hAnsi="Times New Roman"/>
-                <w:color w:val="000000" w:themeColor="text1"/>
-                <w:sz w:val="14"/>
-                <w:szCs w:val="14"/>
+                <w:color w:val="000000" w:themeColor="text1"/>
+                <w:sz w:val="14"/>
+                <w:szCs w:val="14"/>
+                <w:rFonts w:ascii="Times New Roman" w:hAnsi="Times New Roman" w:cs="Times New Roman"/>
               </w:rPr>
               <w:t w:space="preserve" xml:space="preserve">24Aug26</w:t>
             </w:r>
@@ -1054,10 +1055,10 @@
             </w:pPr>
             <w:r>
               <w:rPr>
-                <w:rFonts w:ascii="Times New Roman" w:hAnsi="Times New Roman"/>
-                <w:color w:val="000000" w:themeColor="text1"/>
-                <w:sz w:val="14"/>
-                <w:szCs w:val="14"/>
+                <w:color w:val="000000" w:themeColor="text1"/>
+                <w:sz w:val="14"/>
+                <w:szCs w:val="14"/>
+                <w:rFonts w:ascii="Times New Roman" w:hAnsi="Times New Roman" w:cs="Times New Roman"/>
               </w:rPr>
               <w:t w:space="preserve" xml:space="preserve">Pending</w:t>
             </w:r>
@@ -1085,10 +1086,10 @@
             </w:pPr>
             <w:r>
               <w:rPr>
-                <w:rFonts w:ascii="Times New Roman" w:hAnsi="Times New Roman"/>
-                <w:color w:val="000000" w:themeColor="text1"/>
-                <w:sz w:val="14"/>
-                <w:szCs w:val="14"/>
+                <w:color w:val="000000" w:themeColor="text1"/>
+                <w:sz w:val="14"/>
+                <w:szCs w:val="14"/>
+                <w:rFonts w:ascii="Times New Roman" w:hAnsi="Times New Roman" w:cs="Times New Roman"/>
               </w:rPr>
               <w:t xml:space="preserve">Date Before Testing</w:t>
             </w:r>
@@ -1123,10 +1124,10 @@
             </w:pPr>
             <w:r>
               <w:rPr>
-                <w:rFonts w:ascii="Times New Roman" w:hAnsi="Times New Roman"/>
-                <w:color w:val="000000" w:themeColor="text1"/>
-                <w:sz w:val="14"/>
-                <w:szCs w:val="14"/>
+                <w:color w:val="000000" w:themeColor="text1"/>
+                <w:sz w:val="14"/>
+                <w:szCs w:val="14"/>
+                <w:rFonts w:ascii="Times New Roman" w:hAnsi="Times New Roman" w:cs="Times New Roman"/>
               </w:rPr>
               <w:t w:space="preserve" xml:space="preserve">No growth</w:t>
             </w:r>
@@ -1151,46 +1152,46 @@
           <w:p>
             <w:r>
               <w:rPr>
-                <w:rFonts w:ascii="Times New Roman" w:hAnsi="Times New Roman"/>
-                <w:color w:val="000000" w:themeColor="text1"/>
-                <w:sz w:val="14"/>
-                <w:szCs w:val="14"/>
+                <w:color w:val="000000" w:themeColor="text1"/>
+                <w:sz w:val="14"/>
+                <w:szCs w:val="14"/>
+                <w:rFonts w:ascii="Times New Roman" w:hAnsi="Times New Roman" w:cs="Times New Roman"/>
               </w:rPr>
               <w:t xml:space="preserve" w:space="preserve">N/A</w:t>
             </w:r>
             <w:r>
               <w:rPr>
-                <w:rFonts w:ascii="Times New Roman" w:hAnsi="Times New Roman"/>
-                <w:color w:val="000000" w:themeColor="text1"/>
-                <w:sz w:val="14"/>
-                <w:szCs w:val="14"/>
+                <w:color w:val="000000" w:themeColor="text1"/>
+                <w:sz w:val="14"/>
+                <w:szCs w:val="14"/>
+                <w:rFonts w:ascii="Times New Roman" w:hAnsi="Times New Roman" w:cs="Times New Roman"/>
               </w:rPr>
               <w:t/>
             </w:r>
             <w:r>
               <w:rPr>
-                <w:rFonts w:ascii="Times New Roman" w:hAnsi="Times New Roman"/>
-                <w:color w:val="000000" w:themeColor="text1"/>
-                <w:sz w:val="14"/>
-                <w:szCs w:val="14"/>
+                <w:color w:val="000000" w:themeColor="text1"/>
+                <w:sz w:val="14"/>
+                <w:szCs w:val="14"/>
+                <w:rFonts w:ascii="Times New Roman" w:hAnsi="Times New Roman" w:cs="Times New Roman"/>
               </w:rPr>
               <w:t/>
             </w:r>
             <w:r>
               <w:rPr>
-                <w:rFonts w:ascii="Times New Roman" w:hAnsi="Times New Roman"/>
-                <w:color w:val="000000" w:themeColor="text1"/>
-                <w:sz w:val="14"/>
-                <w:szCs w:val="14"/>
+                <w:color w:val="000000" w:themeColor="text1"/>
+                <w:sz w:val="14"/>
+                <w:szCs w:val="14"/>
+                <w:rFonts w:ascii="Times New Roman" w:hAnsi="Times New Roman" w:cs="Times New Roman"/>
               </w:rPr>
               <w:t/>
             </w:r>
             <w:r>
               <w:rPr>
-                <w:rFonts w:ascii="Times New Roman" w:hAnsi="Times New Roman"/>
-                <w:color w:val="000000" w:themeColor="text1"/>
-                <w:sz w:val="14"/>
-                <w:szCs w:val="14"/>
+                <w:color w:val="000000" w:themeColor="text1"/>
+                <w:sz w:val="14"/>
+                <w:szCs w:val="14"/>
+                <w:rFonts w:ascii="Times New Roman" w:hAnsi="Times New Roman" w:cs="Times New Roman"/>
               </w:rPr>
               <w:t xml:space="preserve"/>
             </w:r>
@@ -1215,46 +1216,46 @@
           <w:p>
             <w:r>
               <w:rPr>
-                <w:rFonts w:ascii="Times New Roman" w:hAnsi="Times New Roman"/>
-                <w:color w:val="000000" w:themeColor="text1"/>
-                <w:sz w:val="14"/>
-                <w:szCs w:val="14"/>
+                <w:color w:val="000000" w:themeColor="text1"/>
+                <w:sz w:val="14"/>
+                <w:szCs w:val="14"/>
+                <w:rFonts w:ascii="Times New Roman" w:hAnsi="Times New Roman" w:cs="Times New Roman"/>
               </w:rPr>
               <w:t xml:space="preserve" w:space="preserve">N/A</w:t>
             </w:r>
             <w:r>
               <w:rPr>
-                <w:rFonts w:ascii="Times New Roman" w:hAnsi="Times New Roman"/>
-                <w:color w:val="000000" w:themeColor="text1"/>
-                <w:sz w:val="14"/>
-                <w:szCs w:val="14"/>
+                <w:color w:val="000000" w:themeColor="text1"/>
+                <w:sz w:val="14"/>
+                <w:szCs w:val="14"/>
+                <w:rFonts w:ascii="Times New Roman" w:hAnsi="Times New Roman" w:cs="Times New Roman"/>
               </w:rPr>
               <w:t/>
             </w:r>
             <w:r>
               <w:rPr>
-                <w:rFonts w:ascii="Times New Roman" w:hAnsi="Times New Roman"/>
-                <w:color w:val="000000" w:themeColor="text1"/>
-                <w:sz w:val="14"/>
-                <w:szCs w:val="14"/>
+                <w:color w:val="000000" w:themeColor="text1"/>
+                <w:sz w:val="14"/>
+                <w:szCs w:val="14"/>
+                <w:rFonts w:ascii="Times New Roman" w:hAnsi="Times New Roman" w:cs="Times New Roman"/>
               </w:rPr>
               <w:t/>
             </w:r>
             <w:r>
               <w:rPr>
-                <w:rFonts w:ascii="Times New Roman" w:hAnsi="Times New Roman"/>
-                <w:color w:val="000000" w:themeColor="text1"/>
-                <w:sz w:val="14"/>
-                <w:szCs w:val="14"/>
+                <w:color w:val="000000" w:themeColor="text1"/>
+                <w:sz w:val="14"/>
+                <w:szCs w:val="14"/>
+                <w:rFonts w:ascii="Times New Roman" w:hAnsi="Times New Roman" w:cs="Times New Roman"/>
               </w:rPr>
               <w:t/>
             </w:r>
             <w:r>
               <w:rPr>
-                <w:rFonts w:ascii="Times New Roman" w:hAnsi="Times New Roman"/>
-                <w:color w:val="000000" w:themeColor="text1"/>
-                <w:sz w:val="14"/>
-                <w:szCs w:val="14"/>
+                <w:color w:val="000000" w:themeColor="text1"/>
+                <w:sz w:val="14"/>
+                <w:szCs w:val="14"/>
+                <w:rFonts w:ascii="Times New Roman" w:hAnsi="Times New Roman" w:cs="Times New Roman"/>
               </w:rPr>
               <w:t xml:space="preserve"/>
             </w:r>
@@ -1289,10 +1290,10 @@
             </w:pPr>
             <w:r>
               <w:rPr>
-                <w:rFonts w:ascii="Times New Roman" w:hAnsi="Times New Roman"/>
-                <w:color w:val="000000" w:themeColor="text1"/>
-                <w:sz w:val="14"/>
-                <w:szCs w:val="14"/>
+                <w:color w:val="000000" w:themeColor="text1"/>
+                <w:sz w:val="14"/>
+                <w:szCs w:val="14"/>
+                <w:rFonts w:ascii="Times New Roman" w:hAnsi="Times New Roman" w:cs="Times New Roman"/>
               </w:rPr>
               <w:t xml:space="preserve">None </w:t>
             </w:r>
@@ -1302,7 +1303,6 @@
       <w:tr>
         <w:trPr>
           <w:trHeight w:val="300"/>
-          <w:trHeight w:val="220" w:hRule="atLeast"/>
         </w:trPr>
         <w:tc>
           <w:tcPr>
@@ -1326,10 +1326,10 @@
             </w:pPr>
             <w:r>
               <w:rPr>
-                <w:rFonts w:ascii="Times New Roman" w:hAnsi="Times New Roman"/>
-                <w:color w:val="000000" w:themeColor="text1"/>
-                <w:sz w:val="14"/>
-                <w:szCs w:val="14"/>
+                <w:color w:val="000000" w:themeColor="text1"/>
+                <w:sz w:val="14"/>
+                <w:szCs w:val="14"/>
+                <w:rFonts w:ascii="Times New Roman" w:hAnsi="Times New Roman" w:cs="Times New Roman"/>
               </w:rPr>
               <w:t>Personnel (Left Touch and Right Touch)</w:t>
             </w:r>
@@ -1358,56 +1358,56 @@
             </w:pPr>
             <w:r>
               <w:rPr>
+                <w:color w:val="000000" w:themeColor="text1"/>
+                <w:sz w:val="14"/>
+                <w:szCs w:val="14"/>
+                <w:rFonts w:ascii="Times New Roman" w:hAnsi="Times New Roman" w:cs="Times New Roman"/>
+              </w:rPr>
+              <w:t xml:space="preserve">Daily</w:t>
+            </w:r>
+          </w:p>
+        </w:tc>
+        <w:tc>
+          <w:tcPr>
+            <w:tcW w:w="1206" w:type="dxa"/>
+            <w:tcBorders>
+              <w:top w:val="single" w:sz="8" w:space="0" w:color="auto"/>
+              <w:left w:val="nil"/>
+              <w:bottom w:val="single" w:sz="8" w:space="0" w:color="auto"/>
+              <w:right w:val="single" w:sz="8" w:space="0" w:color="auto"/>
+            </w:tcBorders>
+            <w:shd w:val="clear" w:color="auto" w:fill="FFFFFF" w:themeFill="background1"/>
+            <w:tcMar>
+              <w:left w:w="108" w:type="dxa"/>
+              <w:right w:w="108" w:type="dxa"/>
+            </w:tcMar>
+            <w:vAlign w:val="center"/>
+          </w:tcPr>
+          <w:p>
+            <w:pPr>
+              <w:jc w:val="center"/>
+              <w:rPr>
                 <w:rFonts w:ascii="Times New Roman" w:hAnsi="Times New Roman"/>
                 <w:color w:val="000000" w:themeColor="text1"/>
                 <w:sz w:val="14"/>
                 <w:szCs w:val="14"/>
               </w:rPr>
-              <w:t xml:space="preserve">Daily</w:t>
-            </w:r>
-          </w:p>
-        </w:tc>
-        <w:tc>
-          <w:tcPr>
-            <w:tcW w:w="1206" w:type="dxa"/>
-            <w:tcBorders>
-              <w:top w:val="single" w:sz="8" w:space="0" w:color="auto"/>
-              <w:left w:val="nil"/>
-              <w:bottom w:val="single" w:sz="8" w:space="0" w:color="auto"/>
-              <w:right w:val="single" w:sz="8" w:space="0" w:color="auto"/>
-            </w:tcBorders>
-            <w:shd w:val="clear" w:color="auto" w:fill="FFFFFF" w:themeFill="background1"/>
-            <w:tcMar>
-              <w:left w:w="108" w:type="dxa"/>
-              <w:right w:w="108" w:type="dxa"/>
-            </w:tcMar>
-            <w:vAlign w:val="center"/>
-          </w:tcPr>
-          <w:p>
-            <w:pPr>
-              <w:jc w:val="center"/>
-              <w:rPr>
-                <w:rFonts w:ascii="Times New Roman" w:hAnsi="Times New Roman"/>
-                <w:color w:val="000000" w:themeColor="text1"/>
-                <w:sz w:val="14"/>
-                <w:szCs w:val="14"/>
-              </w:rPr>
-            </w:pPr>
-            <w:r>
-              <w:rPr>
-                <w:rFonts w:ascii="Times New Roman" w:hAnsi="Times New Roman"/>
-                <w:color w:val="000000" w:themeColor="text1"/>
-                <w:sz w:val="14"/>
-                <w:szCs w:val="14"/>
+            </w:pPr>
+            <w:r>
+              <w:rPr>
+                <w:color w:val="000000" w:themeColor="text1"/>
+                <w:sz w:val="14"/>
+                <w:szCs w:val="14"/>
+                <w:rFonts w:ascii="Times New Roman" w:hAnsi="Times New Roman" w:cs="Times New Roman"/>
               </w:rPr>
               <w:t xml:space="preserve" w:space="preserve"> 25Aug26</w:t>
             </w:r>
             <w:r>
               <w:rPr>
-                <w:rFonts w:ascii="Times New Roman" w:hAnsi="Times New Roman"/>
-                <w:color w:val="000000" w:themeColor="text1"/>
-                <w:sz w:val="14"/>
-                <w:szCs w:val="14"/>
+                <w:color w:val="000000" w:themeColor="text1"/>
+                <w:sz w:val="14"/>
+                <w:szCs w:val="14"/>
+                <w:rFonts w:ascii="Times New Roman" w:hAnsi="Times New Roman" w:cs="Times New Roman"/>
               </w:rPr>
               <w:t/>
             </w:r>
@@ -1443,19 +1443,19 @@
             <w:bookmarkStart w:id="0" w:name="OLE_LINK3"/>
             <w:r>
               <w:rPr>
-                <w:rFonts w:ascii="Times New Roman" w:hAnsi="Times New Roman"/>
-                <w:color w:val="000000" w:themeColor="text1"/>
-                <w:sz w:val="14"/>
-                <w:szCs w:val="14"/>
+                <w:color w:val="000000" w:themeColor="text1"/>
+                <w:sz w:val="14"/>
+                <w:szCs w:val="14"/>
+                <w:rFonts w:ascii="Times New Roman" w:hAnsi="Times New Roman" w:cs="Times New Roman"/>
               </w:rPr>
               <w:t w:space="preserve" xml:space="preserve">Pending </w:t>
             </w:r>
             <w:r>
               <w:rPr>
-                <w:rFonts w:ascii="Times New Roman" w:hAnsi="Times New Roman"/>
-                <w:color w:val="000000" w:themeColor="text1"/>
-                <w:sz w:val="14"/>
-                <w:szCs w:val="14"/>
+                <w:color w:val="000000" w:themeColor="text1"/>
+                <w:sz w:val="14"/>
+                <w:szCs w:val="14"/>
+                <w:rFonts w:ascii="Times New Roman" w:hAnsi="Times New Roman" w:cs="Times New Roman"/>
               </w:rPr>
               <w:t xml:space="preserve"/>
             </w:r>
@@ -1484,10 +1484,10 @@
             </w:pPr>
             <w:r>
               <w:rPr>
-                <w:rFonts w:ascii="Times New Roman" w:hAnsi="Times New Roman"/>
-                <w:color w:val="000000" w:themeColor="text1"/>
-                <w:sz w:val="14"/>
-                <w:szCs w:val="14"/>
+                <w:color w:val="000000" w:themeColor="text1"/>
+                <w:sz w:val="14"/>
+                <w:szCs w:val="14"/>
+                <w:rFonts w:ascii="Times New Roman" w:hAnsi="Times New Roman" w:cs="Times New Roman"/>
               </w:rPr>
               <w:t xml:space="preserve">Date of Testing</w:t>
             </w:r>
@@ -1522,21 +1522,75 @@
             </w:pPr>
             <w:r>
               <w:rPr>
+                <w:color w:val="000000" w:themeColor="text1"/>
+                <w:sz w:val="14"/>
+                <w:szCs w:val="14"/>
+                <w:rFonts w:ascii="Times New Roman" w:hAnsi="Times New Roman" w:cs="Times New Roman"/>
+              </w:rPr>
+              <w:t w:space="preserve" xml:space="preserve">No growth</w:t>
+            </w:r>
+          </w:p>
+        </w:tc>
+        <w:tc>
+          <w:tcPr>
+            <w:tcW w:w="1444" w:type="dxa"/>
+            <w:tcBorders>
+              <w:top w:val="single" w:sz="8" w:space="0" w:color="auto"/>
+              <w:left w:val="nil"/>
+              <w:bottom w:val="single" w:sz="8" w:space="0" w:color="auto"/>
+              <w:right w:val="single" w:sz="8" w:space="0" w:color="auto"/>
+            </w:tcBorders>
+            <w:shd w:val="clear" w:color="auto" w:fill="FFFFFF" w:themeFill="background1"/>
+            <w:tcMar>
+              <w:left w:w="108" w:type="dxa"/>
+              <w:right w:w="108" w:type="dxa"/>
+            </w:tcMar>
+            <w:vAlign w:val="center"/>
+          </w:tcPr>
+          <w:p>
+            <w:pPr>
+              <w:rPr>
                 <w:rFonts w:ascii="Times New Roman" w:hAnsi="Times New Roman"/>
                 <w:color w:val="000000" w:themeColor="text1"/>
                 <w:sz w:val="14"/>
                 <w:szCs w:val="14"/>
               </w:rPr>
-              <w:t w:space="preserve" xml:space="preserve">No growth</w:t>
-            </w:r>
-          </w:p>
-        </w:tc>
-        <w:tc>
-          <w:tcPr>
-            <w:tcW w:w="1444" w:type="dxa"/>
-            <w:tcBorders>
-              <w:top w:val="single" w:sz="8" w:space="0" w:color="auto"/>
-              <w:left w:val="nil"/>
+            </w:pPr>
+            <w:r>
+              <w:rPr>
+                <w:color w:val="000000" w:themeColor="text1"/>
+                <w:sz w:val="14"/>
+                <w:szCs w:val="14"/>
+                <w:rFonts w:ascii="Times New Roman" w:hAnsi="Times New Roman" w:cs="Times New Roman"/>
+              </w:rPr>
+              <w:t w:space="preserve" xml:space="preserve">N/A</w:t>
+            </w:r>
+            <w:r>
+              <w:rPr>
+                <w:color w:val="000000" w:themeColor="text1"/>
+                <w:sz w:val="14"/>
+                <w:szCs w:val="14"/>
+                <w:rFonts w:ascii="Times New Roman" w:hAnsi="Times New Roman" w:cs="Times New Roman"/>
+              </w:rPr>
+              <w:t/>
+            </w:r>
+            <w:r>
+              <w:rPr>
+                <w:color w:val="000000" w:themeColor="text1"/>
+                <w:sz w:val="14"/>
+                <w:szCs w:val="14"/>
+                <w:rFonts w:ascii="Times New Roman" w:hAnsi="Times New Roman" w:cs="Times New Roman"/>
+              </w:rPr>
+              <w:t xml:space="preserve"/>
+            </w:r>
+          </w:p>
+        </w:tc>
+        <w:tc>
+          <w:tcPr>
+            <w:tcW w:w="1394" w:type="dxa"/>
+            <w:tcBorders>
+              <w:top w:val="single" w:sz="8" w:space="0" w:color="auto"/>
+              <w:left w:val="single" w:sz="8" w:space="0" w:color="auto"/>
               <w:bottom w:val="single" w:sz="8" w:space="0" w:color="auto"/>
               <w:right w:val="single" w:sz="8" w:space="0" w:color="auto"/>
             </w:tcBorders>
@@ -1558,82 +1612,28 @@
             </w:pPr>
             <w:r>
               <w:rPr>
-                <w:rFonts w:ascii="Times New Roman" w:hAnsi="Times New Roman"/>
-                <w:color w:val="000000" w:themeColor="text1"/>
-                <w:sz w:val="14"/>
-                <w:szCs w:val="14"/>
+                <w:color w:val="000000" w:themeColor="text1"/>
+                <w:sz w:val="14"/>
+                <w:szCs w:val="14"/>
+                <w:rFonts w:ascii="Times New Roman" w:hAnsi="Times New Roman" w:cs="Times New Roman"/>
               </w:rPr>
               <w:t w:space="preserve" xml:space="preserve">N/A</w:t>
             </w:r>
             <w:r>
               <w:rPr>
-                <w:rFonts w:ascii="Times New Roman" w:hAnsi="Times New Roman"/>
-                <w:color w:val="000000" w:themeColor="text1"/>
-                <w:sz w:val="14"/>
-                <w:szCs w:val="14"/>
+                <w:color w:val="000000" w:themeColor="text1"/>
+                <w:sz w:val="14"/>
+                <w:szCs w:val="14"/>
+                <w:rFonts w:ascii="Times New Roman" w:hAnsi="Times New Roman" w:cs="Times New Roman"/>
               </w:rPr>
               <w:t/>
             </w:r>
             <w:r>
               <w:rPr>
-                <w:rFonts w:ascii="Times New Roman" w:hAnsi="Times New Roman"/>
-                <w:color w:val="000000" w:themeColor="text1"/>
-                <w:sz w:val="14"/>
-                <w:szCs w:val="14"/>
-              </w:rPr>
-              <w:t xml:space="preserve"/>
-            </w:r>
-          </w:p>
-        </w:tc>
-        <w:tc>
-          <w:tcPr>
-            <w:tcW w:w="1394" w:type="dxa"/>
-            <w:tcBorders>
-              <w:top w:val="single" w:sz="8" w:space="0" w:color="auto"/>
-              <w:left w:val="single" w:sz="8" w:space="0" w:color="auto"/>
-              <w:bottom w:val="single" w:sz="8" w:space="0" w:color="auto"/>
-              <w:right w:val="single" w:sz="8" w:space="0" w:color="auto"/>
-            </w:tcBorders>
-            <w:shd w:val="clear" w:color="auto" w:fill="FFFFFF" w:themeFill="background1"/>
-            <w:tcMar>
-              <w:left w:w="108" w:type="dxa"/>
-              <w:right w:w="108" w:type="dxa"/>
-            </w:tcMar>
-            <w:vAlign w:val="center"/>
-          </w:tcPr>
-          <w:p>
-            <w:pPr>
-              <w:rPr>
-                <w:rFonts w:ascii="Times New Roman" w:hAnsi="Times New Roman"/>
-                <w:color w:val="000000" w:themeColor="text1"/>
-                <w:sz w:val="14"/>
-                <w:szCs w:val="14"/>
-              </w:rPr>
-            </w:pPr>
-            <w:r>
-              <w:rPr>
-                <w:rFonts w:ascii="Times New Roman" w:hAnsi="Times New Roman"/>
-                <w:color w:val="000000" w:themeColor="text1"/>
-                <w:sz w:val="14"/>
-                <w:szCs w:val="14"/>
-              </w:rPr>
-              <w:t w:space="preserve" xml:space="preserve">N/A</w:t>
-            </w:r>
-            <w:r>
-              <w:rPr>
-                <w:rFonts w:ascii="Times New Roman" w:hAnsi="Times New Roman"/>
-                <w:color w:val="000000" w:themeColor="text1"/>
-                <w:sz w:val="14"/>
-                <w:szCs w:val="14"/>
-              </w:rPr>
-              <w:t/>
-            </w:r>
-            <w:r>
-              <w:rPr>
-                <w:rFonts w:ascii="Times New Roman" w:hAnsi="Times New Roman"/>
-                <w:color w:val="000000" w:themeColor="text1"/>
-                <w:sz w:val="14"/>
-                <w:szCs w:val="14"/>
+                <w:color w:val="000000" w:themeColor="text1"/>
+                <w:sz w:val="14"/>
+                <w:szCs w:val="14"/>
+                <w:rFonts w:ascii="Times New Roman" w:hAnsi="Times New Roman" w:cs="Times New Roman"/>
               </w:rPr>
               <w:t xml:space="preserve"/>
             </w:r>
@@ -1668,10 +1668,10 @@
             </w:pPr>
             <w:r>
               <w:rPr>
-                <w:rFonts w:ascii="Times New Roman" w:hAnsi="Times New Roman"/>
-                <w:color w:val="000000" w:themeColor="text1"/>
-                <w:sz w:val="14"/>
-                <w:szCs w:val="14"/>
+                <w:color w:val="000000" w:themeColor="text1"/>
+                <w:sz w:val="14"/>
+                <w:szCs w:val="14"/>
+                <w:rFonts w:ascii="Times New Roman" w:hAnsi="Times New Roman" w:cs="Times New Roman"/>
               </w:rPr>
               <w:t xml:space="preserve"> None</w:t>
             </w:r>
@@ -1681,7 +1681,6 @@
       <w:tr>
         <w:trPr>
           <w:trHeight w:val="300"/>
-          <w:trHeight w:val="220" w:hRule="atLeast"/>
         </w:trPr>
         <w:tc>
           <w:tcPr>
@@ -1705,10 +1704,10 @@
             </w:pPr>
             <w:r>
               <w:rPr>
-                <w:rFonts w:ascii="Times New Roman" w:hAnsi="Times New Roman"/>
-                <w:color w:val="000000" w:themeColor="text1"/>
-                <w:sz w:val="14"/>
-                <w:szCs w:val="14"/>
+                <w:color w:val="000000" w:themeColor="text1"/>
+                <w:sz w:val="14"/>
+                <w:szCs w:val="14"/>
+                <w:rFonts w:ascii="Times New Roman" w:hAnsi="Times New Roman" w:cs="Times New Roman"/>
               </w:rPr>
               <w:t>Personnel (Left Touch and Right Touch)</w:t>
             </w:r>
@@ -1737,56 +1736,56 @@
             </w:pPr>
             <w:r>
               <w:rPr>
+                <w:color w:val="000000" w:themeColor="text1"/>
+                <w:sz w:val="14"/>
+                <w:szCs w:val="14"/>
+                <w:rFonts w:ascii="Times New Roman" w:hAnsi="Times New Roman" w:cs="Times New Roman"/>
+              </w:rPr>
+              <w:t xml:space="preserve">Daily</w:t>
+            </w:r>
+          </w:p>
+        </w:tc>
+        <w:tc>
+          <w:tcPr>
+            <w:tcW w:w="1206" w:type="dxa"/>
+            <w:tcBorders>
+              <w:top w:val="single" w:sz="8" w:space="0" w:color="auto"/>
+              <w:left w:val="nil"/>
+              <w:bottom w:val="single" w:sz="8" w:space="0" w:color="auto"/>
+              <w:right w:val="single" w:sz="8" w:space="0" w:color="auto"/>
+            </w:tcBorders>
+            <w:shd w:val="clear" w:color="auto" w:fill="FFFFFF" w:themeFill="background1"/>
+            <w:tcMar>
+              <w:left w:w="108" w:type="dxa"/>
+              <w:right w:w="108" w:type="dxa"/>
+            </w:tcMar>
+            <w:vAlign w:val="center"/>
+          </w:tcPr>
+          <w:p>
+            <w:pPr>
+              <w:jc w:val="center"/>
+              <w:rPr>
                 <w:rFonts w:ascii="Times New Roman" w:hAnsi="Times New Roman"/>
                 <w:color w:val="000000" w:themeColor="text1"/>
                 <w:sz w:val="14"/>
                 <w:szCs w:val="14"/>
               </w:rPr>
-              <w:t xml:space="preserve">Daily</w:t>
-            </w:r>
-          </w:p>
-        </w:tc>
-        <w:tc>
-          <w:tcPr>
-            <w:tcW w:w="1206" w:type="dxa"/>
-            <w:tcBorders>
-              <w:top w:val="single" w:sz="8" w:space="0" w:color="auto"/>
-              <w:left w:val="nil"/>
-              <w:bottom w:val="single" w:sz="8" w:space="0" w:color="auto"/>
-              <w:right w:val="single" w:sz="8" w:space="0" w:color="auto"/>
-            </w:tcBorders>
-            <w:shd w:val="clear" w:color="auto" w:fill="FFFFFF" w:themeFill="background1"/>
-            <w:tcMar>
-              <w:left w:w="108" w:type="dxa"/>
-              <w:right w:w="108" w:type="dxa"/>
-            </w:tcMar>
-            <w:vAlign w:val="center"/>
-          </w:tcPr>
-          <w:p>
-            <w:pPr>
-              <w:jc w:val="center"/>
-              <w:rPr>
-                <w:rFonts w:ascii="Times New Roman" w:hAnsi="Times New Roman"/>
-                <w:color w:val="000000" w:themeColor="text1"/>
-                <w:sz w:val="14"/>
-                <w:szCs w:val="14"/>
-              </w:rPr>
-            </w:pPr>
-            <w:r>
-              <w:rPr>
-                <w:rFonts w:ascii="Times New Roman" w:hAnsi="Times New Roman"/>
-                <w:color w:val="000000" w:themeColor="text1"/>
-                <w:sz w:val="14"/>
-                <w:szCs w:val="14"/>
+            </w:pPr>
+            <w:r>
+              <w:rPr>
+                <w:color w:val="000000" w:themeColor="text1"/>
+                <w:sz w:val="14"/>
+                <w:szCs w:val="14"/>
+                <w:rFonts w:ascii="Times New Roman" w:hAnsi="Times New Roman" w:cs="Times New Roman"/>
               </w:rPr>
               <w:t xml:space="preserve" w:space="preserve"> 26Aug26</w:t>
             </w:r>
             <w:r>
               <w:rPr>
-                <w:rFonts w:ascii="Times New Roman" w:hAnsi="Times New Roman"/>
-                <w:color w:val="000000" w:themeColor="text1"/>
-                <w:sz w:val="14"/>
-                <w:szCs w:val="14"/>
+                <w:color w:val="000000" w:themeColor="text1"/>
+                <w:sz w:val="14"/>
+                <w:szCs w:val="14"/>
+                <w:rFonts w:ascii="Times New Roman" w:hAnsi="Times New Roman" w:cs="Times New Roman"/>
               </w:rPr>
               <w:t/>
             </w:r>
@@ -1821,19 +1820,19 @@
             </w:pPr>
             <w:r>
               <w:rPr>
-                <w:rFonts w:ascii="Times New Roman" w:hAnsi="Times New Roman"/>
-                <w:color w:val="000000" w:themeColor="text1"/>
-                <w:sz w:val="14"/>
-                <w:szCs w:val="14"/>
+                <w:color w:val="000000" w:themeColor="text1"/>
+                <w:sz w:val="14"/>
+                <w:szCs w:val="14"/>
+                <w:rFonts w:ascii="Times New Roman" w:hAnsi="Times New Roman" w:cs="Times New Roman"/>
               </w:rPr>
               <w:t w:space="preserve" xml:space="preserve">Pending </w:t>
             </w:r>
             <w:r>
               <w:rPr>
-                <w:rFonts w:ascii="Times New Roman" w:hAnsi="Times New Roman"/>
-                <w:color w:val="000000" w:themeColor="text1"/>
-                <w:sz w:val="14"/>
-                <w:szCs w:val="14"/>
+                <w:color w:val="000000" w:themeColor="text1"/>
+                <w:sz w:val="14"/>
+                <w:szCs w:val="14"/>
+                <w:rFonts w:ascii="Times New Roman" w:hAnsi="Times New Roman" w:cs="Times New Roman"/>
               </w:rPr>
               <w:t xml:space="preserve"/>
             </w:r>
@@ -1861,10 +1860,10 @@
             </w:pPr>
             <w:r>
               <w:rPr>
-                <w:rFonts w:ascii="Times New Roman" w:hAnsi="Times New Roman"/>
-                <w:color w:val="000000" w:themeColor="text1"/>
-                <w:sz w:val="14"/>
-                <w:szCs w:val="14"/>
+                <w:color w:val="000000" w:themeColor="text1"/>
+                <w:sz w:val="14"/>
+                <w:szCs w:val="14"/>
+                <w:rFonts w:ascii="Times New Roman" w:hAnsi="Times New Roman" w:cs="Times New Roman"/>
               </w:rPr>
               <w:t xml:space="preserve">Date After Testing</w:t>
             </w:r>
@@ -1899,10 +1898,10 @@
             </w:pPr>
             <w:r>
               <w:rPr>
-                <w:rFonts w:ascii="Times New Roman" w:hAnsi="Times New Roman"/>
-                <w:color w:val="000000" w:themeColor="text1"/>
-                <w:sz w:val="14"/>
-                <w:szCs w:val="14"/>
+                <w:color w:val="000000" w:themeColor="text1"/>
+                <w:sz w:val="14"/>
+                <w:szCs w:val="14"/>
+                <w:rFonts w:ascii="Times New Roman" w:hAnsi="Times New Roman" w:cs="Times New Roman"/>
               </w:rPr>
               <w:t w:space="preserve" xml:space="preserve">No growth</w:t>
             </w:r>
@@ -1927,46 +1926,46 @@
           <w:p>
             <w:r>
               <w:rPr>
-                <w:rFonts w:ascii="Times New Roman" w:hAnsi="Times New Roman"/>
-                <w:color w:val="000000" w:themeColor="text1"/>
-                <w:sz w:val="14"/>
-                <w:szCs w:val="14"/>
+                <w:color w:val="000000" w:themeColor="text1"/>
+                <w:sz w:val="14"/>
+                <w:szCs w:val="14"/>
+                <w:rFonts w:ascii="Times New Roman" w:hAnsi="Times New Roman" w:cs="Times New Roman"/>
               </w:rPr>
               <w:t xml:space="preserve" w:space="preserve">N/A</w:t>
             </w:r>
             <w:r>
               <w:rPr>
-                <w:rFonts w:ascii="Times New Roman" w:hAnsi="Times New Roman"/>
-                <w:color w:val="000000" w:themeColor="text1"/>
-                <w:sz w:val="14"/>
-                <w:szCs w:val="14"/>
+                <w:color w:val="000000" w:themeColor="text1"/>
+                <w:sz w:val="14"/>
+                <w:szCs w:val="14"/>
+                <w:rFonts w:ascii="Times New Roman" w:hAnsi="Times New Roman" w:cs="Times New Roman"/>
               </w:rPr>
               <w:t/>
             </w:r>
             <w:r>
               <w:rPr>
-                <w:rFonts w:ascii="Times New Roman" w:hAnsi="Times New Roman"/>
-                <w:color w:val="000000" w:themeColor="text1"/>
-                <w:sz w:val="14"/>
-                <w:szCs w:val="14"/>
+                <w:color w:val="000000" w:themeColor="text1"/>
+                <w:sz w:val="14"/>
+                <w:szCs w:val="14"/>
+                <w:rFonts w:ascii="Times New Roman" w:hAnsi="Times New Roman" w:cs="Times New Roman"/>
               </w:rPr>
               <w:t/>
             </w:r>
             <w:r>
               <w:rPr>
-                <w:rFonts w:ascii="Times New Roman" w:hAnsi="Times New Roman"/>
-                <w:color w:val="000000" w:themeColor="text1"/>
-                <w:sz w:val="14"/>
-                <w:szCs w:val="14"/>
+                <w:color w:val="000000" w:themeColor="text1"/>
+                <w:sz w:val="14"/>
+                <w:szCs w:val="14"/>
+                <w:rFonts w:ascii="Times New Roman" w:hAnsi="Times New Roman" w:cs="Times New Roman"/>
               </w:rPr>
               <w:t/>
             </w:r>
             <w:r>
               <w:rPr>
-                <w:rFonts w:ascii="Times New Roman" w:hAnsi="Times New Roman"/>
-                <w:color w:val="000000" w:themeColor="text1"/>
-                <w:sz w:val="14"/>
-                <w:szCs w:val="14"/>
+                <w:color w:val="000000" w:themeColor="text1"/>
+                <w:sz w:val="14"/>
+                <w:szCs w:val="14"/>
+                <w:rFonts w:ascii="Times New Roman" w:hAnsi="Times New Roman" w:cs="Times New Roman"/>
               </w:rPr>
               <w:t xml:space="preserve"/>
             </w:r>
@@ -1991,46 +1990,46 @@
           <w:p>
             <w:r>
               <w:rPr>
-                <w:rFonts w:ascii="Times New Roman" w:hAnsi="Times New Roman"/>
-                <w:color w:val="000000" w:themeColor="text1"/>
-                <w:sz w:val="14"/>
-                <w:szCs w:val="14"/>
+                <w:color w:val="000000" w:themeColor="text1"/>
+                <w:sz w:val="14"/>
+                <w:szCs w:val="14"/>
+                <w:rFonts w:ascii="Times New Roman" w:hAnsi="Times New Roman" w:cs="Times New Roman"/>
               </w:rPr>
               <w:t xml:space="preserve" w:space="preserve">N/A</w:t>
             </w:r>
             <w:r>
               <w:rPr>
-                <w:rFonts w:ascii="Times New Roman" w:hAnsi="Times New Roman"/>
-                <w:color w:val="000000" w:themeColor="text1"/>
-                <w:sz w:val="14"/>
-                <w:szCs w:val="14"/>
+                <w:color w:val="000000" w:themeColor="text1"/>
+                <w:sz w:val="14"/>
+                <w:szCs w:val="14"/>
+                <w:rFonts w:ascii="Times New Roman" w:hAnsi="Times New Roman" w:cs="Times New Roman"/>
               </w:rPr>
               <w:t/>
             </w:r>
             <w:r>
               <w:rPr>
-                <w:rFonts w:ascii="Times New Roman" w:hAnsi="Times New Roman"/>
-                <w:color w:val="000000" w:themeColor="text1"/>
-                <w:sz w:val="14"/>
-                <w:szCs w:val="14"/>
+                <w:color w:val="000000" w:themeColor="text1"/>
+                <w:sz w:val="14"/>
+                <w:szCs w:val="14"/>
+                <w:rFonts w:ascii="Times New Roman" w:hAnsi="Times New Roman" w:cs="Times New Roman"/>
               </w:rPr>
               <w:t/>
             </w:r>
             <w:r>
               <w:rPr>
-                <w:rFonts w:ascii="Times New Roman" w:hAnsi="Times New Roman"/>
-                <w:color w:val="000000" w:themeColor="text1"/>
-                <w:sz w:val="14"/>
-                <w:szCs w:val="14"/>
+                <w:color w:val="000000" w:themeColor="text1"/>
+                <w:sz w:val="14"/>
+                <w:szCs w:val="14"/>
+                <w:rFonts w:ascii="Times New Roman" w:hAnsi="Times New Roman" w:cs="Times New Roman"/>
               </w:rPr>
               <w:t/>
             </w:r>
             <w:r>
               <w:rPr>
-                <w:rFonts w:ascii="Times New Roman" w:hAnsi="Times New Roman"/>
-                <w:color w:val="000000" w:themeColor="text1"/>
-                <w:sz w:val="14"/>
-                <w:szCs w:val="14"/>
+                <w:color w:val="000000" w:themeColor="text1"/>
+                <w:sz w:val="14"/>
+                <w:szCs w:val="14"/>
+                <w:rFonts w:ascii="Times New Roman" w:hAnsi="Times New Roman" w:cs="Times New Roman"/>
               </w:rPr>
               <w:t xml:space="preserve"/>
             </w:r>
@@ -2065,10 +2064,10 @@
             </w:pPr>
             <w:r>
               <w:rPr>
-                <w:rFonts w:ascii="Times New Roman" w:hAnsi="Times New Roman"/>
-                <w:color w:val="000000" w:themeColor="text1"/>
-                <w:sz w:val="14"/>
-                <w:szCs w:val="14"/>
+                <w:color w:val="000000" w:themeColor="text1"/>
+                <w:sz w:val="14"/>
+                <w:szCs w:val="14"/>
+                <w:rFonts w:ascii="Times New Roman" w:hAnsi="Times New Roman" w:cs="Times New Roman"/>
               </w:rPr>
               <w:t xml:space="preserve"> None</w:t>
             </w:r>
@@ -2078,7 +2077,6 @@
       <w:tr>
         <w:trPr>
           <w:trHeight w:val="300"/>
-          <w:trHeight w:val="220" w:hRule="atLeast"/>
         </w:trPr>
         <w:tc>
           <w:tcPr>
@@ -2099,7 +2097,15 @@
           </w:tcPr>
           <w:p>
             <w:r>
-              <w:t xml:space="preserve">Biological Safety Cabinet EM Bracketing Biological Safety Cabinet (BSC) E001316</w:t>
+              <w:rPr>
+                <w:b/>
+                <w:bCs/>
+                <w:color w:val="000000" w:themeColor="text1"/>
+                <w:sz w:val="14"/>
+                <w:szCs w:val="14"/>
+                <w:rFonts w:ascii="Times New Roman" w:hAnsi="Times New Roman" w:cs="Times New Roman"/>
+              </w:rPr>
+              <w:t>Biological Safety Cabinet EM Bracketing Biological Safety Cabinet (BSC)</w:t>
             </w:r>
           </w:p>
         </w:tc>
@@ -2107,7 +2113,6 @@
       <w:tr>
         <w:trPr>
           <w:trHeight w:val="300"/>
-          <w:trHeight w:val="220" w:hRule="atLeast"/>
         </w:trPr>
         <w:tc>
           <w:tcPr>
@@ -2131,10 +2136,10 @@
             </w:pPr>
             <w:r>
               <w:rPr>
-                <w:rFonts w:ascii="Times New Roman" w:hAnsi="Times New Roman"/>
-                <w:color w:val="000000" w:themeColor="text1"/>
-                <w:sz w:val="14"/>
-                <w:szCs w:val="14"/>
+                <w:color w:val="000000" w:themeColor="text1"/>
+                <w:sz w:val="14"/>
+                <w:szCs w:val="14"/>
+                <w:rFonts w:ascii="Times New Roman" w:hAnsi="Times New Roman" w:cs="Times New Roman"/>
               </w:rPr>
               <w:t>Surface Sampling of ISO 5 (4 locations)</w:t>
             </w:r>
@@ -2163,10 +2168,10 @@
             </w:pPr>
             <w:r>
               <w:rPr>
-                <w:rFonts w:ascii="Times New Roman" w:hAnsi="Times New Roman"/>
-                <w:color w:val="000000" w:themeColor="text1"/>
-                <w:sz w:val="14"/>
-                <w:szCs w:val="14"/>
+                <w:color w:val="000000" w:themeColor="text1"/>
+                <w:sz w:val="14"/>
+                <w:szCs w:val="14"/>
+                <w:rFonts w:ascii="Times New Roman" w:hAnsi="Times New Roman" w:cs="Times New Roman"/>
               </w:rPr>
               <w:t xml:space="preserve">Daily</w:t>
             </w:r>
@@ -2200,19 +2205,19 @@
             </w:pPr>
             <w:r>
               <w:rPr>
-                <w:rFonts w:ascii="Times New Roman" w:hAnsi="Times New Roman"/>
-                <w:color w:val="000000" w:themeColor="text1"/>
-                <w:sz w:val="14"/>
-                <w:szCs w:val="14"/>
+                <w:color w:val="000000" w:themeColor="text1"/>
+                <w:sz w:val="14"/>
+                <w:szCs w:val="14"/>
+                <w:rFonts w:ascii="Times New Roman" w:hAnsi="Times New Roman" w:cs="Times New Roman"/>
               </w:rPr>
               <w:t xml:space="preserve" w:space="preserve"> 24Aug26</w:t>
             </w:r>
             <w:r>
               <w:rPr>
-                <w:rFonts w:ascii="Times New Roman" w:hAnsi="Times New Roman"/>
-                <w:color w:val="000000" w:themeColor="text1"/>
-                <w:sz w:val="14"/>
-                <w:szCs w:val="14"/>
+                <w:color w:val="000000" w:themeColor="text1"/>
+                <w:sz w:val="14"/>
+                <w:szCs w:val="14"/>
+                <w:rFonts w:ascii="Times New Roman" w:hAnsi="Times New Roman" w:cs="Times New Roman"/>
               </w:rPr>
               <w:t/>
             </w:r>
@@ -2247,10 +2252,10 @@
             </w:pPr>
             <w:r>
               <w:rPr>
-                <w:rFonts w:ascii="Times New Roman" w:hAnsi="Times New Roman"/>
-                <w:color w:val="000000" w:themeColor="text1"/>
-                <w:sz w:val="14"/>
-                <w:szCs w:val="14"/>
+                <w:color w:val="000000" w:themeColor="text1"/>
+                <w:sz w:val="14"/>
+                <w:szCs w:val="14"/>
+                <w:rFonts w:ascii="Times New Roman" w:hAnsi="Times New Roman" w:cs="Times New Roman"/>
               </w:rPr>
               <w:t w:space="preserve" xml:space="preserve">Pending</w:t>
             </w:r>
@@ -2278,10 +2283,10 @@
             </w:pPr>
             <w:r>
               <w:rPr>
-                <w:rFonts w:ascii="Times New Roman" w:hAnsi="Times New Roman"/>
-                <w:color w:val="000000" w:themeColor="text1"/>
-                <w:sz w:val="14"/>
-                <w:szCs w:val="14"/>
+                <w:color w:val="000000" w:themeColor="text1"/>
+                <w:sz w:val="14"/>
+                <w:szCs w:val="14"/>
+                <w:rFonts w:ascii="Times New Roman" w:hAnsi="Times New Roman" w:cs="Times New Roman"/>
               </w:rPr>
               <w:t xml:space="preserve">Date Before Testing</w:t>
             </w:r>
@@ -2316,46 +2321,46 @@
             </w:pPr>
             <w:r>
               <w:rPr>
-                <w:rFonts w:ascii="Times New Roman" w:hAnsi="Times New Roman"/>
-                <w:color w:val="000000" w:themeColor="text1"/>
-                <w:sz w:val="14"/>
-                <w:szCs w:val="14"/>
+                <w:color w:val="000000" w:themeColor="text1"/>
+                <w:sz w:val="14"/>
+                <w:szCs w:val="14"/>
+                <w:rFonts w:ascii="Times New Roman" w:hAnsi="Times New Roman" w:cs="Times New Roman"/>
               </w:rPr>
               <w:t xml:space="preserve" w:space="preserve">No growth</w:t>
             </w:r>
             <w:r>
               <w:rPr>
-                <w:rFonts w:ascii="Times New Roman" w:hAnsi="Times New Roman"/>
-                <w:color w:val="000000" w:themeColor="text1"/>
-                <w:sz w:val="14"/>
-                <w:szCs w:val="14"/>
+                <w:color w:val="000000" w:themeColor="text1"/>
+                <w:sz w:val="14"/>
+                <w:szCs w:val="14"/>
+                <w:rFonts w:ascii="Times New Roman" w:hAnsi="Times New Roman" w:cs="Times New Roman"/>
               </w:rPr>
               <w:t/>
             </w:r>
             <w:r>
               <w:rPr>
-                <w:rFonts w:ascii="Times New Roman" w:hAnsi="Times New Roman"/>
-                <w:color w:val="000000" w:themeColor="text1"/>
-                <w:sz w:val="14"/>
-                <w:szCs w:val="14"/>
+                <w:color w:val="000000" w:themeColor="text1"/>
+                <w:sz w:val="14"/>
+                <w:szCs w:val="14"/>
+                <w:rFonts w:ascii="Times New Roman" w:hAnsi="Times New Roman" w:cs="Times New Roman"/>
               </w:rPr>
               <w:t/>
             </w:r>
             <w:r>
               <w:rPr>
-                <w:rFonts w:ascii="Times New Roman" w:hAnsi="Times New Roman"/>
-                <w:color w:val="000000" w:themeColor="text1"/>
-                <w:sz w:val="14"/>
-                <w:szCs w:val="14"/>
+                <w:color w:val="000000" w:themeColor="text1"/>
+                <w:sz w:val="14"/>
+                <w:szCs w:val="14"/>
+                <w:rFonts w:ascii="Times New Roman" w:hAnsi="Times New Roman" w:cs="Times New Roman"/>
               </w:rPr>
               <w:t/>
             </w:r>
             <w:r>
               <w:rPr>
-                <w:rFonts w:ascii="Times New Roman" w:hAnsi="Times New Roman"/>
-                <w:color w:val="000000" w:themeColor="text1"/>
-                <w:sz w:val="14"/>
-                <w:szCs w:val="14"/>
+                <w:color w:val="000000" w:themeColor="text1"/>
+                <w:sz w:val="14"/>
+                <w:szCs w:val="14"/>
+                <w:rFonts w:ascii="Times New Roman" w:hAnsi="Times New Roman" w:cs="Times New Roman"/>
               </w:rPr>
               <w:t xml:space="preserve"/>
             </w:r>
@@ -2380,46 +2385,46 @@
           <w:p>
             <w:r>
               <w:rPr>
-                <w:rFonts w:ascii="Times New Roman" w:hAnsi="Times New Roman"/>
-                <w:color w:val="000000" w:themeColor="text1"/>
-                <w:sz w:val="14"/>
-                <w:szCs w:val="14"/>
+                <w:color w:val="000000" w:themeColor="text1"/>
+                <w:sz w:val="14"/>
+                <w:szCs w:val="14"/>
+                <w:rFonts w:ascii="Times New Roman" w:hAnsi="Times New Roman" w:cs="Times New Roman"/>
               </w:rPr>
               <w:t xml:space="preserve" w:space="preserve">N/A</w:t>
             </w:r>
             <w:r>
               <w:rPr>
-                <w:rFonts w:ascii="Times New Roman" w:hAnsi="Times New Roman"/>
-                <w:color w:val="000000" w:themeColor="text1"/>
-                <w:sz w:val="14"/>
-                <w:szCs w:val="14"/>
+                <w:color w:val="000000" w:themeColor="text1"/>
+                <w:sz w:val="14"/>
+                <w:szCs w:val="14"/>
+                <w:rFonts w:ascii="Times New Roman" w:hAnsi="Times New Roman" w:cs="Times New Roman"/>
               </w:rPr>
               <w:t/>
             </w:r>
             <w:r>
               <w:rPr>
-                <w:rFonts w:ascii="Times New Roman" w:hAnsi="Times New Roman"/>
-                <w:color w:val="000000" w:themeColor="text1"/>
-                <w:sz w:val="14"/>
-                <w:szCs w:val="14"/>
+                <w:color w:val="000000" w:themeColor="text1"/>
+                <w:sz w:val="14"/>
+                <w:szCs w:val="14"/>
+                <w:rFonts w:ascii="Times New Roman" w:hAnsi="Times New Roman" w:cs="Times New Roman"/>
               </w:rPr>
               <w:t/>
             </w:r>
             <w:r>
               <w:rPr>
-                <w:rFonts w:ascii="Times New Roman" w:hAnsi="Times New Roman"/>
-                <w:color w:val="000000" w:themeColor="text1"/>
-                <w:sz w:val="14"/>
-                <w:szCs w:val="14"/>
+                <w:color w:val="000000" w:themeColor="text1"/>
+                <w:sz w:val="14"/>
+                <w:szCs w:val="14"/>
+                <w:rFonts w:ascii="Times New Roman" w:hAnsi="Times New Roman" w:cs="Times New Roman"/>
               </w:rPr>
               <w:t/>
             </w:r>
             <w:r>
               <w:rPr>
-                <w:rFonts w:ascii="Times New Roman" w:hAnsi="Times New Roman"/>
-                <w:color w:val="000000" w:themeColor="text1"/>
-                <w:sz w:val="14"/>
-                <w:szCs w:val="14"/>
+                <w:color w:val="000000" w:themeColor="text1"/>
+                <w:sz w:val="14"/>
+                <w:szCs w:val="14"/>
+                <w:rFonts w:ascii="Times New Roman" w:hAnsi="Times New Roman" w:cs="Times New Roman"/>
               </w:rPr>
               <w:t xml:space="preserve"/>
             </w:r>
@@ -2444,46 +2449,46 @@
           <w:p>
             <w:r>
               <w:rPr>
-                <w:rFonts w:ascii="Times New Roman" w:hAnsi="Times New Roman"/>
-                <w:color w:val="000000" w:themeColor="text1"/>
-                <w:sz w:val="14"/>
-                <w:szCs w:val="14"/>
+                <w:color w:val="000000" w:themeColor="text1"/>
+                <w:sz w:val="14"/>
+                <w:szCs w:val="14"/>
+                <w:rFonts w:ascii="Times New Roman" w:hAnsi="Times New Roman" w:cs="Times New Roman"/>
               </w:rPr>
               <w:t xml:space="preserve" w:space="preserve">N/A</w:t>
             </w:r>
             <w:r>
               <w:rPr>
-                <w:rFonts w:ascii="Times New Roman" w:hAnsi="Times New Roman"/>
-                <w:color w:val="000000" w:themeColor="text1"/>
-                <w:sz w:val="14"/>
-                <w:szCs w:val="14"/>
+                <w:color w:val="000000" w:themeColor="text1"/>
+                <w:sz w:val="14"/>
+                <w:szCs w:val="14"/>
+                <w:rFonts w:ascii="Times New Roman" w:hAnsi="Times New Roman" w:cs="Times New Roman"/>
               </w:rPr>
               <w:t/>
             </w:r>
             <w:r>
               <w:rPr>
-                <w:rFonts w:ascii="Times New Roman" w:hAnsi="Times New Roman"/>
-                <w:color w:val="000000" w:themeColor="text1"/>
-                <w:sz w:val="14"/>
-                <w:szCs w:val="14"/>
+                <w:color w:val="000000" w:themeColor="text1"/>
+                <w:sz w:val="14"/>
+                <w:szCs w:val="14"/>
+                <w:rFonts w:ascii="Times New Roman" w:hAnsi="Times New Roman" w:cs="Times New Roman"/>
               </w:rPr>
               <w:t/>
             </w:r>
             <w:r>
               <w:rPr>
-                <w:rFonts w:ascii="Times New Roman" w:hAnsi="Times New Roman"/>
-                <w:color w:val="000000" w:themeColor="text1"/>
-                <w:sz w:val="14"/>
-                <w:szCs w:val="14"/>
+                <w:color w:val="000000" w:themeColor="text1"/>
+                <w:sz w:val="14"/>
+                <w:szCs w:val="14"/>
+                <w:rFonts w:ascii="Times New Roman" w:hAnsi="Times New Roman" w:cs="Times New Roman"/>
               </w:rPr>
               <w:t/>
             </w:r>
             <w:r>
               <w:rPr>
-                <w:rFonts w:ascii="Times New Roman" w:hAnsi="Times New Roman"/>
-                <w:color w:val="000000" w:themeColor="text1"/>
-                <w:sz w:val="14"/>
-                <w:szCs w:val="14"/>
+                <w:color w:val="000000" w:themeColor="text1"/>
+                <w:sz w:val="14"/>
+                <w:szCs w:val="14"/>
+                <w:rFonts w:ascii="Times New Roman" w:hAnsi="Times New Roman" w:cs="Times New Roman"/>
               </w:rPr>
               <w:t xml:space="preserve"/>
             </w:r>
@@ -2518,10 +2523,10 @@
             </w:pPr>
             <w:r>
               <w:rPr>
-                <w:rFonts w:ascii="Times New Roman" w:hAnsi="Times New Roman"/>
-                <w:color w:val="000000" w:themeColor="text1"/>
-                <w:sz w:val="14"/>
-                <w:szCs w:val="14"/>
+                <w:color w:val="000000" w:themeColor="text1"/>
+                <w:sz w:val="14"/>
+                <w:szCs w:val="14"/>
+                <w:rFonts w:ascii="Times New Roman" w:hAnsi="Times New Roman" w:cs="Times New Roman"/>
               </w:rPr>
               <w:t xml:space="preserve">None </w:t>
             </w:r>
@@ -2531,7 +2536,6 @@
       <w:tr>
         <w:trPr>
           <w:trHeight w:val="300"/>
-          <w:trHeight w:val="220" w:hRule="atLeast"/>
         </w:trPr>
         <w:tc>
           <w:tcPr>
@@ -2555,10 +2559,10 @@
             </w:pPr>
             <w:r>
               <w:rPr>
-                <w:rFonts w:ascii="Times New Roman" w:hAnsi="Times New Roman"/>
-                <w:color w:val="000000" w:themeColor="text1"/>
-                <w:sz w:val="14"/>
-                <w:szCs w:val="14"/>
+                <w:color w:val="000000" w:themeColor="text1"/>
+                <w:sz w:val="14"/>
+                <w:szCs w:val="14"/>
+                <w:rFonts w:ascii="Times New Roman" w:hAnsi="Times New Roman" w:cs="Times New Roman"/>
               </w:rPr>
               <w:t>Surface Sampling of ISO 5</w:t>
             </w:r>
@@ -2569,10 +2573,10 @@
             </w:pPr>
             <w:r>
               <w:rPr>
-                <w:rFonts w:ascii="Times New Roman" w:hAnsi="Times New Roman"/>
-                <w:color w:val="000000" w:themeColor="text1"/>
-                <w:sz w:val="14"/>
-                <w:szCs w:val="14"/>
+                <w:color w:val="000000" w:themeColor="text1"/>
+                <w:sz w:val="14"/>
+                <w:szCs w:val="14"/>
+                <w:rFonts w:ascii="Times New Roman" w:hAnsi="Times New Roman" w:cs="Times New Roman"/>
               </w:rPr>
               <w:t>(4 locations)</w:t>
             </w:r>
@@ -2601,56 +2605,56 @@
             </w:pPr>
             <w:r>
               <w:rPr>
+                <w:color w:val="000000" w:themeColor="text1"/>
+                <w:sz w:val="14"/>
+                <w:szCs w:val="14"/>
+                <w:rFonts w:ascii="Times New Roman" w:hAnsi="Times New Roman" w:cs="Times New Roman"/>
+              </w:rPr>
+              <w:t xml:space="preserve">Daily</w:t>
+            </w:r>
+          </w:p>
+        </w:tc>
+        <w:tc>
+          <w:tcPr>
+            <w:tcW w:w="1206" w:type="dxa"/>
+            <w:tcBorders>
+              <w:top w:val="single" w:sz="8" w:space="0" w:color="auto"/>
+              <w:left w:val="nil"/>
+              <w:bottom w:val="single" w:sz="8" w:space="0" w:color="auto"/>
+              <w:right w:val="single" w:sz="8" w:space="0" w:color="auto"/>
+            </w:tcBorders>
+            <w:shd w:val="clear" w:color="auto" w:fill="FFFFFF" w:themeFill="background1"/>
+            <w:tcMar>
+              <w:left w:w="108" w:type="dxa"/>
+              <w:right w:w="108" w:type="dxa"/>
+            </w:tcMar>
+            <w:vAlign w:val="center"/>
+          </w:tcPr>
+          <w:p>
+            <w:pPr>
+              <w:jc w:val="center"/>
+              <w:rPr>
                 <w:rFonts w:ascii="Times New Roman" w:hAnsi="Times New Roman"/>
                 <w:color w:val="000000" w:themeColor="text1"/>
                 <w:sz w:val="14"/>
                 <w:szCs w:val="14"/>
               </w:rPr>
-              <w:t xml:space="preserve">Daily</w:t>
-            </w:r>
-          </w:p>
-        </w:tc>
-        <w:tc>
-          <w:tcPr>
-            <w:tcW w:w="1206" w:type="dxa"/>
-            <w:tcBorders>
-              <w:top w:val="single" w:sz="8" w:space="0" w:color="auto"/>
-              <w:left w:val="nil"/>
-              <w:bottom w:val="single" w:sz="8" w:space="0" w:color="auto"/>
-              <w:right w:val="single" w:sz="8" w:space="0" w:color="auto"/>
-            </w:tcBorders>
-            <w:shd w:val="clear" w:color="auto" w:fill="FFFFFF" w:themeFill="background1"/>
-            <w:tcMar>
-              <w:left w:w="108" w:type="dxa"/>
-              <w:right w:w="108" w:type="dxa"/>
-            </w:tcMar>
-            <w:vAlign w:val="center"/>
-          </w:tcPr>
-          <w:p>
-            <w:pPr>
-              <w:jc w:val="center"/>
-              <w:rPr>
-                <w:rFonts w:ascii="Times New Roman" w:hAnsi="Times New Roman"/>
-                <w:color w:val="000000" w:themeColor="text1"/>
-                <w:sz w:val="14"/>
-                <w:szCs w:val="14"/>
-              </w:rPr>
-            </w:pPr>
-            <w:r>
-              <w:rPr>
-                <w:rFonts w:ascii="Times New Roman" w:hAnsi="Times New Roman"/>
-                <w:color w:val="000000" w:themeColor="text1"/>
-                <w:sz w:val="14"/>
-                <w:szCs w:val="14"/>
+            </w:pPr>
+            <w:r>
+              <w:rPr>
+                <w:color w:val="000000" w:themeColor="text1"/>
+                <w:sz w:val="14"/>
+                <w:szCs w:val="14"/>
+                <w:rFonts w:ascii="Times New Roman" w:hAnsi="Times New Roman" w:cs="Times New Roman"/>
               </w:rPr>
               <w:t xml:space="preserve" w:space="preserve"> 25Aug26</w:t>
             </w:r>
             <w:r>
               <w:rPr>
-                <w:rFonts w:ascii="Times New Roman" w:hAnsi="Times New Roman"/>
-                <w:color w:val="000000" w:themeColor="text1"/>
-                <w:sz w:val="14"/>
-                <w:szCs w:val="14"/>
+                <w:color w:val="000000" w:themeColor="text1"/>
+                <w:sz w:val="14"/>
+                <w:szCs w:val="14"/>
+                <w:rFonts w:ascii="Times New Roman" w:hAnsi="Times New Roman" w:cs="Times New Roman"/>
               </w:rPr>
               <w:t/>
             </w:r>
@@ -2685,19 +2689,19 @@
             </w:pPr>
             <w:r>
               <w:rPr>
-                <w:rFonts w:ascii="Times New Roman" w:hAnsi="Times New Roman"/>
-                <w:color w:val="000000" w:themeColor="text1"/>
-                <w:sz w:val="14"/>
-                <w:szCs w:val="14"/>
+                <w:color w:val="000000" w:themeColor="text1"/>
+                <w:sz w:val="14"/>
+                <w:szCs w:val="14"/>
+                <w:rFonts w:ascii="Times New Roman" w:hAnsi="Times New Roman" w:cs="Times New Roman"/>
               </w:rPr>
               <w:t w:space="preserve" xml:space="preserve">Pending </w:t>
             </w:r>
             <w:r>
               <w:rPr>
-                <w:rFonts w:ascii="Times New Roman" w:hAnsi="Times New Roman"/>
-                <w:color w:val="000000" w:themeColor="text1"/>
-                <w:sz w:val="14"/>
-                <w:szCs w:val="14"/>
+                <w:color w:val="000000" w:themeColor="text1"/>
+                <w:sz w:val="14"/>
+                <w:szCs w:val="14"/>
+                <w:rFonts w:ascii="Times New Roman" w:hAnsi="Times New Roman" w:cs="Times New Roman"/>
               </w:rPr>
               <w:t xml:space="preserve"/>
             </w:r>
@@ -2725,10 +2729,10 @@
             </w:pPr>
             <w:r>
               <w:rPr>
-                <w:rFonts w:ascii="Times New Roman" w:hAnsi="Times New Roman"/>
-                <w:color w:val="000000" w:themeColor="text1"/>
-                <w:sz w:val="14"/>
-                <w:szCs w:val="14"/>
+                <w:color w:val="000000" w:themeColor="text1"/>
+                <w:sz w:val="14"/>
+                <w:szCs w:val="14"/>
+                <w:rFonts w:ascii="Times New Roman" w:hAnsi="Times New Roman" w:cs="Times New Roman"/>
               </w:rPr>
               <w:t xml:space="preserve">Date of Testing</w:t>
             </w:r>
@@ -2763,136 +2767,136 @@
             </w:pPr>
             <w:r>
               <w:rPr>
+                <w:color w:val="000000" w:themeColor="text1"/>
+                <w:sz w:val="14"/>
+                <w:szCs w:val="14"/>
+                <w:rFonts w:ascii="Times New Roman" w:hAnsi="Times New Roman" w:cs="Times New Roman"/>
+              </w:rPr>
+              <w:t w:space="preserve" xml:space="preserve">No growth</w:t>
+            </w:r>
+            <w:r>
+              <w:rPr>
+                <w:color w:val="000000" w:themeColor="text1"/>
+                <w:sz w:val="14"/>
+                <w:szCs w:val="14"/>
+                <w:rFonts w:ascii="Times New Roman" w:hAnsi="Times New Roman" w:cs="Times New Roman"/>
+              </w:rPr>
+              <w:t/>
+            </w:r>
+            <w:r>
+              <w:rPr>
+                <w:color w:val="000000" w:themeColor="text1"/>
+                <w:sz w:val="14"/>
+                <w:szCs w:val="14"/>
+                <w:rFonts w:ascii="Times New Roman" w:hAnsi="Times New Roman" w:cs="Times New Roman"/>
+              </w:rPr>
+              <w:t xml:space="preserve"/>
+            </w:r>
+          </w:p>
+        </w:tc>
+        <w:tc>
+          <w:tcPr>
+            <w:tcW w:w="1444" w:type="dxa"/>
+            <w:tcBorders>
+              <w:top w:val="single" w:sz="8" w:space="0" w:color="auto"/>
+              <w:left w:val="nil"/>
+              <w:bottom w:val="single" w:sz="8" w:space="0" w:color="auto"/>
+              <w:right w:val="single" w:sz="8" w:space="0" w:color="auto"/>
+            </w:tcBorders>
+            <w:shd w:val="clear" w:color="auto" w:fill="FFFFFF" w:themeFill="background1"/>
+            <w:tcMar>
+              <w:left w:w="108" w:type="dxa"/>
+              <w:right w:w="108" w:type="dxa"/>
+            </w:tcMar>
+            <w:vAlign w:val="center"/>
+          </w:tcPr>
+          <w:p>
+            <w:pPr>
+              <w:rPr>
                 <w:rFonts w:ascii="Times New Roman" w:hAnsi="Times New Roman"/>
                 <w:color w:val="000000" w:themeColor="text1"/>
                 <w:sz w:val="14"/>
                 <w:szCs w:val="14"/>
               </w:rPr>
-              <w:t w:space="preserve" xml:space="preserve">No growth</w:t>
-            </w:r>
-            <w:r>
+            </w:pPr>
+            <w:r>
+              <w:rPr>
+                <w:color w:val="000000" w:themeColor="text1"/>
+                <w:sz w:val="14"/>
+                <w:szCs w:val="14"/>
+                <w:rFonts w:ascii="Times New Roman" w:hAnsi="Times New Roman" w:cs="Times New Roman"/>
+              </w:rPr>
+              <w:t w:space="preserve" xml:space="preserve">N/A</w:t>
+            </w:r>
+            <w:r>
+              <w:rPr>
+                <w:color w:val="000000" w:themeColor="text1"/>
+                <w:sz w:val="14"/>
+                <w:szCs w:val="14"/>
+                <w:rFonts w:ascii="Times New Roman" w:hAnsi="Times New Roman" w:cs="Times New Roman"/>
+              </w:rPr>
+              <w:t/>
+            </w:r>
+            <w:r>
+              <w:rPr>
+                <w:color w:val="000000" w:themeColor="text1"/>
+                <w:sz w:val="14"/>
+                <w:szCs w:val="14"/>
+                <w:rFonts w:ascii="Times New Roman" w:hAnsi="Times New Roman" w:cs="Times New Roman"/>
+              </w:rPr>
+              <w:t xml:space="preserve"/>
+            </w:r>
+          </w:p>
+        </w:tc>
+        <w:tc>
+          <w:tcPr>
+            <w:tcW w:w="1394" w:type="dxa"/>
+            <w:tcBorders>
+              <w:top w:val="single" w:sz="8" w:space="0" w:color="auto"/>
+              <w:left w:val="single" w:sz="8" w:space="0" w:color="auto"/>
+              <w:bottom w:val="single" w:sz="8" w:space="0" w:color="auto"/>
+              <w:right w:val="single" w:sz="8" w:space="0" w:color="auto"/>
+            </w:tcBorders>
+            <w:shd w:val="clear" w:color="auto" w:fill="FFFFFF" w:themeFill="background1"/>
+            <w:tcMar>
+              <w:left w:w="108" w:type="dxa"/>
+              <w:right w:w="108" w:type="dxa"/>
+            </w:tcMar>
+            <w:vAlign w:val="center"/>
+          </w:tcPr>
+          <w:p>
+            <w:pPr>
               <w:rPr>
                 <w:rFonts w:ascii="Times New Roman" w:hAnsi="Times New Roman"/>
                 <w:color w:val="000000" w:themeColor="text1"/>
                 <w:sz w:val="14"/>
                 <w:szCs w:val="14"/>
               </w:rPr>
+            </w:pPr>
+            <w:r>
+              <w:rPr>
+                <w:color w:val="000000" w:themeColor="text1"/>
+                <w:sz w:val="14"/>
+                <w:szCs w:val="14"/>
+                <w:rFonts w:ascii="Times New Roman" w:hAnsi="Times New Roman" w:cs="Times New Roman"/>
+              </w:rPr>
+              <w:t w:space="preserve" xml:space="preserve">N/A</w:t>
+            </w:r>
+            <w:r>
+              <w:rPr>
+                <w:color w:val="000000" w:themeColor="text1"/>
+                <w:sz w:val="14"/>
+                <w:szCs w:val="14"/>
+                <w:rFonts w:ascii="Times New Roman" w:hAnsi="Times New Roman" w:cs="Times New Roman"/>
+              </w:rPr>
               <w:t/>
             </w:r>
             <w:r>
               <w:rPr>
-                <w:rFonts w:ascii="Times New Roman" w:hAnsi="Times New Roman"/>
-                <w:color w:val="000000" w:themeColor="text1"/>
-                <w:sz w:val="14"/>
-                <w:szCs w:val="14"/>
-              </w:rPr>
-              <w:t xml:space="preserve"/>
-            </w:r>
-          </w:p>
-        </w:tc>
-        <w:tc>
-          <w:tcPr>
-            <w:tcW w:w="1444" w:type="dxa"/>
-            <w:tcBorders>
-              <w:top w:val="single" w:sz="8" w:space="0" w:color="auto"/>
-              <w:left w:val="nil"/>
-              <w:bottom w:val="single" w:sz="8" w:space="0" w:color="auto"/>
-              <w:right w:val="single" w:sz="8" w:space="0" w:color="auto"/>
-            </w:tcBorders>
-            <w:shd w:val="clear" w:color="auto" w:fill="FFFFFF" w:themeFill="background1"/>
-            <w:tcMar>
-              <w:left w:w="108" w:type="dxa"/>
-              <w:right w:w="108" w:type="dxa"/>
-            </w:tcMar>
-            <w:vAlign w:val="center"/>
-          </w:tcPr>
-          <w:p>
-            <w:pPr>
-              <w:rPr>
-                <w:rFonts w:ascii="Times New Roman" w:hAnsi="Times New Roman"/>
-                <w:color w:val="000000" w:themeColor="text1"/>
-                <w:sz w:val="14"/>
-                <w:szCs w:val="14"/>
-              </w:rPr>
-            </w:pPr>
-            <w:r>
-              <w:rPr>
-                <w:rFonts w:ascii="Times New Roman" w:hAnsi="Times New Roman"/>
-                <w:color w:val="000000" w:themeColor="text1"/>
-                <w:sz w:val="14"/>
-                <w:szCs w:val="14"/>
-              </w:rPr>
-              <w:t w:space="preserve" xml:space="preserve">N/A</w:t>
-            </w:r>
-            <w:r>
-              <w:rPr>
-                <w:rFonts w:ascii="Times New Roman" w:hAnsi="Times New Roman"/>
-                <w:color w:val="000000" w:themeColor="text1"/>
-                <w:sz w:val="14"/>
-                <w:szCs w:val="14"/>
-              </w:rPr>
-              <w:t/>
-            </w:r>
-            <w:r>
-              <w:rPr>
-                <w:rFonts w:ascii="Times New Roman" w:hAnsi="Times New Roman"/>
-                <w:color w:val="000000" w:themeColor="text1"/>
-                <w:sz w:val="14"/>
-                <w:szCs w:val="14"/>
-              </w:rPr>
-              <w:t xml:space="preserve"/>
-            </w:r>
-          </w:p>
-        </w:tc>
-        <w:tc>
-          <w:tcPr>
-            <w:tcW w:w="1394" w:type="dxa"/>
-            <w:tcBorders>
-              <w:top w:val="single" w:sz="8" w:space="0" w:color="auto"/>
-              <w:left w:val="single" w:sz="8" w:space="0" w:color="auto"/>
-              <w:bottom w:val="single" w:sz="8" w:space="0" w:color="auto"/>
-              <w:right w:val="single" w:sz="8" w:space="0" w:color="auto"/>
-            </w:tcBorders>
-            <w:shd w:val="clear" w:color="auto" w:fill="FFFFFF" w:themeFill="background1"/>
-            <w:tcMar>
-              <w:left w:w="108" w:type="dxa"/>
-              <w:right w:w="108" w:type="dxa"/>
-            </w:tcMar>
-            <w:vAlign w:val="center"/>
-          </w:tcPr>
-          <w:p>
-            <w:pPr>
-              <w:rPr>
-                <w:rFonts w:ascii="Times New Roman" w:hAnsi="Times New Roman"/>
-                <w:color w:val="000000" w:themeColor="text1"/>
-                <w:sz w:val="14"/>
-                <w:szCs w:val="14"/>
-              </w:rPr>
-            </w:pPr>
-            <w:r>
-              <w:rPr>
-                <w:rFonts w:ascii="Times New Roman" w:hAnsi="Times New Roman"/>
-                <w:color w:val="000000" w:themeColor="text1"/>
-                <w:sz w:val="14"/>
-                <w:szCs w:val="14"/>
-              </w:rPr>
-              <w:t w:space="preserve" xml:space="preserve">N/A</w:t>
-            </w:r>
-            <w:r>
-              <w:rPr>
-                <w:rFonts w:ascii="Times New Roman" w:hAnsi="Times New Roman"/>
-                <w:color w:val="000000" w:themeColor="text1"/>
-                <w:sz w:val="14"/>
-                <w:szCs w:val="14"/>
-              </w:rPr>
-              <w:t/>
-            </w:r>
-            <w:r>
-              <w:rPr>
-                <w:rFonts w:ascii="Times New Roman" w:hAnsi="Times New Roman"/>
-                <w:color w:val="000000" w:themeColor="text1"/>
-                <w:sz w:val="14"/>
-                <w:szCs w:val="14"/>
+                <w:color w:val="000000" w:themeColor="text1"/>
+                <w:sz w:val="14"/>
+                <w:szCs w:val="14"/>
+                <w:rFonts w:ascii="Times New Roman" w:hAnsi="Times New Roman" w:cs="Times New Roman"/>
               </w:rPr>
               <w:t xml:space="preserve"/>
             </w:r>
@@ -2927,10 +2931,10 @@
             </w:pPr>
             <w:r>
               <w:rPr>
-                <w:rFonts w:ascii="Times New Roman" w:hAnsi="Times New Roman"/>
-                <w:color w:val="000000" w:themeColor="text1"/>
-                <w:sz w:val="14"/>
-                <w:szCs w:val="14"/>
+                <w:color w:val="000000" w:themeColor="text1"/>
+                <w:sz w:val="14"/>
+                <w:szCs w:val="14"/>
+                <w:rFonts w:ascii="Times New Roman" w:hAnsi="Times New Roman" w:cs="Times New Roman"/>
               </w:rPr>
               <w:t xml:space="preserve"> None</w:t>
             </w:r>
@@ -2940,7 +2944,6 @@
       <w:tr>
         <w:trPr>
           <w:trHeight w:val="300"/>
-          <w:trHeight w:val="220" w:hRule="atLeast"/>
         </w:trPr>
         <w:tc>
           <w:tcPr>
@@ -2964,10 +2967,10 @@
             </w:pPr>
             <w:r>
               <w:rPr>
-                <w:rFonts w:ascii="Times New Roman" w:hAnsi="Times New Roman"/>
-                <w:color w:val="000000" w:themeColor="text1"/>
-                <w:sz w:val="14"/>
-                <w:szCs w:val="14"/>
+                <w:color w:val="000000" w:themeColor="text1"/>
+                <w:sz w:val="14"/>
+                <w:szCs w:val="14"/>
+                <w:rFonts w:ascii="Times New Roman" w:hAnsi="Times New Roman" w:cs="Times New Roman"/>
               </w:rPr>
               <w:t>Surface Sampling of ISO 5 (4 locations)</w:t>
             </w:r>
@@ -2996,56 +2999,56 @@
             </w:pPr>
             <w:r>
               <w:rPr>
+                <w:color w:val="000000" w:themeColor="text1"/>
+                <w:sz w:val="14"/>
+                <w:szCs w:val="14"/>
+                <w:rFonts w:ascii="Times New Roman" w:hAnsi="Times New Roman" w:cs="Times New Roman"/>
+              </w:rPr>
+              <w:t xml:space="preserve">Daily</w:t>
+            </w:r>
+          </w:p>
+        </w:tc>
+        <w:tc>
+          <w:tcPr>
+            <w:tcW w:w="1206" w:type="dxa"/>
+            <w:tcBorders>
+              <w:top w:val="single" w:sz="8" w:space="0" w:color="auto"/>
+              <w:left w:val="nil"/>
+              <w:bottom w:val="single" w:sz="8" w:space="0" w:color="auto"/>
+              <w:right w:val="single" w:sz="8" w:space="0" w:color="auto"/>
+            </w:tcBorders>
+            <w:shd w:val="clear" w:color="auto" w:fill="FFFFFF" w:themeFill="background1"/>
+            <w:tcMar>
+              <w:left w:w="108" w:type="dxa"/>
+              <w:right w:w="108" w:type="dxa"/>
+            </w:tcMar>
+            <w:vAlign w:val="center"/>
+          </w:tcPr>
+          <w:p>
+            <w:pPr>
+              <w:jc w:val="center"/>
+              <w:rPr>
                 <w:rFonts w:ascii="Times New Roman" w:hAnsi="Times New Roman"/>
                 <w:color w:val="000000" w:themeColor="text1"/>
                 <w:sz w:val="14"/>
                 <w:szCs w:val="14"/>
               </w:rPr>
-              <w:t xml:space="preserve">Daily</w:t>
-            </w:r>
-          </w:p>
-        </w:tc>
-        <w:tc>
-          <w:tcPr>
-            <w:tcW w:w="1206" w:type="dxa"/>
-            <w:tcBorders>
-              <w:top w:val="single" w:sz="8" w:space="0" w:color="auto"/>
-              <w:left w:val="nil"/>
-              <w:bottom w:val="single" w:sz="8" w:space="0" w:color="auto"/>
-              <w:right w:val="single" w:sz="8" w:space="0" w:color="auto"/>
-            </w:tcBorders>
-            <w:shd w:val="clear" w:color="auto" w:fill="FFFFFF" w:themeFill="background1"/>
-            <w:tcMar>
-              <w:left w:w="108" w:type="dxa"/>
-              <w:right w:w="108" w:type="dxa"/>
-            </w:tcMar>
-            <w:vAlign w:val="center"/>
-          </w:tcPr>
-          <w:p>
-            <w:pPr>
-              <w:jc w:val="center"/>
-              <w:rPr>
-                <w:rFonts w:ascii="Times New Roman" w:hAnsi="Times New Roman"/>
-                <w:color w:val="000000" w:themeColor="text1"/>
-                <w:sz w:val="14"/>
-                <w:szCs w:val="14"/>
-              </w:rPr>
-            </w:pPr>
-            <w:r>
-              <w:rPr>
-                <w:rFonts w:ascii="Times New Roman" w:hAnsi="Times New Roman"/>
-                <w:color w:val="000000" w:themeColor="text1"/>
-                <w:sz w:val="14"/>
-                <w:szCs w:val="14"/>
+            </w:pPr>
+            <w:r>
+              <w:rPr>
+                <w:color w:val="000000" w:themeColor="text1"/>
+                <w:sz w:val="14"/>
+                <w:szCs w:val="14"/>
+                <w:rFonts w:ascii="Times New Roman" w:hAnsi="Times New Roman" w:cs="Times New Roman"/>
               </w:rPr>
               <w:t xml:space="preserve" w:space="preserve"> 26Aug26</w:t>
             </w:r>
             <w:r>
               <w:rPr>
-                <w:rFonts w:ascii="Times New Roman" w:hAnsi="Times New Roman"/>
-                <w:color w:val="000000" w:themeColor="text1"/>
-                <w:sz w:val="14"/>
-                <w:szCs w:val="14"/>
+                <w:color w:val="000000" w:themeColor="text1"/>
+                <w:sz w:val="14"/>
+                <w:szCs w:val="14"/>
+                <w:rFonts w:ascii="Times New Roman" w:hAnsi="Times New Roman" w:cs="Times New Roman"/>
               </w:rPr>
               <w:t/>
             </w:r>
@@ -3080,19 +3083,19 @@
             </w:pPr>
             <w:r>
               <w:rPr>
-                <w:rFonts w:ascii="Times New Roman" w:hAnsi="Times New Roman"/>
-                <w:color w:val="000000" w:themeColor="text1"/>
-                <w:sz w:val="14"/>
-                <w:szCs w:val="14"/>
+                <w:color w:val="000000" w:themeColor="text1"/>
+                <w:sz w:val="14"/>
+                <w:szCs w:val="14"/>
+                <w:rFonts w:ascii="Times New Roman" w:hAnsi="Times New Roman" w:cs="Times New Roman"/>
               </w:rPr>
               <w:t w:space="preserve" xml:space="preserve">Pending </w:t>
             </w:r>
             <w:r>
               <w:rPr>
-                <w:rFonts w:ascii="Times New Roman" w:hAnsi="Times New Roman"/>
-                <w:color w:val="000000" w:themeColor="text1"/>
-                <w:sz w:val="14"/>
-                <w:szCs w:val="14"/>
+                <w:color w:val="000000" w:themeColor="text1"/>
+                <w:sz w:val="14"/>
+                <w:szCs w:val="14"/>
+                <w:rFonts w:ascii="Times New Roman" w:hAnsi="Times New Roman" w:cs="Times New Roman"/>
               </w:rPr>
               <w:t xml:space="preserve"/>
             </w:r>
@@ -3120,10 +3123,10 @@
             </w:pPr>
             <w:r>
               <w:rPr>
-                <w:rFonts w:ascii="Times New Roman" w:hAnsi="Times New Roman"/>
-                <w:color w:val="000000" w:themeColor="text1"/>
-                <w:sz w:val="14"/>
-                <w:szCs w:val="14"/>
+                <w:color w:val="000000" w:themeColor="text1"/>
+                <w:sz w:val="14"/>
+                <w:szCs w:val="14"/>
+                <w:rFonts w:ascii="Times New Roman" w:hAnsi="Times New Roman" w:cs="Times New Roman"/>
               </w:rPr>
               <w:t xml:space="preserve">Date After Testing</w:t>
             </w:r>
@@ -3158,46 +3161,46 @@
             </w:pPr>
             <w:r>
               <w:rPr>
-                <w:rFonts w:ascii="Times New Roman" w:hAnsi="Times New Roman"/>
-                <w:color w:val="000000" w:themeColor="text1"/>
-                <w:sz w:val="14"/>
-                <w:szCs w:val="14"/>
+                <w:color w:val="000000" w:themeColor="text1"/>
+                <w:sz w:val="14"/>
+                <w:szCs w:val="14"/>
+                <w:rFonts w:ascii="Times New Roman" w:hAnsi="Times New Roman" w:cs="Times New Roman"/>
               </w:rPr>
               <w:t xml:space="preserve" w:space="preserve">No growth</w:t>
             </w:r>
             <w:r>
               <w:rPr>
-                <w:rFonts w:ascii="Times New Roman" w:hAnsi="Times New Roman"/>
-                <w:color w:val="000000" w:themeColor="text1"/>
-                <w:sz w:val="14"/>
-                <w:szCs w:val="14"/>
+                <w:color w:val="000000" w:themeColor="text1"/>
+                <w:sz w:val="14"/>
+                <w:szCs w:val="14"/>
+                <w:rFonts w:ascii="Times New Roman" w:hAnsi="Times New Roman" w:cs="Times New Roman"/>
               </w:rPr>
               <w:t/>
             </w:r>
             <w:r>
               <w:rPr>
-                <w:rFonts w:ascii="Times New Roman" w:hAnsi="Times New Roman"/>
-                <w:color w:val="000000" w:themeColor="text1"/>
-                <w:sz w:val="14"/>
-                <w:szCs w:val="14"/>
+                <w:color w:val="000000" w:themeColor="text1"/>
+                <w:sz w:val="14"/>
+                <w:szCs w:val="14"/>
+                <w:rFonts w:ascii="Times New Roman" w:hAnsi="Times New Roman" w:cs="Times New Roman"/>
               </w:rPr>
               <w:t/>
             </w:r>
             <w:r>
               <w:rPr>
-                <w:rFonts w:ascii="Times New Roman" w:hAnsi="Times New Roman"/>
-                <w:color w:val="000000" w:themeColor="text1"/>
-                <w:sz w:val="14"/>
-                <w:szCs w:val="14"/>
+                <w:color w:val="000000" w:themeColor="text1"/>
+                <w:sz w:val="14"/>
+                <w:szCs w:val="14"/>
+                <w:rFonts w:ascii="Times New Roman" w:hAnsi="Times New Roman" w:cs="Times New Roman"/>
               </w:rPr>
               <w:t/>
             </w:r>
             <w:r>
               <w:rPr>
-                <w:rFonts w:ascii="Times New Roman" w:hAnsi="Times New Roman"/>
-                <w:color w:val="000000" w:themeColor="text1"/>
-                <w:sz w:val="14"/>
-                <w:szCs w:val="14"/>
+                <w:color w:val="000000" w:themeColor="text1"/>
+                <w:sz w:val="14"/>
+                <w:szCs w:val="14"/>
+                <w:rFonts w:ascii="Times New Roman" w:hAnsi="Times New Roman" w:cs="Times New Roman"/>
               </w:rPr>
               <w:t xml:space="preserve"/>
             </w:r>
@@ -3222,46 +3225,46 @@
           <w:p>
             <w:r>
               <w:rPr>
-                <w:rFonts w:ascii="Times New Roman" w:hAnsi="Times New Roman"/>
-                <w:color w:val="000000" w:themeColor="text1"/>
-                <w:sz w:val="14"/>
-                <w:szCs w:val="14"/>
+                <w:color w:val="000000" w:themeColor="text1"/>
+                <w:sz w:val="14"/>
+                <w:szCs w:val="14"/>
+                <w:rFonts w:ascii="Times New Roman" w:hAnsi="Times New Roman" w:cs="Times New Roman"/>
               </w:rPr>
               <w:t xml:space="preserve" w:space="preserve">N/A</w:t>
             </w:r>
             <w:r>
               <w:rPr>
-                <w:rFonts w:ascii="Times New Roman" w:hAnsi="Times New Roman"/>
-                <w:color w:val="000000" w:themeColor="text1"/>
-                <w:sz w:val="14"/>
-                <w:szCs w:val="14"/>
+                <w:color w:val="000000" w:themeColor="text1"/>
+                <w:sz w:val="14"/>
+                <w:szCs w:val="14"/>
+                <w:rFonts w:ascii="Times New Roman" w:hAnsi="Times New Roman" w:cs="Times New Roman"/>
               </w:rPr>
               <w:t/>
             </w:r>
             <w:r>
               <w:rPr>
-                <w:rFonts w:ascii="Times New Roman" w:hAnsi="Times New Roman"/>
-                <w:color w:val="000000" w:themeColor="text1"/>
-                <w:sz w:val="14"/>
-                <w:szCs w:val="14"/>
+                <w:color w:val="000000" w:themeColor="text1"/>
+                <w:sz w:val="14"/>
+                <w:szCs w:val="14"/>
+                <w:rFonts w:ascii="Times New Roman" w:hAnsi="Times New Roman" w:cs="Times New Roman"/>
               </w:rPr>
               <w:t/>
             </w:r>
             <w:r>
               <w:rPr>
-                <w:rFonts w:ascii="Times New Roman" w:hAnsi="Times New Roman"/>
-                <w:color w:val="000000" w:themeColor="text1"/>
-                <w:sz w:val="14"/>
-                <w:szCs w:val="14"/>
+                <w:color w:val="000000" w:themeColor="text1"/>
+                <w:sz w:val="14"/>
+                <w:szCs w:val="14"/>
+                <w:rFonts w:ascii="Times New Roman" w:hAnsi="Times New Roman" w:cs="Times New Roman"/>
               </w:rPr>
               <w:t/>
             </w:r>
             <w:r>
               <w:rPr>
-                <w:rFonts w:ascii="Times New Roman" w:hAnsi="Times New Roman"/>
-                <w:color w:val="000000" w:themeColor="text1"/>
-                <w:sz w:val="14"/>
-                <w:szCs w:val="14"/>
+                <w:color w:val="000000" w:themeColor="text1"/>
+                <w:sz w:val="14"/>
+                <w:szCs w:val="14"/>
+                <w:rFonts w:ascii="Times New Roman" w:hAnsi="Times New Roman" w:cs="Times New Roman"/>
               </w:rPr>
               <w:t xml:space="preserve"/>
             </w:r>
@@ -3286,46 +3289,46 @@
           <w:p>
             <w:r>
               <w:rPr>
-                <w:rFonts w:ascii="Times New Roman" w:hAnsi="Times New Roman"/>
-                <w:color w:val="000000" w:themeColor="text1"/>
-                <w:sz w:val="14"/>
-                <w:szCs w:val="14"/>
+                <w:color w:val="000000" w:themeColor="text1"/>
+                <w:sz w:val="14"/>
+                <w:szCs w:val="14"/>
+                <w:rFonts w:ascii="Times New Roman" w:hAnsi="Times New Roman" w:cs="Times New Roman"/>
               </w:rPr>
               <w:t xml:space="preserve" w:space="preserve">N/A</w:t>
             </w:r>
             <w:r>
               <w:rPr>
-                <w:rFonts w:ascii="Times New Roman" w:hAnsi="Times New Roman"/>
-                <w:color w:val="000000" w:themeColor="text1"/>
-                <w:sz w:val="14"/>
-                <w:szCs w:val="14"/>
+                <w:color w:val="000000" w:themeColor="text1"/>
+                <w:sz w:val="14"/>
+                <w:szCs w:val="14"/>
+                <w:rFonts w:ascii="Times New Roman" w:hAnsi="Times New Roman" w:cs="Times New Roman"/>
               </w:rPr>
               <w:t/>
             </w:r>
             <w:r>
               <w:rPr>
-                <w:rFonts w:ascii="Times New Roman" w:hAnsi="Times New Roman"/>
-                <w:color w:val="000000" w:themeColor="text1"/>
-                <w:sz w:val="14"/>
-                <w:szCs w:val="14"/>
+                <w:color w:val="000000" w:themeColor="text1"/>
+                <w:sz w:val="14"/>
+                <w:szCs w:val="14"/>
+                <w:rFonts w:ascii="Times New Roman" w:hAnsi="Times New Roman" w:cs="Times New Roman"/>
               </w:rPr>
               <w:t/>
             </w:r>
             <w:r>
               <w:rPr>
-                <w:rFonts w:ascii="Times New Roman" w:hAnsi="Times New Roman"/>
-                <w:color w:val="000000" w:themeColor="text1"/>
-                <w:sz w:val="14"/>
-                <w:szCs w:val="14"/>
+                <w:color w:val="000000" w:themeColor="text1"/>
+                <w:sz w:val="14"/>
+                <w:szCs w:val="14"/>
+                <w:rFonts w:ascii="Times New Roman" w:hAnsi="Times New Roman" w:cs="Times New Roman"/>
               </w:rPr>
               <w:t/>
             </w:r>
             <w:r>
               <w:rPr>
-                <w:rFonts w:ascii="Times New Roman" w:hAnsi="Times New Roman"/>
-                <w:color w:val="000000" w:themeColor="text1"/>
-                <w:sz w:val="14"/>
-                <w:szCs w:val="14"/>
+                <w:color w:val="000000" w:themeColor="text1"/>
+                <w:sz w:val="14"/>
+                <w:szCs w:val="14"/>
+                <w:rFonts w:ascii="Times New Roman" w:hAnsi="Times New Roman" w:cs="Times New Roman"/>
               </w:rPr>
               <w:t xml:space="preserve"/>
             </w:r>
@@ -3360,10 +3363,10 @@
             </w:pPr>
             <w:r>
               <w:rPr>
-                <w:rFonts w:ascii="Times New Roman" w:hAnsi="Times New Roman"/>
-                <w:color w:val="000000" w:themeColor="text1"/>
-                <w:sz w:val="14"/>
-                <w:szCs w:val="14"/>
+                <w:color w:val="000000" w:themeColor="text1"/>
+                <w:sz w:val="14"/>
+                <w:szCs w:val="14"/>
+                <w:rFonts w:ascii="Times New Roman" w:hAnsi="Times New Roman" w:cs="Times New Roman"/>
               </w:rPr>
               <w:t xml:space="preserve"> None</w:t>
             </w:r>
@@ -3373,7 +3376,6 @@
       <w:tr>
         <w:trPr>
           <w:trHeight w:val="300"/>
-          <w:trHeight w:val="220" w:hRule="atLeast"/>
         </w:trPr>
         <w:tc>
           <w:tcPr>
@@ -3397,10 +3399,10 @@
             </w:pPr>
             <w:r>
               <w:rPr>
-                <w:rFonts w:ascii="Times New Roman" w:hAnsi="Times New Roman"/>
-                <w:color w:val="000000" w:themeColor="text1"/>
-                <w:sz w:val="14"/>
-                <w:szCs w:val="14"/>
+                <w:color w:val="000000" w:themeColor="text1"/>
+                <w:sz w:val="14"/>
+                <w:szCs w:val="14"/>
+                <w:rFonts w:ascii="Times New Roman" w:hAnsi="Times New Roman" w:cs="Times New Roman"/>
               </w:rPr>
               <w:t>Settling Sampling of ISO 5 (2 locations)</w:t>
             </w:r>
@@ -3429,47 +3431,47 @@
             </w:pPr>
             <w:r>
               <w:rPr>
+                <w:color w:val="000000" w:themeColor="text1"/>
+                <w:sz w:val="14"/>
+                <w:szCs w:val="14"/>
+                <w:rFonts w:ascii="Times New Roman" w:hAnsi="Times New Roman" w:cs="Times New Roman"/>
+              </w:rPr>
+              <w:t xml:space="preserve">Daily</w:t>
+            </w:r>
+          </w:p>
+        </w:tc>
+        <w:tc>
+          <w:tcPr>
+            <w:tcW w:w="1206" w:type="dxa"/>
+            <w:tcBorders>
+              <w:top w:val="single" w:sz="8" w:space="0" w:color="auto"/>
+              <w:left w:val="nil"/>
+              <w:bottom w:val="single" w:sz="8" w:space="0" w:color="auto"/>
+              <w:right w:val="single" w:sz="8" w:space="0" w:color="auto"/>
+            </w:tcBorders>
+            <w:shd w:val="clear" w:color="auto" w:fill="FFFFFF" w:themeFill="background1"/>
+            <w:tcMar>
+              <w:left w:w="108" w:type="dxa"/>
+              <w:right w:w="108" w:type="dxa"/>
+            </w:tcMar>
+            <w:vAlign w:val="center"/>
+          </w:tcPr>
+          <w:p>
+            <w:pPr>
+              <w:jc w:val="center"/>
+              <w:rPr>
                 <w:rFonts w:ascii="Times New Roman" w:hAnsi="Times New Roman"/>
                 <w:color w:val="000000" w:themeColor="text1"/>
                 <w:sz w:val="14"/>
                 <w:szCs w:val="14"/>
               </w:rPr>
-              <w:t xml:space="preserve">Daily</w:t>
-            </w:r>
-          </w:p>
-        </w:tc>
-        <w:tc>
-          <w:tcPr>
-            <w:tcW w:w="1206" w:type="dxa"/>
-            <w:tcBorders>
-              <w:top w:val="single" w:sz="8" w:space="0" w:color="auto"/>
-              <w:left w:val="nil"/>
-              <w:bottom w:val="single" w:sz="8" w:space="0" w:color="auto"/>
-              <w:right w:val="single" w:sz="8" w:space="0" w:color="auto"/>
-            </w:tcBorders>
-            <w:shd w:val="clear" w:color="auto" w:fill="FFFFFF" w:themeFill="background1"/>
-            <w:tcMar>
-              <w:left w:w="108" w:type="dxa"/>
-              <w:right w:w="108" w:type="dxa"/>
-            </w:tcMar>
-            <w:vAlign w:val="center"/>
-          </w:tcPr>
-          <w:p>
-            <w:pPr>
-              <w:jc w:val="center"/>
-              <w:rPr>
-                <w:rFonts w:ascii="Times New Roman" w:hAnsi="Times New Roman"/>
-                <w:color w:val="000000" w:themeColor="text1"/>
-                <w:sz w:val="14"/>
-                <w:szCs w:val="14"/>
-              </w:rPr>
-            </w:pPr>
-            <w:r>
-              <w:rPr>
-                <w:rFonts w:ascii="Times New Roman" w:hAnsi="Times New Roman"/>
-                <w:color w:val="000000" w:themeColor="text1"/>
-                <w:sz w:val="14"/>
-                <w:szCs w:val="14"/>
+            </w:pPr>
+            <w:r>
+              <w:rPr>
+                <w:color w:val="000000" w:themeColor="text1"/>
+                <w:sz w:val="14"/>
+                <w:szCs w:val="14"/>
+                <w:rFonts w:ascii="Times New Roman" w:hAnsi="Times New Roman" w:cs="Times New Roman"/>
               </w:rPr>
               <w:t w:space="preserve" xml:space="preserve">24Aug26</w:t>
             </w:r>
@@ -3504,10 +3506,10 @@
             </w:pPr>
             <w:r>
               <w:rPr>
-                <w:rFonts w:ascii="Times New Roman" w:hAnsi="Times New Roman"/>
-                <w:color w:val="000000" w:themeColor="text1"/>
-                <w:sz w:val="14"/>
-                <w:szCs w:val="14"/>
+                <w:color w:val="000000" w:themeColor="text1"/>
+                <w:sz w:val="14"/>
+                <w:szCs w:val="14"/>
+                <w:rFonts w:ascii="Times New Roman" w:hAnsi="Times New Roman" w:cs="Times New Roman"/>
               </w:rPr>
               <w:t w:space="preserve" xml:space="preserve">Pending</w:t>
             </w:r>
@@ -3535,10 +3537,10 @@
             </w:pPr>
             <w:r>
               <w:rPr>
-                <w:rFonts w:ascii="Times New Roman" w:hAnsi="Times New Roman"/>
-                <w:color w:val="000000" w:themeColor="text1"/>
-                <w:sz w:val="14"/>
-                <w:szCs w:val="14"/>
+                <w:color w:val="000000" w:themeColor="text1"/>
+                <w:sz w:val="14"/>
+                <w:szCs w:val="14"/>
+                <w:rFonts w:ascii="Times New Roman" w:hAnsi="Times New Roman" w:cs="Times New Roman"/>
               </w:rPr>
               <w:t xml:space="preserve">Date Before Testing</w:t>
             </w:r>
@@ -3573,47 +3575,47 @@
             </w:pPr>
             <w:r>
               <w:rPr>
-                <w:rFonts w:ascii="Times New Roman" w:hAnsi="Times New Roman"/>
-                <w:color w:val="000000" w:themeColor="text1"/>
-                <w:sz w:val="14"/>
-                <w:szCs w:val="14"/>
+                <w:color w:val="000000" w:themeColor="text1"/>
+                <w:sz w:val="14"/>
+                <w:szCs w:val="14"/>
+                <w:rFonts w:ascii="Times New Roman" w:hAnsi="Times New Roman" w:cs="Times New Roman"/>
               </w:rPr>
               <w:t xml:space="preserve" w:space="preserve">No growth</w:t>
             </w:r>
             <w:r>
               <w:rPr>
-                <w:rFonts w:ascii="Times New Roman" w:hAnsi="Times New Roman" w:hint="eastAsia"/>
                 <w:color w:val="000000" w:themeColor="text1"/>
                 <w:sz w:val="14"/>
                 <w:szCs w:val="14"/>
                 <w:lang w:eastAsia="zh-CN"/>
+                <w:rFonts w:ascii="Times New Roman" w:hAnsi="Times New Roman" w:cs="Times New Roman"/>
               </w:rPr>
               <w:t/>
             </w:r>
             <w:r>
               <w:rPr>
-                <w:rFonts w:ascii="Times New Roman" w:hAnsi="Times New Roman"/>
-                <w:color w:val="000000" w:themeColor="text1"/>
-                <w:sz w:val="14"/>
-                <w:szCs w:val="14"/>
+                <w:color w:val="000000" w:themeColor="text1"/>
+                <w:sz w:val="14"/>
+                <w:szCs w:val="14"/>
+                <w:rFonts w:ascii="Times New Roman" w:hAnsi="Times New Roman" w:cs="Times New Roman"/>
               </w:rPr>
               <w:t/>
             </w:r>
             <w:r>
               <w:rPr>
-                <w:rFonts w:ascii="Times New Roman" w:hAnsi="Times New Roman"/>
-                <w:color w:val="000000" w:themeColor="text1"/>
-                <w:sz w:val="14"/>
-                <w:szCs w:val="14"/>
+                <w:color w:val="000000" w:themeColor="text1"/>
+                <w:sz w:val="14"/>
+                <w:szCs w:val="14"/>
+                <w:rFonts w:ascii="Times New Roman" w:hAnsi="Times New Roman" w:cs="Times New Roman"/>
               </w:rPr>
               <w:t/>
             </w:r>
             <w:r>
               <w:rPr>
-                <w:rFonts w:ascii="Times New Roman" w:hAnsi="Times New Roman"/>
-                <w:color w:val="000000" w:themeColor="text1"/>
-                <w:sz w:val="14"/>
-                <w:szCs w:val="14"/>
+                <w:color w:val="000000" w:themeColor="text1"/>
+                <w:sz w:val="14"/>
+                <w:szCs w:val="14"/>
+                <w:rFonts w:ascii="Times New Roman" w:hAnsi="Times New Roman" w:cs="Times New Roman"/>
               </w:rPr>
               <w:t xml:space="preserve"/>
             </w:r>
@@ -3638,47 +3640,47 @@
           <w:p>
             <w:r>
               <w:rPr>
-                <w:rFonts w:ascii="Times New Roman" w:hAnsi="Times New Roman"/>
-                <w:color w:val="000000" w:themeColor="text1"/>
-                <w:sz w:val="14"/>
-                <w:szCs w:val="14"/>
+                <w:color w:val="000000" w:themeColor="text1"/>
+                <w:sz w:val="14"/>
+                <w:szCs w:val="14"/>
+                <w:rFonts w:ascii="Times New Roman" w:hAnsi="Times New Roman" w:cs="Times New Roman"/>
               </w:rPr>
               <w:t xml:space="preserve" w:space="preserve">N/A</w:t>
             </w:r>
             <w:r>
               <w:rPr>
-                <w:rFonts w:ascii="Times New Roman" w:hAnsi="Times New Roman" w:hint="eastAsia"/>
                 <w:color w:val="000000" w:themeColor="text1"/>
                 <w:sz w:val="14"/>
                 <w:szCs w:val="14"/>
                 <w:lang w:eastAsia="zh-CN"/>
+                <w:rFonts w:ascii="Times New Roman" w:hAnsi="Times New Roman" w:cs="Times New Roman"/>
               </w:rPr>
               <w:t/>
             </w:r>
             <w:r>
               <w:rPr>
-                <w:rFonts w:ascii="Times New Roman" w:hAnsi="Times New Roman"/>
-                <w:color w:val="000000" w:themeColor="text1"/>
-                <w:sz w:val="14"/>
-                <w:szCs w:val="14"/>
+                <w:color w:val="000000" w:themeColor="text1"/>
+                <w:sz w:val="14"/>
+                <w:szCs w:val="14"/>
+                <w:rFonts w:ascii="Times New Roman" w:hAnsi="Times New Roman" w:cs="Times New Roman"/>
               </w:rPr>
               <w:t/>
             </w:r>
             <w:r>
               <w:rPr>
-                <w:rFonts w:ascii="Times New Roman" w:hAnsi="Times New Roman"/>
-                <w:color w:val="000000" w:themeColor="text1"/>
-                <w:sz w:val="14"/>
-                <w:szCs w:val="14"/>
+                <w:color w:val="000000" w:themeColor="text1"/>
+                <w:sz w:val="14"/>
+                <w:szCs w:val="14"/>
+                <w:rFonts w:ascii="Times New Roman" w:hAnsi="Times New Roman" w:cs="Times New Roman"/>
               </w:rPr>
               <w:t/>
             </w:r>
             <w:r>
               <w:rPr>
-                <w:rFonts w:ascii="Times New Roman" w:hAnsi="Times New Roman"/>
-                <w:color w:val="000000" w:themeColor="text1"/>
-                <w:sz w:val="14"/>
-                <w:szCs w:val="14"/>
+                <w:color w:val="000000" w:themeColor="text1"/>
+                <w:sz w:val="14"/>
+                <w:szCs w:val="14"/>
+                <w:rFonts w:ascii="Times New Roman" w:hAnsi="Times New Roman" w:cs="Times New Roman"/>
               </w:rPr>
               <w:t xml:space="preserve"/>
             </w:r>
@@ -3703,47 +3705,47 @@
           <w:p>
             <w:r>
               <w:rPr>
-                <w:rFonts w:ascii="Times New Roman" w:hAnsi="Times New Roman"/>
-                <w:color w:val="000000" w:themeColor="text1"/>
-                <w:sz w:val="14"/>
-                <w:szCs w:val="14"/>
+                <w:color w:val="000000" w:themeColor="text1"/>
+                <w:sz w:val="14"/>
+                <w:szCs w:val="14"/>
+                <w:rFonts w:ascii="Times New Roman" w:hAnsi="Times New Roman" w:cs="Times New Roman"/>
               </w:rPr>
               <w:t xml:space="preserve" w:space="preserve">N/A</w:t>
             </w:r>
             <w:r>
               <w:rPr>
-                <w:rFonts w:ascii="Times New Roman" w:hAnsi="Times New Roman" w:hint="eastAsia"/>
                 <w:color w:val="000000" w:themeColor="text1"/>
                 <w:sz w:val="14"/>
                 <w:szCs w:val="14"/>
                 <w:lang w:eastAsia="zh-CN"/>
+                <w:rFonts w:ascii="Times New Roman" w:hAnsi="Times New Roman" w:cs="Times New Roman"/>
               </w:rPr>
               <w:t/>
             </w:r>
             <w:r>
               <w:rPr>
-                <w:rFonts w:ascii="Times New Roman" w:hAnsi="Times New Roman"/>
-                <w:color w:val="000000" w:themeColor="text1"/>
-                <w:sz w:val="14"/>
-                <w:szCs w:val="14"/>
+                <w:color w:val="000000" w:themeColor="text1"/>
+                <w:sz w:val="14"/>
+                <w:szCs w:val="14"/>
+                <w:rFonts w:ascii="Times New Roman" w:hAnsi="Times New Roman" w:cs="Times New Roman"/>
               </w:rPr>
               <w:t/>
             </w:r>
             <w:r>
               <w:rPr>
-                <w:rFonts w:ascii="Times New Roman" w:hAnsi="Times New Roman"/>
-                <w:color w:val="000000" w:themeColor="text1"/>
-                <w:sz w:val="14"/>
-                <w:szCs w:val="14"/>
+                <w:color w:val="000000" w:themeColor="text1"/>
+                <w:sz w:val="14"/>
+                <w:szCs w:val="14"/>
+                <w:rFonts w:ascii="Times New Roman" w:hAnsi="Times New Roman" w:cs="Times New Roman"/>
               </w:rPr>
               <w:t/>
             </w:r>
             <w:r>
               <w:rPr>
-                <w:rFonts w:ascii="Times New Roman" w:hAnsi="Times New Roman"/>
-                <w:color w:val="000000" w:themeColor="text1"/>
-                <w:sz w:val="14"/>
-                <w:szCs w:val="14"/>
+                <w:color w:val="000000" w:themeColor="text1"/>
+                <w:sz w:val="14"/>
+                <w:szCs w:val="14"/>
+                <w:rFonts w:ascii="Times New Roman" w:hAnsi="Times New Roman" w:cs="Times New Roman"/>
               </w:rPr>
               <w:t xml:space="preserve"/>
             </w:r>
@@ -3778,10 +3780,10 @@
             </w:pPr>
             <w:r>
               <w:rPr>
-                <w:rFonts w:ascii="Times New Roman" w:hAnsi="Times New Roman"/>
-                <w:color w:val="000000" w:themeColor="text1"/>
-                <w:sz w:val="14"/>
-                <w:szCs w:val="14"/>
+                <w:color w:val="000000" w:themeColor="text1"/>
+                <w:sz w:val="14"/>
+                <w:szCs w:val="14"/>
+                <w:rFonts w:ascii="Times New Roman" w:hAnsi="Times New Roman" w:cs="Times New Roman"/>
               </w:rPr>
               <w:t xml:space="preserve">None </w:t>
             </w:r>
@@ -3791,7 +3793,6 @@
       <w:tr>
         <w:trPr>
           <w:trHeight w:val="300"/>
-          <w:trHeight w:val="220" w:hRule="atLeast"/>
         </w:trPr>
         <w:tc>
           <w:tcPr>
@@ -3815,10 +3816,10 @@
             </w:pPr>
             <w:r>
               <w:rPr>
-                <w:rFonts w:ascii="Times New Roman" w:hAnsi="Times New Roman"/>
-                <w:color w:val="000000" w:themeColor="text1"/>
-                <w:sz w:val="14"/>
-                <w:szCs w:val="14"/>
+                <w:color w:val="000000" w:themeColor="text1"/>
+                <w:sz w:val="14"/>
+                <w:szCs w:val="14"/>
+                <w:rFonts w:ascii="Times New Roman" w:hAnsi="Times New Roman" w:cs="Times New Roman"/>
               </w:rPr>
               <w:t>Settling Sampling of ISO 5 (2 locations)</w:t>
             </w:r>
@@ -3847,56 +3848,56 @@
             </w:pPr>
             <w:r>
               <w:rPr>
+                <w:color w:val="000000" w:themeColor="text1"/>
+                <w:sz w:val="14"/>
+                <w:szCs w:val="14"/>
+                <w:rFonts w:ascii="Times New Roman" w:hAnsi="Times New Roman" w:cs="Times New Roman"/>
+              </w:rPr>
+              <w:t xml:space="preserve">Daily</w:t>
+            </w:r>
+          </w:p>
+        </w:tc>
+        <w:tc>
+          <w:tcPr>
+            <w:tcW w:w="1206" w:type="dxa"/>
+            <w:tcBorders>
+              <w:top w:val="single" w:sz="8" w:space="0" w:color="auto"/>
+              <w:left w:val="nil"/>
+              <w:bottom w:val="single" w:sz="8" w:space="0" w:color="auto"/>
+              <w:right w:val="single" w:sz="8" w:space="0" w:color="auto"/>
+            </w:tcBorders>
+            <w:shd w:val="clear" w:color="auto" w:fill="FFFFFF" w:themeFill="background1"/>
+            <w:tcMar>
+              <w:left w:w="108" w:type="dxa"/>
+              <w:right w:w="108" w:type="dxa"/>
+            </w:tcMar>
+            <w:vAlign w:val="center"/>
+          </w:tcPr>
+          <w:p>
+            <w:pPr>
+              <w:jc w:val="center"/>
+              <w:rPr>
                 <w:rFonts w:ascii="Times New Roman" w:hAnsi="Times New Roman"/>
                 <w:color w:val="000000" w:themeColor="text1"/>
                 <w:sz w:val="14"/>
                 <w:szCs w:val="14"/>
               </w:rPr>
-              <w:t xml:space="preserve">Daily</w:t>
-            </w:r>
-          </w:p>
-        </w:tc>
-        <w:tc>
-          <w:tcPr>
-            <w:tcW w:w="1206" w:type="dxa"/>
-            <w:tcBorders>
-              <w:top w:val="single" w:sz="8" w:space="0" w:color="auto"/>
-              <w:left w:val="nil"/>
-              <w:bottom w:val="single" w:sz="8" w:space="0" w:color="auto"/>
-              <w:right w:val="single" w:sz="8" w:space="0" w:color="auto"/>
-            </w:tcBorders>
-            <w:shd w:val="clear" w:color="auto" w:fill="FFFFFF" w:themeFill="background1"/>
-            <w:tcMar>
-              <w:left w:w="108" w:type="dxa"/>
-              <w:right w:w="108" w:type="dxa"/>
-            </w:tcMar>
-            <w:vAlign w:val="center"/>
-          </w:tcPr>
-          <w:p>
-            <w:pPr>
-              <w:jc w:val="center"/>
-              <w:rPr>
-                <w:rFonts w:ascii="Times New Roman" w:hAnsi="Times New Roman"/>
-                <w:color w:val="000000" w:themeColor="text1"/>
-                <w:sz w:val="14"/>
-                <w:szCs w:val="14"/>
-              </w:rPr>
-            </w:pPr>
-            <w:r>
-              <w:rPr>
-                <w:rFonts w:ascii="Times New Roman" w:hAnsi="Times New Roman"/>
-                <w:color w:val="000000" w:themeColor="text1"/>
-                <w:sz w:val="14"/>
-                <w:szCs w:val="14"/>
+            </w:pPr>
+            <w:r>
+              <w:rPr>
+                <w:color w:val="000000" w:themeColor="text1"/>
+                <w:sz w:val="14"/>
+                <w:szCs w:val="14"/>
+                <w:rFonts w:ascii="Times New Roman" w:hAnsi="Times New Roman" w:cs="Times New Roman"/>
               </w:rPr>
               <w:t xml:space="preserve" w:space="preserve"> 25Aug26</w:t>
             </w:r>
             <w:r>
               <w:rPr>
-                <w:rFonts w:ascii="Times New Roman" w:hAnsi="Times New Roman"/>
-                <w:color w:val="000000" w:themeColor="text1"/>
-                <w:sz w:val="14"/>
-                <w:szCs w:val="14"/>
+                <w:color w:val="000000" w:themeColor="text1"/>
+                <w:sz w:val="14"/>
+                <w:szCs w:val="14"/>
+                <w:rFonts w:ascii="Times New Roman" w:hAnsi="Times New Roman" w:cs="Times New Roman"/>
               </w:rPr>
               <w:t/>
             </w:r>
@@ -3931,19 +3932,19 @@
             </w:pPr>
             <w:r>
               <w:rPr>
-                <w:rFonts w:ascii="Times New Roman" w:hAnsi="Times New Roman"/>
-                <w:color w:val="000000" w:themeColor="text1"/>
-                <w:sz w:val="14"/>
-                <w:szCs w:val="14"/>
+                <w:color w:val="000000" w:themeColor="text1"/>
+                <w:sz w:val="14"/>
+                <w:szCs w:val="14"/>
+                <w:rFonts w:ascii="Times New Roman" w:hAnsi="Times New Roman" w:cs="Times New Roman"/>
               </w:rPr>
               <w:t w:space="preserve" xml:space="preserve">Pending </w:t>
             </w:r>
             <w:r>
               <w:rPr>
-                <w:rFonts w:ascii="Times New Roman" w:hAnsi="Times New Roman"/>
-                <w:color w:val="000000" w:themeColor="text1"/>
-                <w:sz w:val="14"/>
-                <w:szCs w:val="14"/>
+                <w:color w:val="000000" w:themeColor="text1"/>
+                <w:sz w:val="14"/>
+                <w:szCs w:val="14"/>
+                <w:rFonts w:ascii="Times New Roman" w:hAnsi="Times New Roman" w:cs="Times New Roman"/>
               </w:rPr>
               <w:t xml:space="preserve"/>
             </w:r>
@@ -3971,10 +3972,10 @@
             </w:pPr>
             <w:r>
               <w:rPr>
-                <w:rFonts w:ascii="Times New Roman" w:hAnsi="Times New Roman"/>
-                <w:color w:val="000000" w:themeColor="text1"/>
-                <w:sz w:val="14"/>
-                <w:szCs w:val="14"/>
+                <w:color w:val="000000" w:themeColor="text1"/>
+                <w:sz w:val="14"/>
+                <w:szCs w:val="14"/>
+                <w:rFonts w:ascii="Times New Roman" w:hAnsi="Times New Roman" w:cs="Times New Roman"/>
               </w:rPr>
               <w:t xml:space="preserve">Date of Testing</w:t>
             </w:r>
@@ -4009,136 +4010,136 @@
             </w:pPr>
             <w:r>
               <w:rPr>
+                <w:color w:val="000000" w:themeColor="text1"/>
+                <w:sz w:val="14"/>
+                <w:szCs w:val="14"/>
+                <w:rFonts w:ascii="Times New Roman" w:hAnsi="Times New Roman" w:cs="Times New Roman"/>
+              </w:rPr>
+              <w:t w:space="preserve" xml:space="preserve">No growth</w:t>
+            </w:r>
+            <w:r>
+              <w:rPr>
+                <w:color w:val="000000" w:themeColor="text1"/>
+                <w:sz w:val="14"/>
+                <w:szCs w:val="14"/>
+                <w:rFonts w:ascii="Times New Roman" w:hAnsi="Times New Roman" w:cs="Times New Roman"/>
+              </w:rPr>
+              <w:t/>
+            </w:r>
+            <w:r>
+              <w:rPr>
+                <w:color w:val="000000" w:themeColor="text1"/>
+                <w:sz w:val="14"/>
+                <w:szCs w:val="14"/>
+                <w:rFonts w:ascii="Times New Roman" w:hAnsi="Times New Roman" w:cs="Times New Roman"/>
+              </w:rPr>
+              <w:t xml:space="preserve"/>
+            </w:r>
+          </w:p>
+        </w:tc>
+        <w:tc>
+          <w:tcPr>
+            <w:tcW w:w="1444" w:type="dxa"/>
+            <w:tcBorders>
+              <w:top w:val="single" w:sz="8" w:space="0" w:color="auto"/>
+              <w:left w:val="nil"/>
+              <w:bottom w:val="single" w:sz="8" w:space="0" w:color="auto"/>
+              <w:right w:val="single" w:sz="8" w:space="0" w:color="auto"/>
+            </w:tcBorders>
+            <w:shd w:val="clear" w:color="auto" w:fill="FFFFFF" w:themeFill="background1"/>
+            <w:tcMar>
+              <w:left w:w="108" w:type="dxa"/>
+              <w:right w:w="108" w:type="dxa"/>
+            </w:tcMar>
+            <w:vAlign w:val="center"/>
+          </w:tcPr>
+          <w:p>
+            <w:pPr>
+              <w:rPr>
                 <w:rFonts w:ascii="Times New Roman" w:hAnsi="Times New Roman"/>
                 <w:color w:val="000000" w:themeColor="text1"/>
                 <w:sz w:val="14"/>
                 <w:szCs w:val="14"/>
               </w:rPr>
-              <w:t w:space="preserve" xml:space="preserve">No growth</w:t>
-            </w:r>
-            <w:r>
+            </w:pPr>
+            <w:r>
+              <w:rPr>
+                <w:color w:val="000000" w:themeColor="text1"/>
+                <w:sz w:val="14"/>
+                <w:szCs w:val="14"/>
+                <w:rFonts w:ascii="Times New Roman" w:hAnsi="Times New Roman" w:cs="Times New Roman"/>
+              </w:rPr>
+              <w:t w:space="preserve" xml:space="preserve">N/A</w:t>
+            </w:r>
+            <w:r>
+              <w:rPr>
+                <w:color w:val="000000" w:themeColor="text1"/>
+                <w:sz w:val="14"/>
+                <w:szCs w:val="14"/>
+                <w:rFonts w:ascii="Times New Roman" w:hAnsi="Times New Roman" w:cs="Times New Roman"/>
+              </w:rPr>
+              <w:t/>
+            </w:r>
+            <w:r>
+              <w:rPr>
+                <w:color w:val="000000" w:themeColor="text1"/>
+                <w:sz w:val="14"/>
+                <w:szCs w:val="14"/>
+                <w:rFonts w:ascii="Times New Roman" w:hAnsi="Times New Roman" w:cs="Times New Roman"/>
+              </w:rPr>
+              <w:t xml:space="preserve"/>
+            </w:r>
+          </w:p>
+        </w:tc>
+        <w:tc>
+          <w:tcPr>
+            <w:tcW w:w="1394" w:type="dxa"/>
+            <w:tcBorders>
+              <w:top w:val="single" w:sz="8" w:space="0" w:color="auto"/>
+              <w:left w:val="single" w:sz="8" w:space="0" w:color="auto"/>
+              <w:bottom w:val="single" w:sz="8" w:space="0" w:color="auto"/>
+              <w:right w:val="single" w:sz="8" w:space="0" w:color="auto"/>
+            </w:tcBorders>
+            <w:shd w:val="clear" w:color="auto" w:fill="FFFFFF" w:themeFill="background1"/>
+            <w:tcMar>
+              <w:left w:w="108" w:type="dxa"/>
+              <w:right w:w="108" w:type="dxa"/>
+            </w:tcMar>
+            <w:vAlign w:val="center"/>
+          </w:tcPr>
+          <w:p>
+            <w:pPr>
               <w:rPr>
                 <w:rFonts w:ascii="Times New Roman" w:hAnsi="Times New Roman"/>
                 <w:color w:val="000000" w:themeColor="text1"/>
                 <w:sz w:val="14"/>
                 <w:szCs w:val="14"/>
               </w:rPr>
+            </w:pPr>
+            <w:r>
+              <w:rPr>
+                <w:color w:val="000000" w:themeColor="text1"/>
+                <w:sz w:val="14"/>
+                <w:szCs w:val="14"/>
+                <w:rFonts w:ascii="Times New Roman" w:hAnsi="Times New Roman" w:cs="Times New Roman"/>
+              </w:rPr>
+              <w:t w:space="preserve" xml:space="preserve">N/A</w:t>
+            </w:r>
+            <w:r>
+              <w:rPr>
+                <w:color w:val="000000" w:themeColor="text1"/>
+                <w:sz w:val="14"/>
+                <w:szCs w:val="14"/>
+                <w:rFonts w:ascii="Times New Roman" w:hAnsi="Times New Roman" w:cs="Times New Roman"/>
+              </w:rPr>
               <w:t/>
             </w:r>
             <w:r>
               <w:rPr>
-                <w:rFonts w:ascii="Times New Roman" w:hAnsi="Times New Roman"/>
-                <w:color w:val="000000" w:themeColor="text1"/>
-                <w:sz w:val="14"/>
-                <w:szCs w:val="14"/>
-              </w:rPr>
-              <w:t xml:space="preserve"/>
-            </w:r>
-          </w:p>
-        </w:tc>
-        <w:tc>
-          <w:tcPr>
-            <w:tcW w:w="1444" w:type="dxa"/>
-            <w:tcBorders>
-              <w:top w:val="single" w:sz="8" w:space="0" w:color="auto"/>
-              <w:left w:val="nil"/>
-              <w:bottom w:val="single" w:sz="8" w:space="0" w:color="auto"/>
-              <w:right w:val="single" w:sz="8" w:space="0" w:color="auto"/>
-            </w:tcBorders>
-            <w:shd w:val="clear" w:color="auto" w:fill="FFFFFF" w:themeFill="background1"/>
-            <w:tcMar>
-              <w:left w:w="108" w:type="dxa"/>
-              <w:right w:w="108" w:type="dxa"/>
-            </w:tcMar>
-            <w:vAlign w:val="center"/>
-          </w:tcPr>
-          <w:p>
-            <w:pPr>
-              <w:rPr>
-                <w:rFonts w:ascii="Times New Roman" w:hAnsi="Times New Roman"/>
-                <w:color w:val="000000" w:themeColor="text1"/>
-                <w:sz w:val="14"/>
-                <w:szCs w:val="14"/>
-              </w:rPr>
-            </w:pPr>
-            <w:r>
-              <w:rPr>
-                <w:rFonts w:ascii="Times New Roman" w:hAnsi="Times New Roman"/>
-                <w:color w:val="000000" w:themeColor="text1"/>
-                <w:sz w:val="14"/>
-                <w:szCs w:val="14"/>
-              </w:rPr>
-              <w:t w:space="preserve" xml:space="preserve">N/A</w:t>
-            </w:r>
-            <w:r>
-              <w:rPr>
-                <w:rFonts w:ascii="Times New Roman" w:hAnsi="Times New Roman"/>
-                <w:color w:val="000000" w:themeColor="text1"/>
-                <w:sz w:val="14"/>
-                <w:szCs w:val="14"/>
-              </w:rPr>
-              <w:t/>
-            </w:r>
-            <w:r>
-              <w:rPr>
-                <w:rFonts w:ascii="Times New Roman" w:hAnsi="Times New Roman"/>
-                <w:color w:val="000000" w:themeColor="text1"/>
-                <w:sz w:val="14"/>
-                <w:szCs w:val="14"/>
-              </w:rPr>
-              <w:t xml:space="preserve"/>
-            </w:r>
-          </w:p>
-        </w:tc>
-        <w:tc>
-          <w:tcPr>
-            <w:tcW w:w="1394" w:type="dxa"/>
-            <w:tcBorders>
-              <w:top w:val="single" w:sz="8" w:space="0" w:color="auto"/>
-              <w:left w:val="single" w:sz="8" w:space="0" w:color="auto"/>
-              <w:bottom w:val="single" w:sz="8" w:space="0" w:color="auto"/>
-              <w:right w:val="single" w:sz="8" w:space="0" w:color="auto"/>
-            </w:tcBorders>
-            <w:shd w:val="clear" w:color="auto" w:fill="FFFFFF" w:themeFill="background1"/>
-            <w:tcMar>
-              <w:left w:w="108" w:type="dxa"/>
-              <w:right w:w="108" w:type="dxa"/>
-            </w:tcMar>
-            <w:vAlign w:val="center"/>
-          </w:tcPr>
-          <w:p>
-            <w:pPr>
-              <w:rPr>
-                <w:rFonts w:ascii="Times New Roman" w:hAnsi="Times New Roman"/>
-                <w:color w:val="000000" w:themeColor="text1"/>
-                <w:sz w:val="14"/>
-                <w:szCs w:val="14"/>
-              </w:rPr>
-            </w:pPr>
-            <w:r>
-              <w:rPr>
-                <w:rFonts w:ascii="Times New Roman" w:hAnsi="Times New Roman"/>
-                <w:color w:val="000000" w:themeColor="text1"/>
-                <w:sz w:val="14"/>
-                <w:szCs w:val="14"/>
-              </w:rPr>
-              <w:t w:space="preserve" xml:space="preserve">N/A</w:t>
-            </w:r>
-            <w:r>
-              <w:rPr>
-                <w:rFonts w:ascii="Times New Roman" w:hAnsi="Times New Roman"/>
-                <w:color w:val="000000" w:themeColor="text1"/>
-                <w:sz w:val="14"/>
-                <w:szCs w:val="14"/>
-              </w:rPr>
-              <w:t/>
-            </w:r>
-            <w:r>
-              <w:rPr>
-                <w:rFonts w:ascii="Times New Roman" w:hAnsi="Times New Roman"/>
-                <w:color w:val="000000" w:themeColor="text1"/>
-                <w:sz w:val="14"/>
-                <w:szCs w:val="14"/>
+                <w:color w:val="000000" w:themeColor="text1"/>
+                <w:sz w:val="14"/>
+                <w:szCs w:val="14"/>
+                <w:rFonts w:ascii="Times New Roman" w:hAnsi="Times New Roman" w:cs="Times New Roman"/>
               </w:rPr>
               <w:t xml:space="preserve"/>
             </w:r>
@@ -4173,10 +4174,10 @@
             </w:pPr>
             <w:r>
               <w:rPr>
-                <w:rFonts w:ascii="Times New Roman" w:hAnsi="Times New Roman"/>
-                <w:color w:val="000000" w:themeColor="text1"/>
-                <w:sz w:val="14"/>
-                <w:szCs w:val="14"/>
+                <w:color w:val="000000" w:themeColor="text1"/>
+                <w:sz w:val="14"/>
+                <w:szCs w:val="14"/>
+                <w:rFonts w:ascii="Times New Roman" w:hAnsi="Times New Roman" w:cs="Times New Roman"/>
               </w:rPr>
               <w:t xml:space="preserve"> None</w:t>
             </w:r>
@@ -4186,7 +4187,6 @@
       <w:tr>
         <w:trPr>
           <w:trHeight w:val="300"/>
-          <w:trHeight w:val="220" w:hRule="atLeast"/>
         </w:trPr>
         <w:tc>
           <w:tcPr>
@@ -4210,10 +4210,10 @@
             </w:pPr>
             <w:r>
               <w:rPr>
-                <w:rFonts w:ascii="Times New Roman" w:hAnsi="Times New Roman"/>
-                <w:color w:val="000000" w:themeColor="text1"/>
-                <w:sz w:val="14"/>
-                <w:szCs w:val="14"/>
+                <w:color w:val="000000" w:themeColor="text1"/>
+                <w:sz w:val="14"/>
+                <w:szCs w:val="14"/>
+                <w:rFonts w:ascii="Times New Roman" w:hAnsi="Times New Roman" w:cs="Times New Roman"/>
               </w:rPr>
               <w:t>Settling Sampling of ISO 5 (2 locations)</w:t>
             </w:r>
@@ -4242,56 +4242,56 @@
             </w:pPr>
             <w:r>
               <w:rPr>
+                <w:color w:val="000000" w:themeColor="text1"/>
+                <w:sz w:val="14"/>
+                <w:szCs w:val="14"/>
+                <w:rFonts w:ascii="Times New Roman" w:hAnsi="Times New Roman" w:cs="Times New Roman"/>
+              </w:rPr>
+              <w:t xml:space="preserve">Daily</w:t>
+            </w:r>
+          </w:p>
+        </w:tc>
+        <w:tc>
+          <w:tcPr>
+            <w:tcW w:w="1206" w:type="dxa"/>
+            <w:tcBorders>
+              <w:top w:val="single" w:sz="8" w:space="0" w:color="auto"/>
+              <w:left w:val="nil"/>
+              <w:bottom w:val="single" w:sz="8" w:space="0" w:color="auto"/>
+              <w:right w:val="single" w:sz="8" w:space="0" w:color="auto"/>
+            </w:tcBorders>
+            <w:shd w:val="clear" w:color="auto" w:fill="FFFFFF" w:themeFill="background1"/>
+            <w:tcMar>
+              <w:left w:w="108" w:type="dxa"/>
+              <w:right w:w="108" w:type="dxa"/>
+            </w:tcMar>
+            <w:vAlign w:val="center"/>
+          </w:tcPr>
+          <w:p>
+            <w:pPr>
+              <w:jc w:val="center"/>
+              <w:rPr>
                 <w:rFonts w:ascii="Times New Roman" w:hAnsi="Times New Roman"/>
                 <w:color w:val="000000" w:themeColor="text1"/>
                 <w:sz w:val="14"/>
                 <w:szCs w:val="14"/>
               </w:rPr>
-              <w:t xml:space="preserve">Daily</w:t>
-            </w:r>
-          </w:p>
-        </w:tc>
-        <w:tc>
-          <w:tcPr>
-            <w:tcW w:w="1206" w:type="dxa"/>
-            <w:tcBorders>
-              <w:top w:val="single" w:sz="8" w:space="0" w:color="auto"/>
-              <w:left w:val="nil"/>
-              <w:bottom w:val="single" w:sz="8" w:space="0" w:color="auto"/>
-              <w:right w:val="single" w:sz="8" w:space="0" w:color="auto"/>
-            </w:tcBorders>
-            <w:shd w:val="clear" w:color="auto" w:fill="FFFFFF" w:themeFill="background1"/>
-            <w:tcMar>
-              <w:left w:w="108" w:type="dxa"/>
-              <w:right w:w="108" w:type="dxa"/>
-            </w:tcMar>
-            <w:vAlign w:val="center"/>
-          </w:tcPr>
-          <w:p>
-            <w:pPr>
-              <w:jc w:val="center"/>
-              <w:rPr>
-                <w:rFonts w:ascii="Times New Roman" w:hAnsi="Times New Roman"/>
-                <w:color w:val="000000" w:themeColor="text1"/>
-                <w:sz w:val="14"/>
-                <w:szCs w:val="14"/>
-              </w:rPr>
-            </w:pPr>
-            <w:r>
-              <w:rPr>
-                <w:rFonts w:ascii="Times New Roman" w:hAnsi="Times New Roman"/>
-                <w:color w:val="000000" w:themeColor="text1"/>
-                <w:sz w:val="14"/>
-                <w:szCs w:val="14"/>
+            </w:pPr>
+            <w:r>
+              <w:rPr>
+                <w:color w:val="000000" w:themeColor="text1"/>
+                <w:sz w:val="14"/>
+                <w:szCs w:val="14"/>
+                <w:rFonts w:ascii="Times New Roman" w:hAnsi="Times New Roman" w:cs="Times New Roman"/>
               </w:rPr>
               <w:t xml:space="preserve" w:space="preserve"> 26Aug26</w:t>
             </w:r>
             <w:r>
               <w:rPr>
-                <w:rFonts w:ascii="Times New Roman" w:hAnsi="Times New Roman"/>
-                <w:color w:val="000000" w:themeColor="text1"/>
-                <w:sz w:val="14"/>
-                <w:szCs w:val="14"/>
+                <w:color w:val="000000" w:themeColor="text1"/>
+                <w:sz w:val="14"/>
+                <w:szCs w:val="14"/>
+                <w:rFonts w:ascii="Times New Roman" w:hAnsi="Times New Roman" w:cs="Times New Roman"/>
               </w:rPr>
               <w:t/>
             </w:r>
@@ -4326,19 +4326,19 @@
             </w:pPr>
             <w:r>
               <w:rPr>
-                <w:rFonts w:ascii="Times New Roman" w:hAnsi="Times New Roman"/>
-                <w:color w:val="000000" w:themeColor="text1"/>
-                <w:sz w:val="14"/>
-                <w:szCs w:val="14"/>
+                <w:color w:val="000000" w:themeColor="text1"/>
+                <w:sz w:val="14"/>
+                <w:szCs w:val="14"/>
+                <w:rFonts w:ascii="Times New Roman" w:hAnsi="Times New Roman" w:cs="Times New Roman"/>
               </w:rPr>
               <w:t w:space="preserve" xml:space="preserve">Pending </w:t>
             </w:r>
             <w:r>
               <w:rPr>
-                <w:rFonts w:ascii="Times New Roman" w:hAnsi="Times New Roman"/>
-                <w:color w:val="000000" w:themeColor="text1"/>
-                <w:sz w:val="14"/>
-                <w:szCs w:val="14"/>
+                <w:color w:val="000000" w:themeColor="text1"/>
+                <w:sz w:val="14"/>
+                <w:szCs w:val="14"/>
+                <w:rFonts w:ascii="Times New Roman" w:hAnsi="Times New Roman" w:cs="Times New Roman"/>
               </w:rPr>
               <w:t xml:space="preserve"/>
             </w:r>
@@ -4366,10 +4366,10 @@
             </w:pPr>
             <w:r>
               <w:rPr>
-                <w:rFonts w:ascii="Times New Roman" w:hAnsi="Times New Roman"/>
-                <w:color w:val="000000" w:themeColor="text1"/>
-                <w:sz w:val="14"/>
-                <w:szCs w:val="14"/>
+                <w:color w:val="000000" w:themeColor="text1"/>
+                <w:sz w:val="14"/>
+                <w:szCs w:val="14"/>
+                <w:rFonts w:ascii="Times New Roman" w:hAnsi="Times New Roman" w:cs="Times New Roman"/>
               </w:rPr>
               <w:t xml:space="preserve">Date After Testing</w:t>
             </w:r>
@@ -4404,47 +4404,47 @@
             </w:pPr>
             <w:r>
               <w:rPr>
-                <w:rFonts w:ascii="Times New Roman" w:hAnsi="Times New Roman"/>
-                <w:color w:val="000000" w:themeColor="text1"/>
-                <w:sz w:val="14"/>
-                <w:szCs w:val="14"/>
+                <w:color w:val="000000" w:themeColor="text1"/>
+                <w:sz w:val="14"/>
+                <w:szCs w:val="14"/>
+                <w:rFonts w:ascii="Times New Roman" w:hAnsi="Times New Roman" w:cs="Times New Roman"/>
               </w:rPr>
               <w:t xml:space="preserve" w:space="preserve">No growth</w:t>
             </w:r>
             <w:r>
               <w:rPr>
-                <w:rFonts w:ascii="Times New Roman" w:hAnsi="Times New Roman" w:hint="eastAsia"/>
                 <w:color w:val="000000" w:themeColor="text1"/>
                 <w:sz w:val="14"/>
                 <w:szCs w:val="14"/>
                 <w:lang w:eastAsia="zh-CN"/>
+                <w:rFonts w:ascii="Times New Roman" w:hAnsi="Times New Roman" w:cs="Times New Roman"/>
               </w:rPr>
               <w:t/>
             </w:r>
             <w:r>
               <w:rPr>
-                <w:rFonts w:ascii="Times New Roman" w:hAnsi="Times New Roman"/>
-                <w:color w:val="000000" w:themeColor="text1"/>
-                <w:sz w:val="14"/>
-                <w:szCs w:val="14"/>
+                <w:color w:val="000000" w:themeColor="text1"/>
+                <w:sz w:val="14"/>
+                <w:szCs w:val="14"/>
+                <w:rFonts w:ascii="Times New Roman" w:hAnsi="Times New Roman" w:cs="Times New Roman"/>
               </w:rPr>
               <w:t/>
             </w:r>
             <w:r>
               <w:rPr>
-                <w:rFonts w:ascii="Times New Roman" w:hAnsi="Times New Roman"/>
-                <w:color w:val="000000" w:themeColor="text1"/>
-                <w:sz w:val="14"/>
-                <w:szCs w:val="14"/>
+                <w:color w:val="000000" w:themeColor="text1"/>
+                <w:sz w:val="14"/>
+                <w:szCs w:val="14"/>
+                <w:rFonts w:ascii="Times New Roman" w:hAnsi="Times New Roman" w:cs="Times New Roman"/>
               </w:rPr>
               <w:t/>
             </w:r>
             <w:r>
               <w:rPr>
-                <w:rFonts w:ascii="Times New Roman" w:hAnsi="Times New Roman"/>
-                <w:color w:val="000000" w:themeColor="text1"/>
-                <w:sz w:val="14"/>
-                <w:szCs w:val="14"/>
+                <w:color w:val="000000" w:themeColor="text1"/>
+                <w:sz w:val="14"/>
+                <w:szCs w:val="14"/>
+                <w:rFonts w:ascii="Times New Roman" w:hAnsi="Times New Roman" w:cs="Times New Roman"/>
               </w:rPr>
               <w:t xml:space="preserve"/>
             </w:r>
@@ -4469,47 +4469,47 @@
           <w:p>
             <w:r>
               <w:rPr>
-                <w:rFonts w:ascii="Times New Roman" w:hAnsi="Times New Roman"/>
-                <w:color w:val="000000" w:themeColor="text1"/>
-                <w:sz w:val="14"/>
-                <w:szCs w:val="14"/>
+                <w:color w:val="000000" w:themeColor="text1"/>
+                <w:sz w:val="14"/>
+                <w:szCs w:val="14"/>
+                <w:rFonts w:ascii="Times New Roman" w:hAnsi="Times New Roman" w:cs="Times New Roman"/>
               </w:rPr>
               <w:t xml:space="preserve" w:space="preserve">N/A</w:t>
             </w:r>
             <w:r>
               <w:rPr>
-                <w:rFonts w:ascii="Times New Roman" w:hAnsi="Times New Roman" w:hint="eastAsia"/>
                 <w:color w:val="000000" w:themeColor="text1"/>
                 <w:sz w:val="14"/>
                 <w:szCs w:val="14"/>
                 <w:lang w:eastAsia="zh-CN"/>
+                <w:rFonts w:ascii="Times New Roman" w:hAnsi="Times New Roman" w:cs="Times New Roman"/>
               </w:rPr>
               <w:t/>
             </w:r>
             <w:r>
               <w:rPr>
-                <w:rFonts w:ascii="Times New Roman" w:hAnsi="Times New Roman"/>
-                <w:color w:val="000000" w:themeColor="text1"/>
-                <w:sz w:val="14"/>
-                <w:szCs w:val="14"/>
+                <w:color w:val="000000" w:themeColor="text1"/>
+                <w:sz w:val="14"/>
+                <w:szCs w:val="14"/>
+                <w:rFonts w:ascii="Times New Roman" w:hAnsi="Times New Roman" w:cs="Times New Roman"/>
               </w:rPr>
               <w:t/>
             </w:r>
             <w:r>
               <w:rPr>
-                <w:rFonts w:ascii="Times New Roman" w:hAnsi="Times New Roman"/>
-                <w:color w:val="000000" w:themeColor="text1"/>
-                <w:sz w:val="14"/>
-                <w:szCs w:val="14"/>
+                <w:color w:val="000000" w:themeColor="text1"/>
+                <w:sz w:val="14"/>
+                <w:szCs w:val="14"/>
+                <w:rFonts w:ascii="Times New Roman" w:hAnsi="Times New Roman" w:cs="Times New Roman"/>
               </w:rPr>
               <w:t/>
             </w:r>
             <w:r>
               <w:rPr>
-                <w:rFonts w:ascii="Times New Roman" w:hAnsi="Times New Roman"/>
-                <w:color w:val="000000" w:themeColor="text1"/>
-                <w:sz w:val="14"/>
-                <w:szCs w:val="14"/>
+                <w:color w:val="000000" w:themeColor="text1"/>
+                <w:sz w:val="14"/>
+                <w:szCs w:val="14"/>
+                <w:rFonts w:ascii="Times New Roman" w:hAnsi="Times New Roman" w:cs="Times New Roman"/>
               </w:rPr>
               <w:t xml:space="preserve"/>
             </w:r>
@@ -4534,47 +4534,47 @@
           <w:p>
             <w:r>
               <w:rPr>
-                <w:rFonts w:ascii="Times New Roman" w:hAnsi="Times New Roman"/>
-                <w:color w:val="000000" w:themeColor="text1"/>
-                <w:sz w:val="14"/>
-                <w:szCs w:val="14"/>
-              </w:rPr>
-              <w:t xml:space="preserve" w:space="preserve">N/A</w:t>
-            </w:r>
-            <w:r>
-              <w:rPr>
-                <w:rFonts w:ascii="Times New Roman" w:hAnsi="Times New Roman" w:hint="eastAsia"/>
+                <w:color w:val="000000" w:themeColor="text1"/>
+                <w:sz w:val="14"/>
+                <w:szCs w:val="14"/>
+                <w:rFonts w:ascii="Times New Roman" w:hAnsi="Times New Roman" w:cs="Times New Roman"/>
+              </w:rPr>
+              <w:t xml:space="preserve" w:space="preserve"/>
+            </w:r>
+            <w:r>
+              <w:rPr>
                 <w:color w:val="000000" w:themeColor="text1"/>
                 <w:sz w:val="14"/>
                 <w:szCs w:val="14"/>
                 <w:lang w:eastAsia="zh-CN"/>
+                <w:rFonts w:ascii="Times New Roman" w:hAnsi="Times New Roman" w:cs="Times New Roman"/>
               </w:rPr>
               <w:t/>
             </w:r>
             <w:r>
               <w:rPr>
-                <w:rFonts w:ascii="Times New Roman" w:hAnsi="Times New Roman"/>
-                <w:color w:val="000000" w:themeColor="text1"/>
-                <w:sz w:val="14"/>
-                <w:szCs w:val="14"/>
+                <w:color w:val="000000" w:themeColor="text1"/>
+                <w:sz w:val="14"/>
+                <w:szCs w:val="14"/>
+                <w:rFonts w:ascii="Times New Roman" w:hAnsi="Times New Roman" w:cs="Times New Roman"/>
               </w:rPr>
               <w:t/>
             </w:r>
             <w:r>
               <w:rPr>
-                <w:rFonts w:ascii="Times New Roman" w:hAnsi="Times New Roman"/>
-                <w:color w:val="000000" w:themeColor="text1"/>
-                <w:sz w:val="14"/>
-                <w:szCs w:val="14"/>
+                <w:color w:val="000000" w:themeColor="text1"/>
+                <w:sz w:val="14"/>
+                <w:szCs w:val="14"/>
+                <w:rFonts w:ascii="Times New Roman" w:hAnsi="Times New Roman" w:cs="Times New Roman"/>
               </w:rPr>
               <w:t/>
             </w:r>
             <w:r>
               <w:rPr>
-                <w:rFonts w:ascii="Times New Roman" w:hAnsi="Times New Roman"/>
-                <w:color w:val="000000" w:themeColor="text1"/>
-                <w:sz w:val="14"/>
-                <w:szCs w:val="14"/>
+                <w:color w:val="000000" w:themeColor="text1"/>
+                <w:sz w:val="14"/>
+                <w:szCs w:val="14"/>
+                <w:rFonts w:ascii="Times New Roman" w:hAnsi="Times New Roman" w:cs="Times New Roman"/>
               </w:rPr>
               <w:t xml:space="preserve"/>
             </w:r>
@@ -4609,10 +4609,10 @@
             </w:pPr>
             <w:r>
               <w:rPr>
-                <w:rFonts w:ascii="Times New Roman" w:hAnsi="Times New Roman"/>
-                <w:color w:val="000000" w:themeColor="text1"/>
-                <w:sz w:val="14"/>
-                <w:szCs w:val="14"/>
+                <w:color w:val="000000" w:themeColor="text1"/>
+                <w:sz w:val="14"/>
+                <w:szCs w:val="14"/>
+                <w:rFonts w:ascii="Times New Roman" w:hAnsi="Times New Roman" w:cs="Times New Roman"/>
               </w:rPr>
               <w:t xml:space="preserve"> None</w:t>
             </w:r>
@@ -4622,7 +4622,6 @@
       <w:tr>
         <w:trPr>
           <w:trHeight w:val="300"/>
-          <w:trHeight w:val="220" w:hRule="atLeast"/>
         </w:trPr>
         <w:tc>
           <w:tcPr>
@@ -4639,7 +4638,15 @@
           </w:tcPr>
           <w:p>
             <w:r>
-              <w:t xml:space="preserve">Weekly Active Air Sampling of Cleanroom - CR114 (E001736)</w:t>
+              <w:rPr>
+                <w:b/>
+                <w:bCs/>
+                <w:color w:val="000000" w:themeColor="text1"/>
+                <w:sz w:val="14"/>
+                <w:szCs w:val="14"/>
+                <w:rFonts w:ascii="Times New Roman" w:hAnsi="Times New Roman" w:cs="Times New Roman"/>
+              </w:rPr>
+              <w:t xml:space="preserve">   Weekly Active Air Sampling Bracketing</w:t>
             </w:r>
           </w:p>
         </w:tc>
@@ -4647,7 +4654,6 @@
       <w:tr>
         <w:trPr>
           <w:trHeight w:val="300"/>
-          <w:trHeight w:val="220" w:hRule="atLeast"/>
         </w:trPr>
         <w:tc>
           <w:tcPr>
@@ -4667,68 +4673,68 @@
             </w:pPr>
             <w:r>
               <w:rPr>
+                <w:color w:val="000000" w:themeColor="text1"/>
+                <w:sz w:val="14"/>
+                <w:szCs w:val="14"/>
+                <w:rFonts w:ascii="Times New Roman" w:hAnsi="Times New Roman" w:cs="Times New Roman"/>
+              </w:rPr>
+              <w:t>Active Air Sampling of Cleanrooms</w:t>
+            </w:r>
+          </w:p>
+        </w:tc>
+        <w:tc>
+          <w:tcPr>
+            <w:tcW w:w="566" w:type="dxa"/>
+            <w:tcBorders>
+              <w:top w:val="single" w:sz="8" w:space="0" w:color="auto"/>
+              <w:left w:val="nil"/>
+              <w:bottom w:val="single" w:sz="8" w:space="0" w:color="auto"/>
+              <w:right w:val="single" w:sz="8" w:space="0" w:color="auto"/>
+            </w:tcBorders>
+            <w:vAlign w:val="center"/>
+          </w:tcPr>
+          <w:p>
+            <w:pPr>
+              <w:jc w:val="center"/>
+            </w:pPr>
+            <w:r>
+              <w:rPr>
+                <w:color w:val="000000" w:themeColor="text1"/>
+                <w:sz w:val="14"/>
+                <w:szCs w:val="14"/>
+                <w:rFonts w:ascii="Times New Roman" w:hAnsi="Times New Roman" w:cs="Times New Roman"/>
+              </w:rPr>
+              <w:t xml:space="preserve">Weekly</w:t>
+            </w:r>
+          </w:p>
+        </w:tc>
+        <w:tc>
+          <w:tcPr>
+            <w:tcW w:w="1206" w:type="dxa"/>
+            <w:tcBorders>
+              <w:top w:val="single" w:sz="8" w:space="0" w:color="auto"/>
+              <w:left w:val="single" w:sz="8" w:space="0" w:color="auto"/>
+              <w:bottom w:val="single" w:sz="8" w:space="0" w:color="auto"/>
+              <w:right w:val="single" w:sz="8" w:space="0" w:color="auto"/>
+            </w:tcBorders>
+            <w:vAlign w:val="center"/>
+          </w:tcPr>
+          <w:p>
+            <w:pPr>
+              <w:jc w:val="center"/>
+              <w:rPr>
                 <w:rFonts w:ascii="Times New Roman" w:hAnsi="Times New Roman"/>
                 <w:color w:val="000000" w:themeColor="text1"/>
                 <w:sz w:val="14"/>
                 <w:szCs w:val="14"/>
               </w:rPr>
-              <w:t>Active Air Sampling of Cleanrooms</w:t>
-            </w:r>
-          </w:p>
-        </w:tc>
-        <w:tc>
-          <w:tcPr>
-            <w:tcW w:w="566" w:type="dxa"/>
-            <w:tcBorders>
-              <w:top w:val="single" w:sz="8" w:space="0" w:color="auto"/>
-              <w:left w:val="nil"/>
-              <w:bottom w:val="single" w:sz="8" w:space="0" w:color="auto"/>
-              <w:right w:val="single" w:sz="8" w:space="0" w:color="auto"/>
-            </w:tcBorders>
-            <w:vAlign w:val="center"/>
-          </w:tcPr>
-          <w:p>
-            <w:pPr>
-              <w:jc w:val="center"/>
-            </w:pPr>
-            <w:r>
-              <w:rPr>
-                <w:rFonts w:ascii="Times New Roman" w:hAnsi="Times New Roman"/>
-                <w:color w:val="000000" w:themeColor="text1"/>
-                <w:sz w:val="14"/>
-                <w:szCs w:val="14"/>
-              </w:rPr>
-              <w:t xml:space="preserve">Weekly</w:t>
-            </w:r>
-          </w:p>
-        </w:tc>
-        <w:tc>
-          <w:tcPr>
-            <w:tcW w:w="1206" w:type="dxa"/>
-            <w:tcBorders>
-              <w:top w:val="single" w:sz="8" w:space="0" w:color="auto"/>
-              <w:left w:val="single" w:sz="8" w:space="0" w:color="auto"/>
-              <w:bottom w:val="single" w:sz="8" w:space="0" w:color="auto"/>
-              <w:right w:val="single" w:sz="8" w:space="0" w:color="auto"/>
-            </w:tcBorders>
-            <w:vAlign w:val="center"/>
-          </w:tcPr>
-          <w:p>
-            <w:pPr>
-              <w:jc w:val="center"/>
-              <w:rPr>
-                <w:rFonts w:ascii="Times New Roman" w:hAnsi="Times New Roman"/>
-                <w:color w:val="000000" w:themeColor="text1"/>
-                <w:sz w:val="14"/>
-                <w:szCs w:val="14"/>
-              </w:rPr>
-            </w:pPr>
-            <w:r>
-              <w:rPr>
-                <w:rFonts w:ascii="Times New Roman" w:hAnsi="Times New Roman"/>
-                <w:color w:val="000000" w:themeColor="text1"/>
-                <w:sz w:val="14"/>
-                <w:szCs w:val="14"/>
+            </w:pPr>
+            <w:r>
+              <w:rPr>
+                <w:color w:val="000000" w:themeColor="text1"/>
+                <w:sz w:val="14"/>
+                <w:szCs w:val="14"/>
+                <w:rFonts w:ascii="Times New Roman" w:hAnsi="Times New Roman" w:cs="Times New Roman"/>
               </w:rPr>
               <w:t w:space="preserve" xml:space="preserve">25Aug26</w:t>
             </w:r>
@@ -4751,9 +4757,9 @@
             </w:pPr>
             <w:r>
               <w:rPr>
-                <w:rFonts w:ascii="Times New Roman" w:hAnsi="Times New Roman"/>
-                <w:sz w:val="14"/>
-                <w:szCs w:val="14"/>
+                <w:sz w:val="14"/>
+                <w:szCs w:val="14"/>
+                <w:rFonts w:ascii="Times New Roman" w:hAnsi="Times New Roman" w:cs="Times New Roman"/>
               </w:rPr>
               <w:t xml:space="preserve"> SMO</w:t>
             </w:r>
@@ -4777,21 +4783,52 @@
             </w:pPr>
             <w:r>
               <w:rPr>
+                <w:color w:val="000000" w:themeColor="text1"/>
+                <w:sz w:val="14"/>
+                <w:szCs w:val="14"/>
+                <w:rFonts w:ascii="Times New Roman" w:hAnsi="Times New Roman" w:cs="Times New Roman"/>
+              </w:rPr>
+              <w:t xml:space="preserve">Week on Testing Date</w:t>
+            </w:r>
+          </w:p>
+        </w:tc>
+        <w:tc>
+          <w:tcPr>
+            <w:tcW w:w="1419" w:type="dxa"/>
+            <w:tcBorders>
+              <w:top w:val="single" w:sz="8" w:space="0" w:color="auto"/>
+              <w:left w:val="nil"/>
+              <w:bottom w:val="single" w:sz="8" w:space="0" w:color="auto"/>
+              <w:right w:val="single" w:sz="8" w:space="0" w:color="auto"/>
+            </w:tcBorders>
+            <w:vAlign w:val="center"/>
+          </w:tcPr>
+          <w:p>
+            <w:pPr>
+              <w:jc w:val="center"/>
+              <w:rPr>
                 <w:rFonts w:ascii="Times New Roman" w:hAnsi="Times New Roman"/>
-                <w:color w:val="000000" w:themeColor="text1"/>
-                <w:sz w:val="14"/>
-                <w:szCs w:val="14"/>
-              </w:rPr>
-              <w:t xml:space="preserve">Week on Testing Date</w:t>
-            </w:r>
-          </w:p>
-        </w:tc>
-        <w:tc>
-          <w:tcPr>
-            <w:tcW w:w="1419" w:type="dxa"/>
-            <w:tcBorders>
-              <w:top w:val="single" w:sz="8" w:space="0" w:color="auto"/>
-              <w:left w:val="nil"/>
+                <w:sz w:val="14"/>
+                <w:szCs w:val="14"/>
+              </w:rPr>
+            </w:pPr>
+            <w:r>
+              <w:rPr>
+                <w:color w:val="000000" w:themeColor="text1"/>
+                <w:sz w:val="14"/>
+                <w:szCs w:val="14"/>
+                <w:rFonts w:ascii="Times New Roman" w:hAnsi="Times New Roman" w:cs="Times New Roman"/>
+              </w:rPr>
+              <w:t w:space="preserve" xml:space="preserve">4 CFU (ISO 8 114)</w:t>
+            </w:r>
+          </w:p>
+        </w:tc>
+        <w:tc>
+          <w:tcPr>
+            <w:tcW w:w="1444" w:type="dxa"/>
+            <w:tcBorders>
+              <w:top w:val="single" w:sz="8" w:space="0" w:color="auto"/>
+              <w:left w:val="single" w:sz="8" w:space="0" w:color="auto"/>
               <w:bottom w:val="single" w:sz="8" w:space="0" w:color="auto"/>
               <w:right w:val="single" w:sz="8" w:space="0" w:color="auto"/>
             </w:tcBorders>
@@ -4808,41 +4845,10 @@
             </w:pPr>
             <w:r>
               <w:rPr>
-                <w:rFonts w:ascii="Times New Roman" w:hAnsi="Times New Roman"/>
-                <w:color w:val="000000" w:themeColor="text1"/>
-                <w:sz w:val="14"/>
-                <w:szCs w:val="14"/>
-              </w:rPr>
-              <w:t w:space="preserve" xml:space="preserve">4 CFU (ISO 8 114)</w:t>
-            </w:r>
-          </w:p>
-        </w:tc>
-        <w:tc>
-          <w:tcPr>
-            <w:tcW w:w="1444" w:type="dxa"/>
-            <w:tcBorders>
-              <w:top w:val="single" w:sz="8" w:space="0" w:color="auto"/>
-              <w:left w:val="single" w:sz="8" w:space="0" w:color="auto"/>
-              <w:bottom w:val="single" w:sz="8" w:space="0" w:color="auto"/>
-              <w:right w:val="single" w:sz="8" w:space="0" w:color="auto"/>
-            </w:tcBorders>
-            <w:vAlign w:val="center"/>
-          </w:tcPr>
-          <w:p>
-            <w:pPr>
-              <w:jc w:val="center"/>
-              <w:rPr>
-                <w:rFonts w:ascii="Times New Roman" w:hAnsi="Times New Roman"/>
-                <w:sz w:val="14"/>
-                <w:szCs w:val="14"/>
-              </w:rPr>
-            </w:pPr>
-            <w:r>
-              <w:rPr>
-                <w:rFonts w:ascii="Times New Roman" w:hAnsi="Times New Roman"/>
-                <w:color w:val="000000" w:themeColor="text1"/>
-                <w:sz w:val="14"/>
-                <w:szCs w:val="14"/>
+                <w:color w:val="000000" w:themeColor="text1"/>
+                <w:sz w:val="14"/>
+                <w:szCs w:val="14"/>
+                <w:rFonts w:ascii="Times New Roman" w:hAnsi="Times New Roman" w:cs="Times New Roman"/>
               </w:rPr>
               <w:t w:space="preserve" xml:space="preserve">ETX-260901-0112</w:t>
             </w:r>
@@ -4871,10 +4877,10 @@
             </w:pPr>
             <w:r>
               <w:rPr>
-                <w:rFonts w:ascii="Times New Roman" w:hAnsi="Times New Roman"/>
-                <w:color w:val="000000" w:themeColor="text1"/>
-                <w:sz w:val="14"/>
-                <w:szCs w:val="14"/>
+                <w:color w:val="000000" w:themeColor="text1"/>
+                <w:sz w:val="14"/>
+                <w:szCs w:val="14"/>
+                <w:rFonts w:ascii="Times New Roman" w:hAnsi="Times New Roman" w:cs="Times New Roman"/>
               </w:rPr>
               <w:t w:space="preserve" xml:space="preserve">3 Gram (+) cocci,</w:t>
               <w:br/>
@@ -4904,9 +4910,9 @@
             </w:pPr>
             <w:r>
               <w:rPr>
-                <w:rFonts w:ascii="Times New Roman" w:hAnsi="Times New Roman"/>
-                <w:sz w:val="14"/>
-                <w:szCs w:val="14"/>
+                <w:sz w:val="14"/>
+                <w:szCs w:val="14"/>
+                <w:rFonts w:ascii="Times New Roman" w:hAnsi="Times New Roman" w:cs="Times New Roman"/>
               </w:rPr>
               <w:t xml:space="preserve">None </w:t>
             </w:r>
@@ -4916,7 +4922,6 @@
       <w:tr>
         <w:trPr>
           <w:trHeight w:val="300"/>
-          <w:trHeight w:val="220" w:hRule="atLeast"/>
         </w:trPr>
         <w:tc>
           <w:tcPr>
@@ -4933,7 +4938,15 @@
           </w:tcPr>
           <w:p>
             <w:r>
-              <w:t xml:space="preserve">Surface Sampling of Anteroom and Cleanroom – CR114 (E001736)</w:t>
+              <w:rPr>
+                <w:b/>
+                <w:bCs/>
+                <w:color w:val="000000" w:themeColor="text1"/>
+                <w:sz w:val="14"/>
+                <w:szCs w:val="14"/>
+                <w:rFonts w:ascii="Times New Roman" w:hAnsi="Times New Roman" w:cs="Times New Roman"/>
+              </w:rPr>
+              <w:t xml:space="preserve">   Surface Sampling of Anteroom and Cleanroom Bracketing </w:t>
             </w:r>
           </w:p>
         </w:tc>
@@ -4941,7 +4954,6 @@
       <w:tr>
         <w:trPr>
           <w:trHeight w:val="255"/>
-          <w:trHeight w:val="220" w:hRule="atLeast"/>
         </w:trPr>
         <w:tc>
           <w:tcPr>
@@ -4961,68 +4973,68 @@
             </w:pPr>
             <w:r>
               <w:rPr>
+                <w:color w:val="000000" w:themeColor="text1"/>
+                <w:sz w:val="14"/>
+                <w:szCs w:val="14"/>
+                <w:rFonts w:ascii="Times New Roman" w:hAnsi="Times New Roman" w:cs="Times New Roman"/>
+              </w:rPr>
+              <w:t>Surface Sampling of Cleanrooms</w:t>
+            </w:r>
+          </w:p>
+        </w:tc>
+        <w:tc>
+          <w:tcPr>
+            <w:tcW w:w="566" w:type="dxa"/>
+            <w:tcBorders>
+              <w:top w:val="single" w:sz="8" w:space="0" w:color="auto"/>
+              <w:left w:val="nil"/>
+              <w:bottom w:val="single" w:sz="8" w:space="0" w:color="auto"/>
+              <w:right w:val="single" w:sz="8" w:space="0" w:color="auto"/>
+            </w:tcBorders>
+            <w:vAlign w:val="center"/>
+          </w:tcPr>
+          <w:p>
+            <w:pPr>
+              <w:jc w:val="center"/>
+            </w:pPr>
+            <w:r>
+              <w:rPr>
+                <w:color w:val="000000" w:themeColor="text1"/>
+                <w:sz w:val="14"/>
+                <w:szCs w:val="14"/>
+                <w:rFonts w:ascii="Times New Roman" w:hAnsi="Times New Roman" w:cs="Times New Roman"/>
+              </w:rPr>
+              <w:t xml:space="preserve">Weekly</w:t>
+            </w:r>
+          </w:p>
+        </w:tc>
+        <w:tc>
+          <w:tcPr>
+            <w:tcW w:w="1206" w:type="dxa"/>
+            <w:tcBorders>
+              <w:top w:val="single" w:sz="8" w:space="0" w:color="auto"/>
+              <w:left w:val="single" w:sz="8" w:space="0" w:color="auto"/>
+              <w:bottom w:val="single" w:sz="8" w:space="0" w:color="auto"/>
+              <w:right w:val="single" w:sz="8" w:space="0" w:color="auto"/>
+            </w:tcBorders>
+            <w:vAlign w:val="center"/>
+          </w:tcPr>
+          <w:p>
+            <w:pPr>
+              <w:jc w:val="center"/>
+              <w:rPr>
                 <w:rFonts w:ascii="Times New Roman" w:hAnsi="Times New Roman"/>
                 <w:color w:val="000000" w:themeColor="text1"/>
                 <w:sz w:val="14"/>
                 <w:szCs w:val="14"/>
               </w:rPr>
-              <w:t>Surface Sampling of Cleanrooms</w:t>
-            </w:r>
-          </w:p>
-        </w:tc>
-        <w:tc>
-          <w:tcPr>
-            <w:tcW w:w="566" w:type="dxa"/>
-            <w:tcBorders>
-              <w:top w:val="single" w:sz="8" w:space="0" w:color="auto"/>
-              <w:left w:val="nil"/>
-              <w:bottom w:val="single" w:sz="8" w:space="0" w:color="auto"/>
-              <w:right w:val="single" w:sz="8" w:space="0" w:color="auto"/>
-            </w:tcBorders>
-            <w:vAlign w:val="center"/>
-          </w:tcPr>
-          <w:p>
-            <w:pPr>
-              <w:jc w:val="center"/>
-            </w:pPr>
-            <w:r>
-              <w:rPr>
-                <w:rFonts w:ascii="Times New Roman" w:hAnsi="Times New Roman"/>
-                <w:color w:val="000000" w:themeColor="text1"/>
-                <w:sz w:val="14"/>
-                <w:szCs w:val="14"/>
-              </w:rPr>
-              <w:t xml:space="preserve">Weekly</w:t>
-            </w:r>
-          </w:p>
-        </w:tc>
-        <w:tc>
-          <w:tcPr>
-            <w:tcW w:w="1206" w:type="dxa"/>
-            <w:tcBorders>
-              <w:top w:val="single" w:sz="8" w:space="0" w:color="auto"/>
-              <w:left w:val="single" w:sz="8" w:space="0" w:color="auto"/>
-              <w:bottom w:val="single" w:sz="8" w:space="0" w:color="auto"/>
-              <w:right w:val="single" w:sz="8" w:space="0" w:color="auto"/>
-            </w:tcBorders>
-            <w:vAlign w:val="center"/>
-          </w:tcPr>
-          <w:p>
-            <w:pPr>
-              <w:jc w:val="center"/>
-              <w:rPr>
-                <w:rFonts w:ascii="Times New Roman" w:hAnsi="Times New Roman"/>
-                <w:color w:val="000000" w:themeColor="text1"/>
-                <w:sz w:val="14"/>
-                <w:szCs w:val="14"/>
-              </w:rPr>
-            </w:pPr>
-            <w:r>
-              <w:rPr>
-                <w:rFonts w:ascii="Times New Roman" w:hAnsi="Times New Roman"/>
-                <w:color w:val="000000" w:themeColor="text1"/>
-                <w:sz w:val="14"/>
-                <w:szCs w:val="14"/>
+            </w:pPr>
+            <w:r>
+              <w:rPr>
+                <w:color w:val="000000" w:themeColor="text1"/>
+                <w:sz w:val="14"/>
+                <w:szCs w:val="14"/>
+                <w:rFonts w:ascii="Times New Roman" w:hAnsi="Times New Roman" w:cs="Times New Roman"/>
               </w:rPr>
               <w:t xml:space="preserve"> 25Aug26</w:t>
             </w:r>
@@ -5045,9 +5057,9 @@
             </w:pPr>
             <w:r>
               <w:rPr>
-                <w:rFonts w:ascii="Times New Roman" w:hAnsi="Times New Roman"/>
-                <w:sz w:val="14"/>
-                <w:szCs w:val="14"/>
+                <w:sz w:val="14"/>
+                <w:szCs w:val="14"/>
+                <w:rFonts w:ascii="Times New Roman" w:hAnsi="Times New Roman" w:cs="Times New Roman"/>
               </w:rPr>
               <w:t xml:space="preserve"> SMO</w:t>
             </w:r>
@@ -5071,21 +5083,52 @@
             </w:pPr>
             <w:r>
               <w:rPr>
+                <w:color w:val="000000" w:themeColor="text1"/>
+                <w:sz w:val="14"/>
+                <w:szCs w:val="14"/>
+                <w:rFonts w:ascii="Times New Roman" w:hAnsi="Times New Roman" w:cs="Times New Roman"/>
+              </w:rPr>
+              <w:t xml:space="preserve">Week on Testing Date</w:t>
+            </w:r>
+          </w:p>
+        </w:tc>
+        <w:tc>
+          <w:tcPr>
+            <w:tcW w:w="1419" w:type="dxa"/>
+            <w:tcBorders>
+              <w:top w:val="single" w:sz="8" w:space="0" w:color="auto"/>
+              <w:left w:val="nil"/>
+              <w:bottom w:val="single" w:sz="8" w:space="0" w:color="auto"/>
+              <w:right w:val="single" w:sz="8" w:space="0" w:color="auto"/>
+            </w:tcBorders>
+            <w:vAlign w:val="center"/>
+          </w:tcPr>
+          <w:p>
+            <w:pPr>
+              <w:jc w:val="center"/>
+              <w:rPr>
                 <w:rFonts w:ascii="Times New Roman" w:hAnsi="Times New Roman"/>
-                <w:color w:val="000000" w:themeColor="text1"/>
-                <w:sz w:val="14"/>
-                <w:szCs w:val="14"/>
-              </w:rPr>
-              <w:t xml:space="preserve">Week on Testing Date</w:t>
-            </w:r>
-          </w:p>
-        </w:tc>
-        <w:tc>
-          <w:tcPr>
-            <w:tcW w:w="1419" w:type="dxa"/>
-            <w:tcBorders>
-              <w:top w:val="single" w:sz="8" w:space="0" w:color="auto"/>
-              <w:left w:val="nil"/>
+                <w:sz w:val="14"/>
+                <w:szCs w:val="14"/>
+              </w:rPr>
+            </w:pPr>
+            <w:r>
+              <w:rPr>
+                <w:color w:val="000000" w:themeColor="text1"/>
+                <w:sz w:val="14"/>
+                <w:szCs w:val="14"/>
+                <w:rFonts w:ascii="Times New Roman" w:hAnsi="Times New Roman" w:cs="Times New Roman"/>
+              </w:rPr>
+              <w:t w:space="preserve" xml:space="preserve">No growth</w:t>
+            </w:r>
+          </w:p>
+        </w:tc>
+        <w:tc>
+          <w:tcPr>
+            <w:tcW w:w="1444" w:type="dxa"/>
+            <w:tcBorders>
+              <w:top w:val="single" w:sz="8" w:space="0" w:color="auto"/>
+              <w:left w:val="single" w:sz="8" w:space="0" w:color="auto"/>
               <w:bottom w:val="single" w:sz="8" w:space="0" w:color="auto"/>
               <w:right w:val="single" w:sz="8" w:space="0" w:color="auto"/>
             </w:tcBorders>
@@ -5102,41 +5145,10 @@
             </w:pPr>
             <w:r>
               <w:rPr>
-                <w:rFonts w:ascii="Times New Roman" w:hAnsi="Times New Roman"/>
-                <w:color w:val="000000" w:themeColor="text1"/>
-                <w:sz w:val="14"/>
-                <w:szCs w:val="14"/>
-              </w:rPr>
-              <w:t w:space="preserve" xml:space="preserve">No growth</w:t>
-            </w:r>
-          </w:p>
-        </w:tc>
-        <w:tc>
-          <w:tcPr>
-            <w:tcW w:w="1444" w:type="dxa"/>
-            <w:tcBorders>
-              <w:top w:val="single" w:sz="8" w:space="0" w:color="auto"/>
-              <w:left w:val="single" w:sz="8" w:space="0" w:color="auto"/>
-              <w:bottom w:val="single" w:sz="8" w:space="0" w:color="auto"/>
-              <w:right w:val="single" w:sz="8" w:space="0" w:color="auto"/>
-            </w:tcBorders>
-            <w:vAlign w:val="center"/>
-          </w:tcPr>
-          <w:p>
-            <w:pPr>
-              <w:jc w:val="center"/>
-              <w:rPr>
-                <w:rFonts w:ascii="Times New Roman" w:hAnsi="Times New Roman"/>
-                <w:sz w:val="14"/>
-                <w:szCs w:val="14"/>
-              </w:rPr>
-            </w:pPr>
-            <w:r>
-              <w:rPr>
-                <w:rFonts w:ascii="Times New Roman" w:hAnsi="Times New Roman"/>
-                <w:color w:val="000000" w:themeColor="text1"/>
-                <w:sz w:val="14"/>
-                <w:szCs w:val="14"/>
+                <w:color w:val="000000" w:themeColor="text1"/>
+                <w:sz w:val="14"/>
+                <w:szCs w:val="14"/>
+                <w:rFonts w:ascii="Times New Roman" w:hAnsi="Times New Roman" w:cs="Times New Roman"/>
               </w:rPr>
               <w:t w:space="preserve" xml:space="preserve">N/A</w:t>
             </w:r>
@@ -5165,40 +5177,40 @@
             </w:pPr>
             <w:r>
               <w:rPr>
+                <w:color w:val="000000" w:themeColor="text1"/>
+                <w:sz w:val="14"/>
+                <w:szCs w:val="14"/>
+                <w:rFonts w:ascii="Times New Roman" w:hAnsi="Times New Roman" w:cs="Times New Roman"/>
+              </w:rPr>
+              <w:t w:space="preserve" xml:space="preserve">N/A</w:t>
+            </w:r>
+          </w:p>
+        </w:tc>
+        <w:tc>
+          <w:tcPr>
+            <w:tcW w:w="460" w:type="dxa"/>
+            <w:tcBorders>
+              <w:top w:val="single" w:sz="8" w:space="0" w:color="auto"/>
+              <w:left w:val="nil"/>
+              <w:bottom w:val="single" w:sz="8" w:space="0" w:color="auto"/>
+              <w:right w:val="single" w:sz="8" w:space="0" w:color="auto"/>
+            </w:tcBorders>
+            <w:vAlign w:val="center"/>
+          </w:tcPr>
+          <w:p>
+            <w:pPr>
+              <w:jc w:val="center"/>
+              <w:rPr>
                 <w:rFonts w:ascii="Times New Roman" w:hAnsi="Times New Roman"/>
-                <w:color w:val="000000" w:themeColor="text1"/>
-                <w:sz w:val="14"/>
-                <w:szCs w:val="14"/>
-              </w:rPr>
-              <w:t w:space="preserve" xml:space="preserve">N/A</w:t>
-            </w:r>
-          </w:p>
-        </w:tc>
-        <w:tc>
-          <w:tcPr>
-            <w:tcW w:w="460" w:type="dxa"/>
-            <w:tcBorders>
-              <w:top w:val="single" w:sz="8" w:space="0" w:color="auto"/>
-              <w:left w:val="nil"/>
-              <w:bottom w:val="single" w:sz="8" w:space="0" w:color="auto"/>
-              <w:right w:val="single" w:sz="8" w:space="0" w:color="auto"/>
-            </w:tcBorders>
-            <w:vAlign w:val="center"/>
-          </w:tcPr>
-          <w:p>
-            <w:pPr>
-              <w:jc w:val="center"/>
-              <w:rPr>
-                <w:rFonts w:ascii="Times New Roman" w:hAnsi="Times New Roman"/>
-                <w:sz w:val="14"/>
-                <w:szCs w:val="14"/>
-              </w:rPr>
-            </w:pPr>
-            <w:r>
-              <w:rPr>
-                <w:rFonts w:ascii="Times New Roman" w:hAnsi="Times New Roman"/>
-                <w:sz w:val="14"/>
-                <w:szCs w:val="14"/>
+                <w:sz w:val="14"/>
+                <w:szCs w:val="14"/>
+              </w:rPr>
+            </w:pPr>
+            <w:r>
+              <w:rPr>
+                <w:sz w:val="14"/>
+                <w:szCs w:val="14"/>
+                <w:rFonts w:ascii="Times New Roman" w:hAnsi="Times New Roman" w:cs="Times New Roman"/>
               </w:rPr>
               <w:t>None</w:t>
             </w:r>

</xml_diff>

<commit_message>
feat(usp71): update OOS-262064 tables with confirmed organism Bacillus megaterium and dual-track EM records
</commit_message>
<xml_diff>
--- a/scratch/Tables OOS-262064 Blue Ocean Rx, LLC (E75110) - USP71.docx
+++ b/scratch/Tables OOS-262064 Blue Ocean Rx, LLC (E75110) - USP71.docx
@@ -75,7 +75,7 @@
           <w:szCs w:val="18"/>
           <w:u w:val="single"/>
         </w:rPr>
-        <w:t xml:space="preserve">ETX-260804-0335</w:t>
+        <w:t>ETX-260804-0335</w:t>
       </w:r>
       <w:r>
         <w:rPr>
@@ -117,6 +117,7 @@
       <w:tblPr>
         <w:tblStyle w:val="TableGrid"/>
         <w:tblW w:w="9340" w:type="dxa"/>
+        <w:jc w:val="center"/>
         <w:tblLayout w:type="fixed"/>
         <w:tblLook w:val="04A0" w:firstRow="1" w:lastRow="0" w:firstColumn="1" w:lastColumn="0" w:noHBand="0" w:noVBand="1"/>
       </w:tblPr>
@@ -154,7 +155,6 @@
                 <w:bCs/>
                 <w:sz w:val="14"/>
                 <w:szCs w:val="14"/>
-                <w:rFonts w:ascii="Times New Roman" w:hAnsi="Times New Roman" w:cs="Times New Roman"/>
               </w:rPr>
               <w:t>Processing</w:t>
             </w:r>
@@ -163,7 +163,6 @@
                 <w:bCs/>
                 <w:sz w:val="14"/>
                 <w:szCs w:val="14"/>
-                <w:rFonts w:ascii="Times New Roman" w:hAnsi="Times New Roman" w:cs="Times New Roman"/>
               </w:rPr>
               <w:t xml:space="preserve"> Analyst</w:t>
             </w:r>
@@ -181,14 +180,9 @@
             </w:pPr>
             <w:r>
               <w:rPr>
-                <w:rFonts w:ascii="Times New Roman" w:hAnsi="Times New Roman" w:cs="Times New Roman"/>
-              </w:rPr>
-            </w:r>
-            <w:r>
-              <w:rPr>
+                <w:rFonts w:ascii="Times New Roman" w:hAnsi="Times New Roman"/>
                 <w:b/>
                 <w:sz w:val="14"/>
-                <w:rFonts w:ascii="Times New Roman" w:hAnsi="Times New Roman" w:cs="Times New Roman"/>
               </w:rPr>
               <w:t>Reading Analyst</w:t>
             </w:r>
@@ -215,7 +209,6 @@
                 <w:bCs/>
                 <w:sz w:val="14"/>
                 <w:szCs w:val="14"/>
-                <w:rFonts w:ascii="Times New Roman" w:hAnsi="Times New Roman" w:cs="Times New Roman"/>
               </w:rPr>
               <w:t>Sample ID</w:t>
             </w:r>
@@ -242,7 +235,6 @@
                 <w:bCs/>
                 <w:sz w:val="14"/>
                 <w:szCs w:val="14"/>
-                <w:rFonts w:ascii="Times New Roman" w:hAnsi="Times New Roman" w:cs="Times New Roman"/>
               </w:rPr>
               <w:t>Related Microbial ID</w:t>
             </w:r>
@@ -269,7 +261,6 @@
                 <w:bCs/>
                 <w:sz w:val="14"/>
                 <w:szCs w:val="14"/>
-                <w:rFonts w:ascii="Times New Roman" w:hAnsi="Times New Roman" w:cs="Times New Roman"/>
               </w:rPr>
               <w:t>Media with microbial growth</w:t>
             </w:r>
@@ -296,7 +287,6 @@
                 <w:bCs/>
                 <w:sz w:val="14"/>
                 <w:szCs w:val="14"/>
-                <w:rFonts w:ascii="Times New Roman" w:hAnsi="Times New Roman" w:cs="Times New Roman"/>
               </w:rPr>
               <w:t>Microbial ID</w:t>
             </w:r>
@@ -326,11 +316,11 @@
             </w:pPr>
             <w:r>
               <w:rPr>
-                <w:sz w:val="14"/>
-                <w:szCs w:val="14"/>
-                <w:rFonts w:ascii="Times New Roman" w:hAnsi="Times New Roman" w:cs="Times New Roman"/>
-              </w:rPr>
-              <w:t xml:space="preserve">Pending</w:t>
+                <w:rFonts w:ascii="Times New Roman" w:hAnsi="Times New Roman"/>
+                <w:sz w:val="14"/>
+                <w:szCs w:val="14"/>
+              </w:rPr>
+              <w:t>Gabrielle Surber</w:t>
             </w:r>
           </w:p>
         </w:tc>
@@ -345,17 +335,20 @@
             </w:pPr>
             <w:r>
               <w:rPr>
-                <w:rFonts w:ascii="Times New Roman" w:hAnsi="Times New Roman" w:cs="Times New Roman"/>
-              </w:rPr>
-            </w:r>
-            <w:r>
-              <w:rPr>
-                <w:b w:val="0"/>
-                <w:sz w:val="14"/>
-                <w:rFonts w:ascii="Times New Roman" w:hAnsi="Times New Roman" w:cs="Times New Roman"/>
-              </w:rPr>
-              <w:t xml:space="preserve">Qiyue Chen</w:t>
-            </w:r>
+                <w:rFonts w:ascii="Times New Roman" w:hAnsi="Times New Roman"/>
+                <w:sz w:val="14"/>
+              </w:rPr>
+              <w:t xml:space="preserve">Elysse </w:t>
+            </w:r>
+            <w:proofErr w:type="spellStart"/>
+            <w:r>
+              <w:rPr>
+                <w:rFonts w:ascii="Times New Roman" w:hAnsi="Times New Roman"/>
+                <w:sz w:val="14"/>
+              </w:rPr>
+              <w:t>Nioupin</w:t>
+            </w:r>
+            <w:proofErr w:type="spellEnd"/>
           </w:p>
         </w:tc>
         <w:tc>
@@ -367,15 +360,15 @@
             <w:pPr>
               <w:jc w:val="center"/>
               <w:rPr>
-                <w:rFonts w:ascii="Times New Roman" w:hAnsi="Times New Roman" w:cs="Times New Roman"/>
-                <w:sz w:val="14"/>
-                <w:szCs w:val="14"/>
-              </w:rPr>
-            </w:pPr>
-            <w:hyperlink r:id="rId7" w:history="1">
+                <w:rFonts w:ascii="Times New Roman" w:hAnsi="Times New Roman"/>
+                <w:sz w:val="14"/>
+                <w:szCs w:val="14"/>
+              </w:rPr>
+            </w:pPr>
+            <w:hyperlink r:id="rId5" w:history="1">
               <w:r>
                 <w:rPr>
-                  <w:rFonts w:ascii="Times New Roman" w:hAnsi="Times New Roman" w:cs="Times New Roman"/>
+                  <w:rFonts w:ascii="Times New Roman" w:hAnsi="Times New Roman"/>
                   <w:color w:val="0000FF"/>
                   <w:sz w:val="14"/>
                   <w:szCs w:val="14"/>
@@ -395,15 +388,15 @@
             <w:pPr>
               <w:jc w:val="center"/>
               <w:rPr>
-                <w:rFonts w:ascii="Times New Roman" w:hAnsi="Times New Roman" w:cs="Times New Roman"/>
-                <w:sz w:val="14"/>
-                <w:szCs w:val="14"/>
-              </w:rPr>
-            </w:pPr>
-            <w:hyperlink r:id="rId8" w:history="1">
+                <w:rFonts w:ascii="Times New Roman" w:hAnsi="Times New Roman"/>
+                <w:sz w:val="14"/>
+                <w:szCs w:val="14"/>
+              </w:rPr>
+            </w:pPr>
+            <w:hyperlink r:id="rId6" w:history="1">
               <w:r>
                 <w:rPr>
-                  <w:rFonts w:ascii="Times New Roman" w:hAnsi="Times New Roman" w:cs="Times New Roman"/>
+                  <w:rFonts w:ascii="Times New Roman" w:hAnsi="Times New Roman"/>
                   <w:color w:val="0000FF"/>
                   <w:sz w:val="14"/>
                   <w:szCs w:val="14"/>
@@ -435,9 +428,8 @@
               <w:rPr>
                 <w:sz w:val="14"/>
                 <w:szCs w:val="14"/>
-                <w:rFonts w:ascii="Times New Roman" w:hAnsi="Times New Roman" w:cs="Times New Roman"/>
-              </w:rPr>
-              <w:t xml:space="preserve">1 x 100mL TSB bottle</w:t>
+              </w:rPr>
+              <w:t>1 x 100mL TSB bottle</w:t>
             </w:r>
           </w:p>
         </w:tc>
@@ -453,6 +445,8 @@
               <w:jc w:val="center"/>
               <w:rPr>
                 <w:rFonts w:eastAsiaTheme="minorEastAsia"/>
+                <w:i/>
+                <w:iCs/>
                 <w:sz w:val="14"/>
                 <w:szCs w:val="14"/>
                 <w:lang w:eastAsia="zh-CN"/>
@@ -460,11 +454,12 @@
             </w:pPr>
             <w:r>
               <w:rPr>
-                <w:sz w:val="14"/>
-                <w:szCs w:val="14"/>
-                <w:rFonts w:ascii="Times New Roman" w:hAnsi="Times New Roman" w:cs="Times New Roman"/>
-              </w:rPr>
-              <w:t xml:space="preserve">Pending</w:t>
+                <w:i/>
+                <w:iCs/>
+                <w:sz w:val="14"/>
+                <w:szCs w:val="14"/>
+              </w:rPr>
+              <w:t>Bacillus megaterium</w:t>
             </w:r>
           </w:p>
         </w:tc>
@@ -537,7 +532,7 @@
           <w:szCs w:val="18"/>
           <w:u w:val="single"/>
         </w:rPr>
-        <w:t xml:space="preserve">Processing</w:t>
+        <w:t>Processing</w:t>
       </w:r>
       <w:r>
         <w:rPr>
@@ -557,7 +552,7 @@
           <w:szCs w:val="18"/>
           <w:u w:val="single"/>
         </w:rPr>
-        <w:t xml:space="preserve">25Aug26</w:t>
+        <w:t>25Aug26</w:t>
       </w:r>
     </w:p>
     <w:tbl>
@@ -566,18 +561,18 @@
         <w:tblLook w:val="04A0" w:firstRow="1" w:lastRow="0" w:firstColumn="1" w:lastColumn="0" w:noHBand="0" w:noVBand="1"/>
       </w:tblPr>
       <w:tblGrid>
-        <w:gridCol w:w="991"/>
-        <w:gridCol w:w="115"/>
+        <w:gridCol w:w="990"/>
+        <w:gridCol w:w="128"/>
         <w:gridCol w:w="652"/>
-        <w:gridCol w:w="1129"/>
-        <w:gridCol w:w="999"/>
+        <w:gridCol w:w="1172"/>
+        <w:gridCol w:w="987"/>
+        <w:gridCol w:w="102"/>
+        <w:gridCol w:w="670"/>
+        <w:gridCol w:w="76"/>
+        <w:gridCol w:w="1337"/>
+        <w:gridCol w:w="1374"/>
+        <w:gridCol w:w="1291"/>
         <w:gridCol w:w="41"/>
-        <w:gridCol w:w="670"/>
-        <w:gridCol w:w="29"/>
-        <w:gridCol w:w="1415"/>
-        <w:gridCol w:w="1413"/>
-        <w:gridCol w:w="1353"/>
-        <w:gridCol w:w="13"/>
         <w:gridCol w:w="520"/>
       </w:tblGrid>
       <w:tr>
@@ -606,12 +601,12 @@
             </w:pPr>
             <w:r>
               <w:rPr>
+                <w:rFonts w:ascii="Times New Roman" w:hAnsi="Times New Roman"/>
                 <w:b/>
                 <w:bCs/>
                 <w:color w:val="000000" w:themeColor="text1"/>
                 <w:sz w:val="12"/>
                 <w:szCs w:val="12"/>
-                <w:rFonts w:ascii="Times New Roman" w:hAnsi="Times New Roman" w:cs="Times New Roman"/>
               </w:rPr>
               <w:t>Environmental Monitoring (EM) Sampling Site</w:t>
             </w:r>
@@ -640,12 +635,12 @@
             </w:pPr>
             <w:r>
               <w:rPr>
+                <w:rFonts w:ascii="Times New Roman" w:hAnsi="Times New Roman"/>
                 <w:b/>
                 <w:bCs/>
                 <w:color w:val="000000" w:themeColor="text1"/>
                 <w:sz w:val="12"/>
                 <w:szCs w:val="12"/>
-                <w:rFonts w:ascii="Times New Roman" w:hAnsi="Times New Roman" w:cs="Times New Roman"/>
               </w:rPr>
               <w:t>Frequency</w:t>
             </w:r>
@@ -673,12 +668,12 @@
             </w:pPr>
             <w:r>
               <w:rPr>
+                <w:rFonts w:ascii="Times New Roman" w:hAnsi="Times New Roman"/>
                 <w:b/>
                 <w:bCs/>
                 <w:color w:val="000000" w:themeColor="text1"/>
                 <w:sz w:val="12"/>
                 <w:szCs w:val="12"/>
-                <w:rFonts w:ascii="Times New Roman" w:hAnsi="Times New Roman" w:cs="Times New Roman"/>
               </w:rPr>
               <w:t>Date (DDMMMYY)</w:t>
             </w:r>
@@ -707,12 +702,12 @@
             </w:pPr>
             <w:r>
               <w:rPr>
+                <w:rFonts w:ascii="Times New Roman" w:hAnsi="Times New Roman"/>
                 <w:b/>
                 <w:bCs/>
                 <w:color w:val="000000" w:themeColor="text1"/>
                 <w:sz w:val="12"/>
                 <w:szCs w:val="12"/>
-                <w:rFonts w:ascii="Times New Roman" w:hAnsi="Times New Roman" w:cs="Times New Roman"/>
               </w:rPr>
               <w:t>Analyst (Initials)</w:t>
             </w:r>
@@ -740,12 +735,12 @@
             </w:pPr>
             <w:r>
               <w:rPr>
+                <w:rFonts w:ascii="Times New Roman" w:hAnsi="Times New Roman"/>
                 <w:b/>
                 <w:bCs/>
                 <w:color w:val="000000" w:themeColor="text1"/>
                 <w:sz w:val="12"/>
                 <w:szCs w:val="12"/>
-                <w:rFonts w:ascii="Times New Roman" w:hAnsi="Times New Roman" w:cs="Times New Roman"/>
               </w:rPr>
               <w:t>Day /Week(s)</w:t>
             </w:r>
@@ -774,12 +769,12 @@
             </w:pPr>
             <w:r>
               <w:rPr>
+                <w:rFonts w:ascii="Times New Roman" w:hAnsi="Times New Roman"/>
                 <w:b/>
                 <w:bCs/>
                 <w:color w:val="000000" w:themeColor="text1"/>
                 <w:sz w:val="12"/>
                 <w:szCs w:val="12"/>
-                <w:rFonts w:ascii="Times New Roman" w:hAnsi="Times New Roman" w:cs="Times New Roman"/>
               </w:rPr>
               <w:t>Observation*</w:t>
             </w:r>
@@ -807,12 +802,12 @@
             </w:pPr>
             <w:r>
               <w:rPr>
+                <w:rFonts w:ascii="Times New Roman" w:hAnsi="Times New Roman"/>
                 <w:b/>
                 <w:bCs/>
                 <w:color w:val="000000" w:themeColor="text1"/>
                 <w:sz w:val="12"/>
                 <w:szCs w:val="12"/>
-                <w:rFonts w:ascii="Times New Roman" w:hAnsi="Times New Roman" w:cs="Times New Roman"/>
               </w:rPr>
               <w:t>Environmental Monitoring Plate ETX ID</w:t>
             </w:r>
@@ -840,12 +835,12 @@
             </w:pPr>
             <w:r>
               <w:rPr>
+                <w:rFonts w:ascii="Times New Roman" w:hAnsi="Times New Roman"/>
                 <w:b/>
                 <w:bCs/>
                 <w:color w:val="000000" w:themeColor="text1"/>
                 <w:sz w:val="12"/>
                 <w:szCs w:val="12"/>
-                <w:rFonts w:ascii="Times New Roman" w:hAnsi="Times New Roman" w:cs="Times New Roman"/>
               </w:rPr>
               <w:t>Microbial ID</w:t>
             </w:r>
@@ -874,12 +869,12 @@
             </w:pPr>
             <w:r>
               <w:rPr>
+                <w:rFonts w:ascii="Times New Roman" w:hAnsi="Times New Roman"/>
                 <w:b/>
                 <w:bCs/>
                 <w:color w:val="000000" w:themeColor="text1"/>
                 <w:sz w:val="12"/>
                 <w:szCs w:val="12"/>
-                <w:rFonts w:ascii="Times New Roman" w:hAnsi="Times New Roman" w:cs="Times New Roman"/>
               </w:rPr>
               <w:t xml:space="preserve">Notes </w:t>
             </w:r>
@@ -910,12 +905,12 @@
           <w:p>
             <w:r>
               <w:rPr>
+                <w:rFonts w:ascii="Times New Roman" w:hAnsi="Times New Roman"/>
                 <w:b/>
                 <w:bCs/>
                 <w:color w:val="000000" w:themeColor="text1"/>
                 <w:sz w:val="14"/>
                 <w:szCs w:val="14"/>
-                <w:rFonts w:ascii="Times New Roman" w:hAnsi="Times New Roman" w:cs="Times New Roman"/>
               </w:rPr>
               <w:t xml:space="preserve"> Personnel EM Bracketing</w:t>
             </w:r>
@@ -948,10 +943,10 @@
             </w:pPr>
             <w:r>
               <w:rPr>
-                <w:color w:val="000000" w:themeColor="text1"/>
-                <w:sz w:val="14"/>
-                <w:szCs w:val="14"/>
-                <w:rFonts w:ascii="Times New Roman" w:hAnsi="Times New Roman" w:cs="Times New Roman"/>
+                <w:rFonts w:ascii="Times New Roman" w:hAnsi="Times New Roman"/>
+                <w:color w:val="000000" w:themeColor="text1"/>
+                <w:sz w:val="14"/>
+                <w:szCs w:val="14"/>
               </w:rPr>
               <w:t>Personnel (Left Touch and Right Touch)</w:t>
             </w:r>
@@ -980,12 +975,12 @@
             </w:pPr>
             <w:r>
               <w:rPr>
-                <w:color w:val="000000" w:themeColor="text1"/>
-                <w:sz w:val="14"/>
-                <w:szCs w:val="14"/>
-                <w:rFonts w:ascii="Times New Roman" w:hAnsi="Times New Roman" w:cs="Times New Roman"/>
-              </w:rPr>
-              <w:t xml:space="preserve">Daily</w:t>
+                <w:rFonts w:ascii="Times New Roman" w:hAnsi="Times New Roman"/>
+                <w:color w:val="000000" w:themeColor="text1"/>
+                <w:sz w:val="14"/>
+                <w:szCs w:val="14"/>
+              </w:rPr>
+              <w:t>Daily</w:t>
             </w:r>
           </w:p>
         </w:tc>
@@ -1007,22 +1002,40 @@
           </w:tcPr>
           <w:p>
             <w:pPr>
-              <w:rPr>
-                <w:rFonts w:ascii="Times New Roman" w:hAnsi="Times New Roman"/>
-                <w:color w:val="000000" w:themeColor="text1"/>
-                <w:sz w:val="14"/>
-                <w:szCs w:val="14"/>
-              </w:rPr>
-              <w:jc w:val="center"/>
-            </w:pPr>
-            <w:r>
-              <w:rPr>
-                <w:color w:val="000000" w:themeColor="text1"/>
-                <w:sz w:val="14"/>
-                <w:szCs w:val="14"/>
-                <w:rFonts w:ascii="Times New Roman" w:hAnsi="Times New Roman" w:cs="Times New Roman"/>
-              </w:rPr>
-              <w:t w:space="preserve" xml:space="preserve">24Aug26</w:t>
+              <w:jc w:val="center"/>
+              <w:rPr>
+                <w:rFonts w:ascii="Times New Roman" w:hAnsi="Times New Roman"/>
+                <w:color w:val="000000" w:themeColor="text1"/>
+                <w:sz w:val="14"/>
+                <w:szCs w:val="14"/>
+              </w:rPr>
+            </w:pPr>
+            <w:r>
+              <w:rPr>
+                <w:rFonts w:ascii="Times New Roman" w:hAnsi="Times New Roman"/>
+                <w:color w:val="000000" w:themeColor="text1"/>
+                <w:sz w:val="14"/>
+                <w:szCs w:val="14"/>
+              </w:rPr>
+              <w:t>2</w:t>
+            </w:r>
+            <w:r>
+              <w:rPr>
+                <w:rFonts w:ascii="Times New Roman" w:hAnsi="Times New Roman"/>
+                <w:color w:val="000000" w:themeColor="text1"/>
+                <w:sz w:val="14"/>
+                <w:szCs w:val="14"/>
+              </w:rPr>
+              <w:t>1</w:t>
+            </w:r>
+            <w:r>
+              <w:rPr>
+                <w:rFonts w:ascii="Times New Roman" w:hAnsi="Times New Roman"/>
+                <w:color w:val="000000" w:themeColor="text1"/>
+                <w:sz w:val="14"/>
+                <w:szCs w:val="14"/>
+              </w:rPr>
+              <w:t>Aug26</w:t>
             </w:r>
           </w:p>
         </w:tc>
@@ -1055,12 +1068,12 @@
             </w:pPr>
             <w:r>
               <w:rPr>
-                <w:color w:val="000000" w:themeColor="text1"/>
-                <w:sz w:val="14"/>
-                <w:szCs w:val="14"/>
-                <w:rFonts w:ascii="Times New Roman" w:hAnsi="Times New Roman" w:cs="Times New Roman"/>
-              </w:rPr>
-              <w:t w:space="preserve" xml:space="preserve">Pending</w:t>
+                <w:rFonts w:ascii="Times New Roman" w:hAnsi="Times New Roman"/>
+                <w:color w:val="000000" w:themeColor="text1"/>
+                <w:sz w:val="14"/>
+                <w:szCs w:val="14"/>
+              </w:rPr>
+              <w:t>GS</w:t>
             </w:r>
           </w:p>
         </w:tc>
@@ -1086,12 +1099,12 @@
             </w:pPr>
             <w:r>
               <w:rPr>
-                <w:color w:val="000000" w:themeColor="text1"/>
-                <w:sz w:val="14"/>
-                <w:szCs w:val="14"/>
-                <w:rFonts w:ascii="Times New Roman" w:hAnsi="Times New Roman" w:cs="Times New Roman"/>
-              </w:rPr>
-              <w:t xml:space="preserve">Date Before Testing</w:t>
+                <w:rFonts w:ascii="Times New Roman" w:hAnsi="Times New Roman"/>
+                <w:color w:val="000000" w:themeColor="text1"/>
+                <w:sz w:val="14"/>
+                <w:szCs w:val="14"/>
+              </w:rPr>
+              <w:t>Date Before Testing</w:t>
             </w:r>
           </w:p>
         </w:tc>
@@ -1124,12 +1137,12 @@
             </w:pPr>
             <w:r>
               <w:rPr>
-                <w:color w:val="000000" w:themeColor="text1"/>
-                <w:sz w:val="14"/>
-                <w:szCs w:val="14"/>
-                <w:rFonts w:ascii="Times New Roman" w:hAnsi="Times New Roman" w:cs="Times New Roman"/>
-              </w:rPr>
-              <w:t w:space="preserve" xml:space="preserve">No growth</w:t>
+                <w:rFonts w:ascii="Times New Roman" w:hAnsi="Times New Roman"/>
+                <w:color w:val="000000" w:themeColor="text1"/>
+                <w:sz w:val="14"/>
+                <w:szCs w:val="14"/>
+              </w:rPr>
+              <w:t>No growth</w:t>
             </w:r>
           </w:p>
         </w:tc>
@@ -1152,48 +1165,12 @@
           <w:p>
             <w:r>
               <w:rPr>
-                <w:color w:val="000000" w:themeColor="text1"/>
-                <w:sz w:val="14"/>
-                <w:szCs w:val="14"/>
-                <w:rFonts w:ascii="Times New Roman" w:hAnsi="Times New Roman" w:cs="Times New Roman"/>
-              </w:rPr>
-              <w:t xml:space="preserve" w:space="preserve">N/A</w:t>
-            </w:r>
-            <w:r>
-              <w:rPr>
-                <w:color w:val="000000" w:themeColor="text1"/>
-                <w:sz w:val="14"/>
-                <w:szCs w:val="14"/>
-                <w:rFonts w:ascii="Times New Roman" w:hAnsi="Times New Roman" w:cs="Times New Roman"/>
-              </w:rPr>
-              <w:t/>
-            </w:r>
-            <w:r>
-              <w:rPr>
-                <w:color w:val="000000" w:themeColor="text1"/>
-                <w:sz w:val="14"/>
-                <w:szCs w:val="14"/>
-                <w:rFonts w:ascii="Times New Roman" w:hAnsi="Times New Roman" w:cs="Times New Roman"/>
-              </w:rPr>
-              <w:t/>
-            </w:r>
-            <w:r>
-              <w:rPr>
-                <w:color w:val="000000" w:themeColor="text1"/>
-                <w:sz w:val="14"/>
-                <w:szCs w:val="14"/>
-                <w:rFonts w:ascii="Times New Roman" w:hAnsi="Times New Roman" w:cs="Times New Roman"/>
-              </w:rPr>
-              <w:t/>
-            </w:r>
-            <w:r>
-              <w:rPr>
-                <w:color w:val="000000" w:themeColor="text1"/>
-                <w:sz w:val="14"/>
-                <w:szCs w:val="14"/>
-                <w:rFonts w:ascii="Times New Roman" w:hAnsi="Times New Roman" w:cs="Times New Roman"/>
-              </w:rPr>
-              <w:t xml:space="preserve"/>
+                <w:rFonts w:ascii="Times New Roman" w:hAnsi="Times New Roman"/>
+                <w:color w:val="000000" w:themeColor="text1"/>
+                <w:sz w:val="14"/>
+                <w:szCs w:val="14"/>
+              </w:rPr>
+              <w:t>N/A</w:t>
             </w:r>
           </w:p>
         </w:tc>
@@ -1216,48 +1193,12 @@
           <w:p>
             <w:r>
               <w:rPr>
-                <w:color w:val="000000" w:themeColor="text1"/>
-                <w:sz w:val="14"/>
-                <w:szCs w:val="14"/>
-                <w:rFonts w:ascii="Times New Roman" w:hAnsi="Times New Roman" w:cs="Times New Roman"/>
-              </w:rPr>
-              <w:t xml:space="preserve" w:space="preserve">N/A</w:t>
-            </w:r>
-            <w:r>
-              <w:rPr>
-                <w:color w:val="000000" w:themeColor="text1"/>
-                <w:sz w:val="14"/>
-                <w:szCs w:val="14"/>
-                <w:rFonts w:ascii="Times New Roman" w:hAnsi="Times New Roman" w:cs="Times New Roman"/>
-              </w:rPr>
-              <w:t/>
-            </w:r>
-            <w:r>
-              <w:rPr>
-                <w:color w:val="000000" w:themeColor="text1"/>
-                <w:sz w:val="14"/>
-                <w:szCs w:val="14"/>
-                <w:rFonts w:ascii="Times New Roman" w:hAnsi="Times New Roman" w:cs="Times New Roman"/>
-              </w:rPr>
-              <w:t/>
-            </w:r>
-            <w:r>
-              <w:rPr>
-                <w:color w:val="000000" w:themeColor="text1"/>
-                <w:sz w:val="14"/>
-                <w:szCs w:val="14"/>
-                <w:rFonts w:ascii="Times New Roman" w:hAnsi="Times New Roman" w:cs="Times New Roman"/>
-              </w:rPr>
-              <w:t/>
-            </w:r>
-            <w:r>
-              <w:rPr>
-                <w:color w:val="000000" w:themeColor="text1"/>
-                <w:sz w:val="14"/>
-                <w:szCs w:val="14"/>
-                <w:rFonts w:ascii="Times New Roman" w:hAnsi="Times New Roman" w:cs="Times New Roman"/>
-              </w:rPr>
-              <w:t xml:space="preserve"/>
+                <w:rFonts w:ascii="Times New Roman" w:hAnsi="Times New Roman"/>
+                <w:color w:val="000000" w:themeColor="text1"/>
+                <w:sz w:val="14"/>
+                <w:szCs w:val="14"/>
+              </w:rPr>
+              <w:t>N/A</w:t>
             </w:r>
           </w:p>
         </w:tc>
@@ -1290,10 +1231,10 @@
             </w:pPr>
             <w:r>
               <w:rPr>
-                <w:color w:val="000000" w:themeColor="text1"/>
-                <w:sz w:val="14"/>
-                <w:szCs w:val="14"/>
-                <w:rFonts w:ascii="Times New Roman" w:hAnsi="Times New Roman" w:cs="Times New Roman"/>
+                <w:rFonts w:ascii="Times New Roman" w:hAnsi="Times New Roman"/>
+                <w:color w:val="000000" w:themeColor="text1"/>
+                <w:sz w:val="14"/>
+                <w:szCs w:val="14"/>
               </w:rPr>
               <w:t xml:space="preserve">None </w:t>
             </w:r>
@@ -1326,10 +1267,10 @@
             </w:pPr>
             <w:r>
               <w:rPr>
-                <w:color w:val="000000" w:themeColor="text1"/>
-                <w:sz w:val="14"/>
-                <w:szCs w:val="14"/>
-                <w:rFonts w:ascii="Times New Roman" w:hAnsi="Times New Roman" w:cs="Times New Roman"/>
+                <w:rFonts w:ascii="Times New Roman" w:hAnsi="Times New Roman"/>
+                <w:color w:val="000000" w:themeColor="text1"/>
+                <w:sz w:val="14"/>
+                <w:szCs w:val="14"/>
               </w:rPr>
               <w:t>Personnel (Left Touch and Right Touch)</w:t>
             </w:r>
@@ -1358,12 +1299,12 @@
             </w:pPr>
             <w:r>
               <w:rPr>
-                <w:color w:val="000000" w:themeColor="text1"/>
-                <w:sz w:val="14"/>
-                <w:szCs w:val="14"/>
-                <w:rFonts w:ascii="Times New Roman" w:hAnsi="Times New Roman" w:cs="Times New Roman"/>
-              </w:rPr>
-              <w:t xml:space="preserve">Daily</w:t>
+                <w:rFonts w:ascii="Times New Roman" w:hAnsi="Times New Roman"/>
+                <w:color w:val="000000" w:themeColor="text1"/>
+                <w:sz w:val="14"/>
+                <w:szCs w:val="14"/>
+              </w:rPr>
+              <w:t>Daily</w:t>
             </w:r>
           </w:p>
         </w:tc>
@@ -1395,21 +1336,12 @@
             </w:pPr>
             <w:r>
               <w:rPr>
-                <w:color w:val="000000" w:themeColor="text1"/>
-                <w:sz w:val="14"/>
-                <w:szCs w:val="14"/>
-                <w:rFonts w:ascii="Times New Roman" w:hAnsi="Times New Roman" w:cs="Times New Roman"/>
-              </w:rPr>
-              <w:t xml:space="preserve" w:space="preserve"> 25Aug26</w:t>
-            </w:r>
-            <w:r>
-              <w:rPr>
-                <w:color w:val="000000" w:themeColor="text1"/>
-                <w:sz w:val="14"/>
-                <w:szCs w:val="14"/>
-                <w:rFonts w:ascii="Times New Roman" w:hAnsi="Times New Roman" w:cs="Times New Roman"/>
-              </w:rPr>
-              <w:t/>
+                <w:rFonts w:ascii="Times New Roman" w:hAnsi="Times New Roman"/>
+                <w:color w:val="000000" w:themeColor="text1"/>
+                <w:sz w:val="14"/>
+                <w:szCs w:val="14"/>
+              </w:rPr>
+              <w:t xml:space="preserve"> 25Aug26</w:t>
             </w:r>
           </w:p>
         </w:tc>
@@ -1443,21 +1375,12 @@
             <w:bookmarkStart w:id="0" w:name="OLE_LINK3"/>
             <w:r>
               <w:rPr>
-                <w:color w:val="000000" w:themeColor="text1"/>
-                <w:sz w:val="14"/>
-                <w:szCs w:val="14"/>
-                <w:rFonts w:ascii="Times New Roman" w:hAnsi="Times New Roman" w:cs="Times New Roman"/>
-              </w:rPr>
-              <w:t w:space="preserve" xml:space="preserve">Pending </w:t>
-            </w:r>
-            <w:r>
-              <w:rPr>
-                <w:color w:val="000000" w:themeColor="text1"/>
-                <w:sz w:val="14"/>
-                <w:szCs w:val="14"/>
-                <w:rFonts w:ascii="Times New Roman" w:hAnsi="Times New Roman" w:cs="Times New Roman"/>
-              </w:rPr>
-              <w:t xml:space="preserve"/>
+                <w:rFonts w:ascii="Times New Roman" w:hAnsi="Times New Roman"/>
+                <w:color w:val="000000" w:themeColor="text1"/>
+                <w:sz w:val="14"/>
+                <w:szCs w:val="14"/>
+              </w:rPr>
+              <w:t xml:space="preserve">GS </w:t>
             </w:r>
             <w:bookmarkEnd w:id="0"/>
           </w:p>
@@ -1484,12 +1407,12 @@
             </w:pPr>
             <w:r>
               <w:rPr>
-                <w:color w:val="000000" w:themeColor="text1"/>
-                <w:sz w:val="14"/>
-                <w:szCs w:val="14"/>
-                <w:rFonts w:ascii="Times New Roman" w:hAnsi="Times New Roman" w:cs="Times New Roman"/>
-              </w:rPr>
-              <w:t xml:space="preserve">Date of Testing</w:t>
+                <w:rFonts w:ascii="Times New Roman" w:hAnsi="Times New Roman"/>
+                <w:color w:val="000000" w:themeColor="text1"/>
+                <w:sz w:val="14"/>
+                <w:szCs w:val="14"/>
+              </w:rPr>
+              <w:t>Date of Testing</w:t>
             </w:r>
           </w:p>
         </w:tc>
@@ -1522,12 +1445,12 @@
             </w:pPr>
             <w:r>
               <w:rPr>
-                <w:color w:val="000000" w:themeColor="text1"/>
-                <w:sz w:val="14"/>
-                <w:szCs w:val="14"/>
-                <w:rFonts w:ascii="Times New Roman" w:hAnsi="Times New Roman" w:cs="Times New Roman"/>
-              </w:rPr>
-              <w:t w:space="preserve" xml:space="preserve">No growth</w:t>
+                <w:rFonts w:ascii="Times New Roman" w:hAnsi="Times New Roman"/>
+                <w:color w:val="000000" w:themeColor="text1"/>
+                <w:sz w:val="14"/>
+                <w:szCs w:val="14"/>
+              </w:rPr>
+              <w:t>No growth</w:t>
             </w:r>
           </w:p>
         </w:tc>
@@ -1558,30 +1481,12 @@
             </w:pPr>
             <w:r>
               <w:rPr>
-                <w:color w:val="000000" w:themeColor="text1"/>
-                <w:sz w:val="14"/>
-                <w:szCs w:val="14"/>
-                <w:rFonts w:ascii="Times New Roman" w:hAnsi="Times New Roman" w:cs="Times New Roman"/>
-              </w:rPr>
-              <w:t w:space="preserve" xml:space="preserve">N/A</w:t>
-            </w:r>
-            <w:r>
-              <w:rPr>
-                <w:color w:val="000000" w:themeColor="text1"/>
-                <w:sz w:val="14"/>
-                <w:szCs w:val="14"/>
-                <w:rFonts w:ascii="Times New Roman" w:hAnsi="Times New Roman" w:cs="Times New Roman"/>
-              </w:rPr>
-              <w:t/>
-            </w:r>
-            <w:r>
-              <w:rPr>
-                <w:color w:val="000000" w:themeColor="text1"/>
-                <w:sz w:val="14"/>
-                <w:szCs w:val="14"/>
-                <w:rFonts w:ascii="Times New Roman" w:hAnsi="Times New Roman" w:cs="Times New Roman"/>
-              </w:rPr>
-              <w:t xml:space="preserve"/>
+                <w:rFonts w:ascii="Times New Roman" w:hAnsi="Times New Roman"/>
+                <w:color w:val="000000" w:themeColor="text1"/>
+                <w:sz w:val="14"/>
+                <w:szCs w:val="14"/>
+              </w:rPr>
+              <w:t>N/A</w:t>
             </w:r>
           </w:p>
         </w:tc>
@@ -1612,30 +1517,12 @@
             </w:pPr>
             <w:r>
               <w:rPr>
-                <w:color w:val="000000" w:themeColor="text1"/>
-                <w:sz w:val="14"/>
-                <w:szCs w:val="14"/>
-                <w:rFonts w:ascii="Times New Roman" w:hAnsi="Times New Roman" w:cs="Times New Roman"/>
-              </w:rPr>
-              <w:t w:space="preserve" xml:space="preserve">N/A</w:t>
-            </w:r>
-            <w:r>
-              <w:rPr>
-                <w:color w:val="000000" w:themeColor="text1"/>
-                <w:sz w:val="14"/>
-                <w:szCs w:val="14"/>
-                <w:rFonts w:ascii="Times New Roman" w:hAnsi="Times New Roman" w:cs="Times New Roman"/>
-              </w:rPr>
-              <w:t/>
-            </w:r>
-            <w:r>
-              <w:rPr>
-                <w:color w:val="000000" w:themeColor="text1"/>
-                <w:sz w:val="14"/>
-                <w:szCs w:val="14"/>
-                <w:rFonts w:ascii="Times New Roman" w:hAnsi="Times New Roman" w:cs="Times New Roman"/>
-              </w:rPr>
-              <w:t xml:space="preserve"/>
+                <w:rFonts w:ascii="Times New Roman" w:hAnsi="Times New Roman"/>
+                <w:color w:val="000000" w:themeColor="text1"/>
+                <w:sz w:val="14"/>
+                <w:szCs w:val="14"/>
+              </w:rPr>
+              <w:t>N/A</w:t>
             </w:r>
           </w:p>
         </w:tc>
@@ -1668,10 +1555,10 @@
             </w:pPr>
             <w:r>
               <w:rPr>
-                <w:color w:val="000000" w:themeColor="text1"/>
-                <w:sz w:val="14"/>
-                <w:szCs w:val="14"/>
-                <w:rFonts w:ascii="Times New Roman" w:hAnsi="Times New Roman" w:cs="Times New Roman"/>
+                <w:rFonts w:ascii="Times New Roman" w:hAnsi="Times New Roman"/>
+                <w:color w:val="000000" w:themeColor="text1"/>
+                <w:sz w:val="14"/>
+                <w:szCs w:val="14"/>
               </w:rPr>
               <w:t xml:space="preserve"> None</w:t>
             </w:r>
@@ -1704,10 +1591,10 @@
             </w:pPr>
             <w:r>
               <w:rPr>
-                <w:color w:val="000000" w:themeColor="text1"/>
-                <w:sz w:val="14"/>
-                <w:szCs w:val="14"/>
-                <w:rFonts w:ascii="Times New Roman" w:hAnsi="Times New Roman" w:cs="Times New Roman"/>
+                <w:rFonts w:ascii="Times New Roman" w:hAnsi="Times New Roman"/>
+                <w:color w:val="000000" w:themeColor="text1"/>
+                <w:sz w:val="14"/>
+                <w:szCs w:val="14"/>
               </w:rPr>
               <w:t>Personnel (Left Touch and Right Touch)</w:t>
             </w:r>
@@ -1736,12 +1623,12 @@
             </w:pPr>
             <w:r>
               <w:rPr>
-                <w:color w:val="000000" w:themeColor="text1"/>
-                <w:sz w:val="14"/>
-                <w:szCs w:val="14"/>
-                <w:rFonts w:ascii="Times New Roman" w:hAnsi="Times New Roman" w:cs="Times New Roman"/>
-              </w:rPr>
-              <w:t xml:space="preserve">Daily</w:t>
+                <w:rFonts w:ascii="Times New Roman" w:hAnsi="Times New Roman"/>
+                <w:color w:val="000000" w:themeColor="text1"/>
+                <w:sz w:val="14"/>
+                <w:szCs w:val="14"/>
+              </w:rPr>
+              <w:t>Daily</w:t>
             </w:r>
           </w:p>
         </w:tc>
@@ -1773,21 +1660,12 @@
             </w:pPr>
             <w:r>
               <w:rPr>
-                <w:color w:val="000000" w:themeColor="text1"/>
-                <w:sz w:val="14"/>
-                <w:szCs w:val="14"/>
-                <w:rFonts w:ascii="Times New Roman" w:hAnsi="Times New Roman" w:cs="Times New Roman"/>
-              </w:rPr>
-              <w:t xml:space="preserve" w:space="preserve"> 26Aug26</w:t>
-            </w:r>
-            <w:r>
-              <w:rPr>
-                <w:color w:val="000000" w:themeColor="text1"/>
-                <w:sz w:val="14"/>
-                <w:szCs w:val="14"/>
-                <w:rFonts w:ascii="Times New Roman" w:hAnsi="Times New Roman" w:cs="Times New Roman"/>
-              </w:rPr>
-              <w:t/>
+                <w:rFonts w:ascii="Times New Roman" w:hAnsi="Times New Roman"/>
+                <w:color w:val="000000" w:themeColor="text1"/>
+                <w:sz w:val="14"/>
+                <w:szCs w:val="14"/>
+              </w:rPr>
+              <w:t xml:space="preserve"> 26Aug26</w:t>
             </w:r>
           </w:p>
         </w:tc>
@@ -1820,21 +1698,12 @@
             </w:pPr>
             <w:r>
               <w:rPr>
-                <w:color w:val="000000" w:themeColor="text1"/>
-                <w:sz w:val="14"/>
-                <w:szCs w:val="14"/>
-                <w:rFonts w:ascii="Times New Roman" w:hAnsi="Times New Roman" w:cs="Times New Roman"/>
-              </w:rPr>
-              <w:t w:space="preserve" xml:space="preserve">Pending </w:t>
-            </w:r>
-            <w:r>
-              <w:rPr>
-                <w:color w:val="000000" w:themeColor="text1"/>
-                <w:sz w:val="14"/>
-                <w:szCs w:val="14"/>
-                <w:rFonts w:ascii="Times New Roman" w:hAnsi="Times New Roman" w:cs="Times New Roman"/>
-              </w:rPr>
-              <w:t xml:space="preserve"/>
+                <w:rFonts w:ascii="Times New Roman" w:hAnsi="Times New Roman"/>
+                <w:color w:val="000000" w:themeColor="text1"/>
+                <w:sz w:val="14"/>
+                <w:szCs w:val="14"/>
+              </w:rPr>
+              <w:t xml:space="preserve">GS </w:t>
             </w:r>
           </w:p>
         </w:tc>
@@ -1860,12 +1729,12 @@
             </w:pPr>
             <w:r>
               <w:rPr>
-                <w:color w:val="000000" w:themeColor="text1"/>
-                <w:sz w:val="14"/>
-                <w:szCs w:val="14"/>
-                <w:rFonts w:ascii="Times New Roman" w:hAnsi="Times New Roman" w:cs="Times New Roman"/>
-              </w:rPr>
-              <w:t xml:space="preserve">Date After Testing</w:t>
+                <w:rFonts w:ascii="Times New Roman" w:hAnsi="Times New Roman"/>
+                <w:color w:val="000000" w:themeColor="text1"/>
+                <w:sz w:val="14"/>
+                <w:szCs w:val="14"/>
+              </w:rPr>
+              <w:t>Date After Testing</w:t>
             </w:r>
           </w:p>
         </w:tc>
@@ -1898,12 +1767,12 @@
             </w:pPr>
             <w:r>
               <w:rPr>
-                <w:color w:val="000000" w:themeColor="text1"/>
-                <w:sz w:val="14"/>
-                <w:szCs w:val="14"/>
-                <w:rFonts w:ascii="Times New Roman" w:hAnsi="Times New Roman" w:cs="Times New Roman"/>
-              </w:rPr>
-              <w:t w:space="preserve" xml:space="preserve">No growth</w:t>
+                <w:rFonts w:ascii="Times New Roman" w:hAnsi="Times New Roman"/>
+                <w:color w:val="000000" w:themeColor="text1"/>
+                <w:sz w:val="14"/>
+                <w:szCs w:val="14"/>
+              </w:rPr>
+              <w:t>No growth</w:t>
             </w:r>
           </w:p>
         </w:tc>
@@ -1926,48 +1795,12 @@
           <w:p>
             <w:r>
               <w:rPr>
-                <w:color w:val="000000" w:themeColor="text1"/>
-                <w:sz w:val="14"/>
-                <w:szCs w:val="14"/>
-                <w:rFonts w:ascii="Times New Roman" w:hAnsi="Times New Roman" w:cs="Times New Roman"/>
-              </w:rPr>
-              <w:t xml:space="preserve" w:space="preserve">N/A</w:t>
-            </w:r>
-            <w:r>
-              <w:rPr>
-                <w:color w:val="000000" w:themeColor="text1"/>
-                <w:sz w:val="14"/>
-                <w:szCs w:val="14"/>
-                <w:rFonts w:ascii="Times New Roman" w:hAnsi="Times New Roman" w:cs="Times New Roman"/>
-              </w:rPr>
-              <w:t/>
-            </w:r>
-            <w:r>
-              <w:rPr>
-                <w:color w:val="000000" w:themeColor="text1"/>
-                <w:sz w:val="14"/>
-                <w:szCs w:val="14"/>
-                <w:rFonts w:ascii="Times New Roman" w:hAnsi="Times New Roman" w:cs="Times New Roman"/>
-              </w:rPr>
-              <w:t/>
-            </w:r>
-            <w:r>
-              <w:rPr>
-                <w:color w:val="000000" w:themeColor="text1"/>
-                <w:sz w:val="14"/>
-                <w:szCs w:val="14"/>
-                <w:rFonts w:ascii="Times New Roman" w:hAnsi="Times New Roman" w:cs="Times New Roman"/>
-              </w:rPr>
-              <w:t/>
-            </w:r>
-            <w:r>
-              <w:rPr>
-                <w:color w:val="000000" w:themeColor="text1"/>
-                <w:sz w:val="14"/>
-                <w:szCs w:val="14"/>
-                <w:rFonts w:ascii="Times New Roman" w:hAnsi="Times New Roman" w:cs="Times New Roman"/>
-              </w:rPr>
-              <w:t xml:space="preserve"/>
+                <w:rFonts w:ascii="Times New Roman" w:hAnsi="Times New Roman"/>
+                <w:color w:val="000000" w:themeColor="text1"/>
+                <w:sz w:val="14"/>
+                <w:szCs w:val="14"/>
+              </w:rPr>
+              <w:t>N/A</w:t>
             </w:r>
           </w:p>
         </w:tc>
@@ -1990,48 +1823,12 @@
           <w:p>
             <w:r>
               <w:rPr>
-                <w:color w:val="000000" w:themeColor="text1"/>
-                <w:sz w:val="14"/>
-                <w:szCs w:val="14"/>
-                <w:rFonts w:ascii="Times New Roman" w:hAnsi="Times New Roman" w:cs="Times New Roman"/>
-              </w:rPr>
-              <w:t xml:space="preserve" w:space="preserve">N/A</w:t>
-            </w:r>
-            <w:r>
-              <w:rPr>
-                <w:color w:val="000000" w:themeColor="text1"/>
-                <w:sz w:val="14"/>
-                <w:szCs w:val="14"/>
-                <w:rFonts w:ascii="Times New Roman" w:hAnsi="Times New Roman" w:cs="Times New Roman"/>
-              </w:rPr>
-              <w:t/>
-            </w:r>
-            <w:r>
-              <w:rPr>
-                <w:color w:val="000000" w:themeColor="text1"/>
-                <w:sz w:val="14"/>
-                <w:szCs w:val="14"/>
-                <w:rFonts w:ascii="Times New Roman" w:hAnsi="Times New Roman" w:cs="Times New Roman"/>
-              </w:rPr>
-              <w:t/>
-            </w:r>
-            <w:r>
-              <w:rPr>
-                <w:color w:val="000000" w:themeColor="text1"/>
-                <w:sz w:val="14"/>
-                <w:szCs w:val="14"/>
-                <w:rFonts w:ascii="Times New Roman" w:hAnsi="Times New Roman" w:cs="Times New Roman"/>
-              </w:rPr>
-              <w:t/>
-            </w:r>
-            <w:r>
-              <w:rPr>
-                <w:color w:val="000000" w:themeColor="text1"/>
-                <w:sz w:val="14"/>
-                <w:szCs w:val="14"/>
-                <w:rFonts w:ascii="Times New Roman" w:hAnsi="Times New Roman" w:cs="Times New Roman"/>
-              </w:rPr>
-              <w:t xml:space="preserve"/>
+                <w:rFonts w:ascii="Times New Roman" w:hAnsi="Times New Roman"/>
+                <w:color w:val="000000" w:themeColor="text1"/>
+                <w:sz w:val="14"/>
+                <w:szCs w:val="14"/>
+              </w:rPr>
+              <w:t>N/A</w:t>
             </w:r>
           </w:p>
         </w:tc>
@@ -2064,10 +1861,10 @@
             </w:pPr>
             <w:r>
               <w:rPr>
-                <w:color w:val="000000" w:themeColor="text1"/>
-                <w:sz w:val="14"/>
-                <w:szCs w:val="14"/>
-                <w:rFonts w:ascii="Times New Roman" w:hAnsi="Times New Roman" w:cs="Times New Roman"/>
+                <w:rFonts w:ascii="Times New Roman" w:hAnsi="Times New Roman"/>
+                <w:color w:val="000000" w:themeColor="text1"/>
+                <w:sz w:val="14"/>
+                <w:szCs w:val="14"/>
               </w:rPr>
               <w:t xml:space="preserve"> None</w:t>
             </w:r>
@@ -2098,12 +1895,12 @@
           <w:p>
             <w:r>
               <w:rPr>
+                <w:rFonts w:ascii="Times New Roman" w:hAnsi="Times New Roman"/>
                 <w:b/>
                 <w:bCs/>
                 <w:color w:val="000000" w:themeColor="text1"/>
                 <w:sz w:val="14"/>
                 <w:szCs w:val="14"/>
-                <w:rFonts w:ascii="Times New Roman" w:hAnsi="Times New Roman" w:cs="Times New Roman"/>
               </w:rPr>
               <w:t>Biological Safety Cabinet EM Bracketing Biological Safety Cabinet (BSC)</w:t>
             </w:r>
@@ -2136,10 +1933,10 @@
             </w:pPr>
             <w:r>
               <w:rPr>
-                <w:color w:val="000000" w:themeColor="text1"/>
-                <w:sz w:val="14"/>
-                <w:szCs w:val="14"/>
-                <w:rFonts w:ascii="Times New Roman" w:hAnsi="Times New Roman" w:cs="Times New Roman"/>
+                <w:rFonts w:ascii="Times New Roman" w:hAnsi="Times New Roman"/>
+                <w:color w:val="000000" w:themeColor="text1"/>
+                <w:sz w:val="14"/>
+                <w:szCs w:val="14"/>
               </w:rPr>
               <w:t>Surface Sampling of ISO 5 (4 locations)</w:t>
             </w:r>
@@ -2168,12 +1965,12 @@
             </w:pPr>
             <w:r>
               <w:rPr>
-                <w:color w:val="000000" w:themeColor="text1"/>
-                <w:sz w:val="14"/>
-                <w:szCs w:val="14"/>
-                <w:rFonts w:ascii="Times New Roman" w:hAnsi="Times New Roman" w:cs="Times New Roman"/>
-              </w:rPr>
-              <w:t xml:space="preserve">Daily</w:t>
+                <w:rFonts w:ascii="Times New Roman" w:hAnsi="Times New Roman"/>
+                <w:color w:val="000000" w:themeColor="text1"/>
+                <w:sz w:val="14"/>
+                <w:szCs w:val="14"/>
+              </w:rPr>
+              <w:t>Daily</w:t>
             </w:r>
           </w:p>
         </w:tc>
@@ -2205,21 +2002,12 @@
             </w:pPr>
             <w:r>
               <w:rPr>
-                <w:color w:val="000000" w:themeColor="text1"/>
-                <w:sz w:val="14"/>
-                <w:szCs w:val="14"/>
-                <w:rFonts w:ascii="Times New Roman" w:hAnsi="Times New Roman" w:cs="Times New Roman"/>
-              </w:rPr>
-              <w:t xml:space="preserve" w:space="preserve"> 24Aug26</w:t>
-            </w:r>
-            <w:r>
-              <w:rPr>
-                <w:color w:val="000000" w:themeColor="text1"/>
-                <w:sz w:val="14"/>
-                <w:szCs w:val="14"/>
-                <w:rFonts w:ascii="Times New Roman" w:hAnsi="Times New Roman" w:cs="Times New Roman"/>
-              </w:rPr>
-              <w:t/>
+                <w:rFonts w:ascii="Times New Roman" w:hAnsi="Times New Roman"/>
+                <w:color w:val="000000" w:themeColor="text1"/>
+                <w:sz w:val="14"/>
+                <w:szCs w:val="14"/>
+              </w:rPr>
+              <w:t xml:space="preserve"> 24Aug26</w:t>
             </w:r>
           </w:p>
         </w:tc>
@@ -2252,12 +2040,12 @@
             </w:pPr>
             <w:r>
               <w:rPr>
-                <w:color w:val="000000" w:themeColor="text1"/>
-                <w:sz w:val="14"/>
-                <w:szCs w:val="14"/>
-                <w:rFonts w:ascii="Times New Roman" w:hAnsi="Times New Roman" w:cs="Times New Roman"/>
-              </w:rPr>
-              <w:t w:space="preserve" xml:space="preserve">Pending</w:t>
+                <w:rFonts w:ascii="Times New Roman" w:hAnsi="Times New Roman"/>
+                <w:color w:val="000000" w:themeColor="text1"/>
+                <w:sz w:val="14"/>
+                <w:szCs w:val="14"/>
+              </w:rPr>
+              <w:t>ES</w:t>
             </w:r>
           </w:p>
         </w:tc>
@@ -2283,12 +2071,12 @@
             </w:pPr>
             <w:r>
               <w:rPr>
-                <w:color w:val="000000" w:themeColor="text1"/>
-                <w:sz w:val="14"/>
-                <w:szCs w:val="14"/>
-                <w:rFonts w:ascii="Times New Roman" w:hAnsi="Times New Roman" w:cs="Times New Roman"/>
-              </w:rPr>
-              <w:t xml:space="preserve">Date Before Testing</w:t>
+                <w:rFonts w:ascii="Times New Roman" w:hAnsi="Times New Roman"/>
+                <w:color w:val="000000" w:themeColor="text1"/>
+                <w:sz w:val="14"/>
+                <w:szCs w:val="14"/>
+              </w:rPr>
+              <w:t>Date Before Testing</w:t>
             </w:r>
           </w:p>
         </w:tc>
@@ -2321,48 +2109,12 @@
             </w:pPr>
             <w:r>
               <w:rPr>
-                <w:color w:val="000000" w:themeColor="text1"/>
-                <w:sz w:val="14"/>
-                <w:szCs w:val="14"/>
-                <w:rFonts w:ascii="Times New Roman" w:hAnsi="Times New Roman" w:cs="Times New Roman"/>
-              </w:rPr>
-              <w:t xml:space="preserve" w:space="preserve">No growth</w:t>
-            </w:r>
-            <w:r>
-              <w:rPr>
-                <w:color w:val="000000" w:themeColor="text1"/>
-                <w:sz w:val="14"/>
-                <w:szCs w:val="14"/>
-                <w:rFonts w:ascii="Times New Roman" w:hAnsi="Times New Roman" w:cs="Times New Roman"/>
-              </w:rPr>
-              <w:t/>
-            </w:r>
-            <w:r>
-              <w:rPr>
-                <w:color w:val="000000" w:themeColor="text1"/>
-                <w:sz w:val="14"/>
-                <w:szCs w:val="14"/>
-                <w:rFonts w:ascii="Times New Roman" w:hAnsi="Times New Roman" w:cs="Times New Roman"/>
-              </w:rPr>
-              <w:t/>
-            </w:r>
-            <w:r>
-              <w:rPr>
-                <w:color w:val="000000" w:themeColor="text1"/>
-                <w:sz w:val="14"/>
-                <w:szCs w:val="14"/>
-                <w:rFonts w:ascii="Times New Roman" w:hAnsi="Times New Roman" w:cs="Times New Roman"/>
-              </w:rPr>
-              <w:t/>
-            </w:r>
-            <w:r>
-              <w:rPr>
-                <w:color w:val="000000" w:themeColor="text1"/>
-                <w:sz w:val="14"/>
-                <w:szCs w:val="14"/>
-                <w:rFonts w:ascii="Times New Roman" w:hAnsi="Times New Roman" w:cs="Times New Roman"/>
-              </w:rPr>
-              <w:t xml:space="preserve"/>
+                <w:rFonts w:ascii="Times New Roman" w:hAnsi="Times New Roman"/>
+                <w:color w:val="000000" w:themeColor="text1"/>
+                <w:sz w:val="14"/>
+                <w:szCs w:val="14"/>
+              </w:rPr>
+              <w:t>No growth</w:t>
             </w:r>
           </w:p>
         </w:tc>
@@ -2385,48 +2137,12 @@
           <w:p>
             <w:r>
               <w:rPr>
-                <w:color w:val="000000" w:themeColor="text1"/>
-                <w:sz w:val="14"/>
-                <w:szCs w:val="14"/>
-                <w:rFonts w:ascii="Times New Roman" w:hAnsi="Times New Roman" w:cs="Times New Roman"/>
-              </w:rPr>
-              <w:t xml:space="preserve" w:space="preserve">N/A</w:t>
-            </w:r>
-            <w:r>
-              <w:rPr>
-                <w:color w:val="000000" w:themeColor="text1"/>
-                <w:sz w:val="14"/>
-                <w:szCs w:val="14"/>
-                <w:rFonts w:ascii="Times New Roman" w:hAnsi="Times New Roman" w:cs="Times New Roman"/>
-              </w:rPr>
-              <w:t/>
-            </w:r>
-            <w:r>
-              <w:rPr>
-                <w:color w:val="000000" w:themeColor="text1"/>
-                <w:sz w:val="14"/>
-                <w:szCs w:val="14"/>
-                <w:rFonts w:ascii="Times New Roman" w:hAnsi="Times New Roman" w:cs="Times New Roman"/>
-              </w:rPr>
-              <w:t/>
-            </w:r>
-            <w:r>
-              <w:rPr>
-                <w:color w:val="000000" w:themeColor="text1"/>
-                <w:sz w:val="14"/>
-                <w:szCs w:val="14"/>
-                <w:rFonts w:ascii="Times New Roman" w:hAnsi="Times New Roman" w:cs="Times New Roman"/>
-              </w:rPr>
-              <w:t/>
-            </w:r>
-            <w:r>
-              <w:rPr>
-                <w:color w:val="000000" w:themeColor="text1"/>
-                <w:sz w:val="14"/>
-                <w:szCs w:val="14"/>
-                <w:rFonts w:ascii="Times New Roman" w:hAnsi="Times New Roman" w:cs="Times New Roman"/>
-              </w:rPr>
-              <w:t xml:space="preserve"/>
+                <w:rFonts w:ascii="Times New Roman" w:hAnsi="Times New Roman"/>
+                <w:color w:val="000000" w:themeColor="text1"/>
+                <w:sz w:val="14"/>
+                <w:szCs w:val="14"/>
+              </w:rPr>
+              <w:t>N/A</w:t>
             </w:r>
           </w:p>
         </w:tc>
@@ -2449,48 +2165,12 @@
           <w:p>
             <w:r>
               <w:rPr>
-                <w:color w:val="000000" w:themeColor="text1"/>
-                <w:sz w:val="14"/>
-                <w:szCs w:val="14"/>
-                <w:rFonts w:ascii="Times New Roman" w:hAnsi="Times New Roman" w:cs="Times New Roman"/>
-              </w:rPr>
-              <w:t xml:space="preserve" w:space="preserve">N/A</w:t>
-            </w:r>
-            <w:r>
-              <w:rPr>
-                <w:color w:val="000000" w:themeColor="text1"/>
-                <w:sz w:val="14"/>
-                <w:szCs w:val="14"/>
-                <w:rFonts w:ascii="Times New Roman" w:hAnsi="Times New Roman" w:cs="Times New Roman"/>
-              </w:rPr>
-              <w:t/>
-            </w:r>
-            <w:r>
-              <w:rPr>
-                <w:color w:val="000000" w:themeColor="text1"/>
-                <w:sz w:val="14"/>
-                <w:szCs w:val="14"/>
-                <w:rFonts w:ascii="Times New Roman" w:hAnsi="Times New Roman" w:cs="Times New Roman"/>
-              </w:rPr>
-              <w:t/>
-            </w:r>
-            <w:r>
-              <w:rPr>
-                <w:color w:val="000000" w:themeColor="text1"/>
-                <w:sz w:val="14"/>
-                <w:szCs w:val="14"/>
-                <w:rFonts w:ascii="Times New Roman" w:hAnsi="Times New Roman" w:cs="Times New Roman"/>
-              </w:rPr>
-              <w:t/>
-            </w:r>
-            <w:r>
-              <w:rPr>
-                <w:color w:val="000000" w:themeColor="text1"/>
-                <w:sz w:val="14"/>
-                <w:szCs w:val="14"/>
-                <w:rFonts w:ascii="Times New Roman" w:hAnsi="Times New Roman" w:cs="Times New Roman"/>
-              </w:rPr>
-              <w:t xml:space="preserve"/>
+                <w:rFonts w:ascii="Times New Roman" w:hAnsi="Times New Roman"/>
+                <w:color w:val="000000" w:themeColor="text1"/>
+                <w:sz w:val="14"/>
+                <w:szCs w:val="14"/>
+              </w:rPr>
+              <w:t>N/A</w:t>
             </w:r>
           </w:p>
         </w:tc>
@@ -2523,10 +2203,10 @@
             </w:pPr>
             <w:r>
               <w:rPr>
-                <w:color w:val="000000" w:themeColor="text1"/>
-                <w:sz w:val="14"/>
-                <w:szCs w:val="14"/>
-                <w:rFonts w:ascii="Times New Roman" w:hAnsi="Times New Roman" w:cs="Times New Roman"/>
+                <w:rFonts w:ascii="Times New Roman" w:hAnsi="Times New Roman"/>
+                <w:color w:val="000000" w:themeColor="text1"/>
+                <w:sz w:val="14"/>
+                <w:szCs w:val="14"/>
               </w:rPr>
               <w:t xml:space="preserve">None </w:t>
             </w:r>
@@ -2559,10 +2239,10 @@
             </w:pPr>
             <w:r>
               <w:rPr>
-                <w:color w:val="000000" w:themeColor="text1"/>
-                <w:sz w:val="14"/>
-                <w:szCs w:val="14"/>
-                <w:rFonts w:ascii="Times New Roman" w:hAnsi="Times New Roman" w:cs="Times New Roman"/>
+                <w:rFonts w:ascii="Times New Roman" w:hAnsi="Times New Roman"/>
+                <w:color w:val="000000" w:themeColor="text1"/>
+                <w:sz w:val="14"/>
+                <w:szCs w:val="14"/>
               </w:rPr>
               <w:t>Surface Sampling of ISO 5</w:t>
             </w:r>
@@ -2573,10 +2253,10 @@
             </w:pPr>
             <w:r>
               <w:rPr>
-                <w:color w:val="000000" w:themeColor="text1"/>
-                <w:sz w:val="14"/>
-                <w:szCs w:val="14"/>
-                <w:rFonts w:ascii="Times New Roman" w:hAnsi="Times New Roman" w:cs="Times New Roman"/>
+                <w:rFonts w:ascii="Times New Roman" w:hAnsi="Times New Roman"/>
+                <w:color w:val="000000" w:themeColor="text1"/>
+                <w:sz w:val="14"/>
+                <w:szCs w:val="14"/>
               </w:rPr>
               <w:t>(4 locations)</w:t>
             </w:r>
@@ -2605,12 +2285,12 @@
             </w:pPr>
             <w:r>
               <w:rPr>
-                <w:color w:val="000000" w:themeColor="text1"/>
-                <w:sz w:val="14"/>
-                <w:szCs w:val="14"/>
-                <w:rFonts w:ascii="Times New Roman" w:hAnsi="Times New Roman" w:cs="Times New Roman"/>
-              </w:rPr>
-              <w:t xml:space="preserve">Daily</w:t>
+                <w:rFonts w:ascii="Times New Roman" w:hAnsi="Times New Roman"/>
+                <w:color w:val="000000" w:themeColor="text1"/>
+                <w:sz w:val="14"/>
+                <w:szCs w:val="14"/>
+              </w:rPr>
+              <w:t>Daily</w:t>
             </w:r>
           </w:p>
         </w:tc>
@@ -2642,21 +2322,12 @@
             </w:pPr>
             <w:r>
               <w:rPr>
-                <w:color w:val="000000" w:themeColor="text1"/>
-                <w:sz w:val="14"/>
-                <w:szCs w:val="14"/>
-                <w:rFonts w:ascii="Times New Roman" w:hAnsi="Times New Roman" w:cs="Times New Roman"/>
-              </w:rPr>
-              <w:t xml:space="preserve" w:space="preserve"> 25Aug26</w:t>
-            </w:r>
-            <w:r>
-              <w:rPr>
-                <w:color w:val="000000" w:themeColor="text1"/>
-                <w:sz w:val="14"/>
-                <w:szCs w:val="14"/>
-                <w:rFonts w:ascii="Times New Roman" w:hAnsi="Times New Roman" w:cs="Times New Roman"/>
-              </w:rPr>
-              <w:t/>
+                <w:rFonts w:ascii="Times New Roman" w:hAnsi="Times New Roman"/>
+                <w:color w:val="000000" w:themeColor="text1"/>
+                <w:sz w:val="14"/>
+                <w:szCs w:val="14"/>
+              </w:rPr>
+              <w:t xml:space="preserve"> 25Aug26</w:t>
             </w:r>
           </w:p>
         </w:tc>
@@ -2689,21 +2360,12 @@
             </w:pPr>
             <w:r>
               <w:rPr>
-                <w:color w:val="000000" w:themeColor="text1"/>
-                <w:sz w:val="14"/>
-                <w:szCs w:val="14"/>
-                <w:rFonts w:ascii="Times New Roman" w:hAnsi="Times New Roman" w:cs="Times New Roman"/>
-              </w:rPr>
-              <w:t w:space="preserve" xml:space="preserve">Pending </w:t>
-            </w:r>
-            <w:r>
-              <w:rPr>
-                <w:color w:val="000000" w:themeColor="text1"/>
-                <w:sz w:val="14"/>
-                <w:szCs w:val="14"/>
-                <w:rFonts w:ascii="Times New Roman" w:hAnsi="Times New Roman" w:cs="Times New Roman"/>
-              </w:rPr>
-              <w:t xml:space="preserve"/>
+                <w:rFonts w:ascii="Times New Roman" w:hAnsi="Times New Roman"/>
+                <w:color w:val="000000" w:themeColor="text1"/>
+                <w:sz w:val="14"/>
+                <w:szCs w:val="14"/>
+              </w:rPr>
+              <w:t xml:space="preserve">GS </w:t>
             </w:r>
           </w:p>
         </w:tc>
@@ -2729,12 +2391,12 @@
             </w:pPr>
             <w:r>
               <w:rPr>
-                <w:color w:val="000000" w:themeColor="text1"/>
-                <w:sz w:val="14"/>
-                <w:szCs w:val="14"/>
-                <w:rFonts w:ascii="Times New Roman" w:hAnsi="Times New Roman" w:cs="Times New Roman"/>
-              </w:rPr>
-              <w:t xml:space="preserve">Date of Testing</w:t>
+                <w:rFonts w:ascii="Times New Roman" w:hAnsi="Times New Roman"/>
+                <w:color w:val="000000" w:themeColor="text1"/>
+                <w:sz w:val="14"/>
+                <w:szCs w:val="14"/>
+              </w:rPr>
+              <w:t>Date of Testing</w:t>
             </w:r>
           </w:p>
         </w:tc>
@@ -2767,30 +2429,12 @@
             </w:pPr>
             <w:r>
               <w:rPr>
-                <w:color w:val="000000" w:themeColor="text1"/>
-                <w:sz w:val="14"/>
-                <w:szCs w:val="14"/>
-                <w:rFonts w:ascii="Times New Roman" w:hAnsi="Times New Roman" w:cs="Times New Roman"/>
-              </w:rPr>
-              <w:t w:space="preserve" xml:space="preserve">No growth</w:t>
-            </w:r>
-            <w:r>
-              <w:rPr>
-                <w:color w:val="000000" w:themeColor="text1"/>
-                <w:sz w:val="14"/>
-                <w:szCs w:val="14"/>
-                <w:rFonts w:ascii="Times New Roman" w:hAnsi="Times New Roman" w:cs="Times New Roman"/>
-              </w:rPr>
-              <w:t/>
-            </w:r>
-            <w:r>
-              <w:rPr>
-                <w:color w:val="000000" w:themeColor="text1"/>
-                <w:sz w:val="14"/>
-                <w:szCs w:val="14"/>
-                <w:rFonts w:ascii="Times New Roman" w:hAnsi="Times New Roman" w:cs="Times New Roman"/>
-              </w:rPr>
-              <w:t xml:space="preserve"/>
+                <w:rFonts w:ascii="Times New Roman" w:hAnsi="Times New Roman"/>
+                <w:color w:val="000000" w:themeColor="text1"/>
+                <w:sz w:val="14"/>
+                <w:szCs w:val="14"/>
+              </w:rPr>
+              <w:t>No growth</w:t>
             </w:r>
           </w:p>
         </w:tc>
@@ -2821,30 +2465,12 @@
             </w:pPr>
             <w:r>
               <w:rPr>
-                <w:color w:val="000000" w:themeColor="text1"/>
-                <w:sz w:val="14"/>
-                <w:szCs w:val="14"/>
-                <w:rFonts w:ascii="Times New Roman" w:hAnsi="Times New Roman" w:cs="Times New Roman"/>
-              </w:rPr>
-              <w:t w:space="preserve" xml:space="preserve">N/A</w:t>
-            </w:r>
-            <w:r>
-              <w:rPr>
-                <w:color w:val="000000" w:themeColor="text1"/>
-                <w:sz w:val="14"/>
-                <w:szCs w:val="14"/>
-                <w:rFonts w:ascii="Times New Roman" w:hAnsi="Times New Roman" w:cs="Times New Roman"/>
-              </w:rPr>
-              <w:t/>
-            </w:r>
-            <w:r>
-              <w:rPr>
-                <w:color w:val="000000" w:themeColor="text1"/>
-                <w:sz w:val="14"/>
-                <w:szCs w:val="14"/>
-                <w:rFonts w:ascii="Times New Roman" w:hAnsi="Times New Roman" w:cs="Times New Roman"/>
-              </w:rPr>
-              <w:t xml:space="preserve"/>
+                <w:rFonts w:ascii="Times New Roman" w:hAnsi="Times New Roman"/>
+                <w:color w:val="000000" w:themeColor="text1"/>
+                <w:sz w:val="14"/>
+                <w:szCs w:val="14"/>
+              </w:rPr>
+              <w:t>N/A</w:t>
             </w:r>
           </w:p>
         </w:tc>
@@ -2875,30 +2501,12 @@
             </w:pPr>
             <w:r>
               <w:rPr>
-                <w:color w:val="000000" w:themeColor="text1"/>
-                <w:sz w:val="14"/>
-                <w:szCs w:val="14"/>
-                <w:rFonts w:ascii="Times New Roman" w:hAnsi="Times New Roman" w:cs="Times New Roman"/>
-              </w:rPr>
-              <w:t w:space="preserve" xml:space="preserve">N/A</w:t>
-            </w:r>
-            <w:r>
-              <w:rPr>
-                <w:color w:val="000000" w:themeColor="text1"/>
-                <w:sz w:val="14"/>
-                <w:szCs w:val="14"/>
-                <w:rFonts w:ascii="Times New Roman" w:hAnsi="Times New Roman" w:cs="Times New Roman"/>
-              </w:rPr>
-              <w:t/>
-            </w:r>
-            <w:r>
-              <w:rPr>
-                <w:color w:val="000000" w:themeColor="text1"/>
-                <w:sz w:val="14"/>
-                <w:szCs w:val="14"/>
-                <w:rFonts w:ascii="Times New Roman" w:hAnsi="Times New Roman" w:cs="Times New Roman"/>
-              </w:rPr>
-              <w:t xml:space="preserve"/>
+                <w:rFonts w:ascii="Times New Roman" w:hAnsi="Times New Roman"/>
+                <w:color w:val="000000" w:themeColor="text1"/>
+                <w:sz w:val="14"/>
+                <w:szCs w:val="14"/>
+              </w:rPr>
+              <w:t>N/A</w:t>
             </w:r>
           </w:p>
         </w:tc>
@@ -2931,10 +2539,10 @@
             </w:pPr>
             <w:r>
               <w:rPr>
-                <w:color w:val="000000" w:themeColor="text1"/>
-                <w:sz w:val="14"/>
-                <w:szCs w:val="14"/>
-                <w:rFonts w:ascii="Times New Roman" w:hAnsi="Times New Roman" w:cs="Times New Roman"/>
+                <w:rFonts w:ascii="Times New Roman" w:hAnsi="Times New Roman"/>
+                <w:color w:val="000000" w:themeColor="text1"/>
+                <w:sz w:val="14"/>
+                <w:szCs w:val="14"/>
               </w:rPr>
               <w:t xml:space="preserve"> None</w:t>
             </w:r>
@@ -2967,10 +2575,10 @@
             </w:pPr>
             <w:r>
               <w:rPr>
-                <w:color w:val="000000" w:themeColor="text1"/>
-                <w:sz w:val="14"/>
-                <w:szCs w:val="14"/>
-                <w:rFonts w:ascii="Times New Roman" w:hAnsi="Times New Roman" w:cs="Times New Roman"/>
+                <w:rFonts w:ascii="Times New Roman" w:hAnsi="Times New Roman"/>
+                <w:color w:val="000000" w:themeColor="text1"/>
+                <w:sz w:val="14"/>
+                <w:szCs w:val="14"/>
               </w:rPr>
               <w:t>Surface Sampling of ISO 5 (4 locations)</w:t>
             </w:r>
@@ -2999,12 +2607,12 @@
             </w:pPr>
             <w:r>
               <w:rPr>
-                <w:color w:val="000000" w:themeColor="text1"/>
-                <w:sz w:val="14"/>
-                <w:szCs w:val="14"/>
-                <w:rFonts w:ascii="Times New Roman" w:hAnsi="Times New Roman" w:cs="Times New Roman"/>
-              </w:rPr>
-              <w:t xml:space="preserve">Daily</w:t>
+                <w:rFonts w:ascii="Times New Roman" w:hAnsi="Times New Roman"/>
+                <w:color w:val="000000" w:themeColor="text1"/>
+                <w:sz w:val="14"/>
+                <w:szCs w:val="14"/>
+              </w:rPr>
+              <w:t>Daily</w:t>
             </w:r>
           </w:p>
         </w:tc>
@@ -3036,21 +2644,12 @@
             </w:pPr>
             <w:r>
               <w:rPr>
-                <w:color w:val="000000" w:themeColor="text1"/>
-                <w:sz w:val="14"/>
-                <w:szCs w:val="14"/>
-                <w:rFonts w:ascii="Times New Roman" w:hAnsi="Times New Roman" w:cs="Times New Roman"/>
-              </w:rPr>
-              <w:t xml:space="preserve" w:space="preserve"> 26Aug26</w:t>
-            </w:r>
-            <w:r>
-              <w:rPr>
-                <w:color w:val="000000" w:themeColor="text1"/>
-                <w:sz w:val="14"/>
-                <w:szCs w:val="14"/>
-                <w:rFonts w:ascii="Times New Roman" w:hAnsi="Times New Roman" w:cs="Times New Roman"/>
-              </w:rPr>
-              <w:t/>
+                <w:rFonts w:ascii="Times New Roman" w:hAnsi="Times New Roman"/>
+                <w:color w:val="000000" w:themeColor="text1"/>
+                <w:sz w:val="14"/>
+                <w:szCs w:val="14"/>
+              </w:rPr>
+              <w:t xml:space="preserve"> 26Aug26</w:t>
             </w:r>
           </w:p>
         </w:tc>
@@ -3083,21 +2682,12 @@
             </w:pPr>
             <w:r>
               <w:rPr>
-                <w:color w:val="000000" w:themeColor="text1"/>
-                <w:sz w:val="14"/>
-                <w:szCs w:val="14"/>
-                <w:rFonts w:ascii="Times New Roman" w:hAnsi="Times New Roman" w:cs="Times New Roman"/>
-              </w:rPr>
-              <w:t w:space="preserve" xml:space="preserve">Pending </w:t>
-            </w:r>
-            <w:r>
-              <w:rPr>
-                <w:color w:val="000000" w:themeColor="text1"/>
-                <w:sz w:val="14"/>
-                <w:szCs w:val="14"/>
-                <w:rFonts w:ascii="Times New Roman" w:hAnsi="Times New Roman" w:cs="Times New Roman"/>
-              </w:rPr>
-              <w:t xml:space="preserve"/>
+                <w:rFonts w:ascii="Times New Roman" w:hAnsi="Times New Roman"/>
+                <w:color w:val="000000" w:themeColor="text1"/>
+                <w:sz w:val="14"/>
+                <w:szCs w:val="14"/>
+              </w:rPr>
+              <w:t xml:space="preserve">GS </w:t>
             </w:r>
           </w:p>
         </w:tc>
@@ -3123,12 +2713,12 @@
             </w:pPr>
             <w:r>
               <w:rPr>
-                <w:color w:val="000000" w:themeColor="text1"/>
-                <w:sz w:val="14"/>
-                <w:szCs w:val="14"/>
-                <w:rFonts w:ascii="Times New Roman" w:hAnsi="Times New Roman" w:cs="Times New Roman"/>
-              </w:rPr>
-              <w:t xml:space="preserve">Date After Testing</w:t>
+                <w:rFonts w:ascii="Times New Roman" w:hAnsi="Times New Roman"/>
+                <w:color w:val="000000" w:themeColor="text1"/>
+                <w:sz w:val="14"/>
+                <w:szCs w:val="14"/>
+              </w:rPr>
+              <w:t>Date After Testing</w:t>
             </w:r>
           </w:p>
         </w:tc>
@@ -3161,48 +2751,12 @@
             </w:pPr>
             <w:r>
               <w:rPr>
-                <w:color w:val="000000" w:themeColor="text1"/>
-                <w:sz w:val="14"/>
-                <w:szCs w:val="14"/>
-                <w:rFonts w:ascii="Times New Roman" w:hAnsi="Times New Roman" w:cs="Times New Roman"/>
-              </w:rPr>
-              <w:t xml:space="preserve" w:space="preserve">No growth</w:t>
-            </w:r>
-            <w:r>
-              <w:rPr>
-                <w:color w:val="000000" w:themeColor="text1"/>
-                <w:sz w:val="14"/>
-                <w:szCs w:val="14"/>
-                <w:rFonts w:ascii="Times New Roman" w:hAnsi="Times New Roman" w:cs="Times New Roman"/>
-              </w:rPr>
-              <w:t/>
-            </w:r>
-            <w:r>
-              <w:rPr>
-                <w:color w:val="000000" w:themeColor="text1"/>
-                <w:sz w:val="14"/>
-                <w:szCs w:val="14"/>
-                <w:rFonts w:ascii="Times New Roman" w:hAnsi="Times New Roman" w:cs="Times New Roman"/>
-              </w:rPr>
-              <w:t/>
-            </w:r>
-            <w:r>
-              <w:rPr>
-                <w:color w:val="000000" w:themeColor="text1"/>
-                <w:sz w:val="14"/>
-                <w:szCs w:val="14"/>
-                <w:rFonts w:ascii="Times New Roman" w:hAnsi="Times New Roman" w:cs="Times New Roman"/>
-              </w:rPr>
-              <w:t/>
-            </w:r>
-            <w:r>
-              <w:rPr>
-                <w:color w:val="000000" w:themeColor="text1"/>
-                <w:sz w:val="14"/>
-                <w:szCs w:val="14"/>
-                <w:rFonts w:ascii="Times New Roman" w:hAnsi="Times New Roman" w:cs="Times New Roman"/>
-              </w:rPr>
-              <w:t xml:space="preserve"/>
+                <w:rFonts w:ascii="Times New Roman" w:hAnsi="Times New Roman"/>
+                <w:color w:val="000000" w:themeColor="text1"/>
+                <w:sz w:val="14"/>
+                <w:szCs w:val="14"/>
+              </w:rPr>
+              <w:t>No growth</w:t>
             </w:r>
           </w:p>
         </w:tc>
@@ -3225,48 +2779,12 @@
           <w:p>
             <w:r>
               <w:rPr>
-                <w:color w:val="000000" w:themeColor="text1"/>
-                <w:sz w:val="14"/>
-                <w:szCs w:val="14"/>
-                <w:rFonts w:ascii="Times New Roman" w:hAnsi="Times New Roman" w:cs="Times New Roman"/>
-              </w:rPr>
-              <w:t xml:space="preserve" w:space="preserve">N/A</w:t>
-            </w:r>
-            <w:r>
-              <w:rPr>
-                <w:color w:val="000000" w:themeColor="text1"/>
-                <w:sz w:val="14"/>
-                <w:szCs w:val="14"/>
-                <w:rFonts w:ascii="Times New Roman" w:hAnsi="Times New Roman" w:cs="Times New Roman"/>
-              </w:rPr>
-              <w:t/>
-            </w:r>
-            <w:r>
-              <w:rPr>
-                <w:color w:val="000000" w:themeColor="text1"/>
-                <w:sz w:val="14"/>
-                <w:szCs w:val="14"/>
-                <w:rFonts w:ascii="Times New Roman" w:hAnsi="Times New Roman" w:cs="Times New Roman"/>
-              </w:rPr>
-              <w:t/>
-            </w:r>
-            <w:r>
-              <w:rPr>
-                <w:color w:val="000000" w:themeColor="text1"/>
-                <w:sz w:val="14"/>
-                <w:szCs w:val="14"/>
-                <w:rFonts w:ascii="Times New Roman" w:hAnsi="Times New Roman" w:cs="Times New Roman"/>
-              </w:rPr>
-              <w:t/>
-            </w:r>
-            <w:r>
-              <w:rPr>
-                <w:color w:val="000000" w:themeColor="text1"/>
-                <w:sz w:val="14"/>
-                <w:szCs w:val="14"/>
-                <w:rFonts w:ascii="Times New Roman" w:hAnsi="Times New Roman" w:cs="Times New Roman"/>
-              </w:rPr>
-              <w:t xml:space="preserve"/>
+                <w:rFonts w:ascii="Times New Roman" w:hAnsi="Times New Roman"/>
+                <w:color w:val="000000" w:themeColor="text1"/>
+                <w:sz w:val="14"/>
+                <w:szCs w:val="14"/>
+              </w:rPr>
+              <w:t>N/A</w:t>
             </w:r>
           </w:p>
         </w:tc>
@@ -3289,48 +2807,12 @@
           <w:p>
             <w:r>
               <w:rPr>
-                <w:color w:val="000000" w:themeColor="text1"/>
-                <w:sz w:val="14"/>
-                <w:szCs w:val="14"/>
-                <w:rFonts w:ascii="Times New Roman" w:hAnsi="Times New Roman" w:cs="Times New Roman"/>
-              </w:rPr>
-              <w:t xml:space="preserve" w:space="preserve">N/A</w:t>
-            </w:r>
-            <w:r>
-              <w:rPr>
-                <w:color w:val="000000" w:themeColor="text1"/>
-                <w:sz w:val="14"/>
-                <w:szCs w:val="14"/>
-                <w:rFonts w:ascii="Times New Roman" w:hAnsi="Times New Roman" w:cs="Times New Roman"/>
-              </w:rPr>
-              <w:t/>
-            </w:r>
-            <w:r>
-              <w:rPr>
-                <w:color w:val="000000" w:themeColor="text1"/>
-                <w:sz w:val="14"/>
-                <w:szCs w:val="14"/>
-                <w:rFonts w:ascii="Times New Roman" w:hAnsi="Times New Roman" w:cs="Times New Roman"/>
-              </w:rPr>
-              <w:t/>
-            </w:r>
-            <w:r>
-              <w:rPr>
-                <w:color w:val="000000" w:themeColor="text1"/>
-                <w:sz w:val="14"/>
-                <w:szCs w:val="14"/>
-                <w:rFonts w:ascii="Times New Roman" w:hAnsi="Times New Roman" w:cs="Times New Roman"/>
-              </w:rPr>
-              <w:t/>
-            </w:r>
-            <w:r>
-              <w:rPr>
-                <w:color w:val="000000" w:themeColor="text1"/>
-                <w:sz w:val="14"/>
-                <w:szCs w:val="14"/>
-                <w:rFonts w:ascii="Times New Roman" w:hAnsi="Times New Roman" w:cs="Times New Roman"/>
-              </w:rPr>
-              <w:t xml:space="preserve"/>
+                <w:rFonts w:ascii="Times New Roman" w:hAnsi="Times New Roman"/>
+                <w:color w:val="000000" w:themeColor="text1"/>
+                <w:sz w:val="14"/>
+                <w:szCs w:val="14"/>
+              </w:rPr>
+              <w:t>N/A</w:t>
             </w:r>
           </w:p>
         </w:tc>
@@ -3363,10 +2845,10 @@
             </w:pPr>
             <w:r>
               <w:rPr>
-                <w:color w:val="000000" w:themeColor="text1"/>
-                <w:sz w:val="14"/>
-                <w:szCs w:val="14"/>
-                <w:rFonts w:ascii="Times New Roman" w:hAnsi="Times New Roman" w:cs="Times New Roman"/>
+                <w:rFonts w:ascii="Times New Roman" w:hAnsi="Times New Roman"/>
+                <w:color w:val="000000" w:themeColor="text1"/>
+                <w:sz w:val="14"/>
+                <w:szCs w:val="14"/>
               </w:rPr>
               <w:t xml:space="preserve"> None</w:t>
             </w:r>
@@ -3399,10 +2881,10 @@
             </w:pPr>
             <w:r>
               <w:rPr>
-                <w:color w:val="000000" w:themeColor="text1"/>
-                <w:sz w:val="14"/>
-                <w:szCs w:val="14"/>
-                <w:rFonts w:ascii="Times New Roman" w:hAnsi="Times New Roman" w:cs="Times New Roman"/>
+                <w:rFonts w:ascii="Times New Roman" w:hAnsi="Times New Roman"/>
+                <w:color w:val="000000" w:themeColor="text1"/>
+                <w:sz w:val="14"/>
+                <w:szCs w:val="14"/>
               </w:rPr>
               <w:t>Settling Sampling of ISO 5 (2 locations)</w:t>
             </w:r>
@@ -3431,12 +2913,12 @@
             </w:pPr>
             <w:r>
               <w:rPr>
-                <w:color w:val="000000" w:themeColor="text1"/>
-                <w:sz w:val="14"/>
-                <w:szCs w:val="14"/>
-                <w:rFonts w:ascii="Times New Roman" w:hAnsi="Times New Roman" w:cs="Times New Roman"/>
-              </w:rPr>
-              <w:t xml:space="preserve">Daily</w:t>
+                <w:rFonts w:ascii="Times New Roman" w:hAnsi="Times New Roman"/>
+                <w:color w:val="000000" w:themeColor="text1"/>
+                <w:sz w:val="14"/>
+                <w:szCs w:val="14"/>
+              </w:rPr>
+              <w:t>Daily</w:t>
             </w:r>
           </w:p>
         </w:tc>
@@ -3468,12 +2950,12 @@
             </w:pPr>
             <w:r>
               <w:rPr>
-                <w:color w:val="000000" w:themeColor="text1"/>
-                <w:sz w:val="14"/>
-                <w:szCs w:val="14"/>
-                <w:rFonts w:ascii="Times New Roman" w:hAnsi="Times New Roman" w:cs="Times New Roman"/>
-              </w:rPr>
-              <w:t w:space="preserve" xml:space="preserve">24Aug26</w:t>
+                <w:rFonts w:ascii="Times New Roman" w:hAnsi="Times New Roman"/>
+                <w:color w:val="000000" w:themeColor="text1"/>
+                <w:sz w:val="14"/>
+                <w:szCs w:val="14"/>
+              </w:rPr>
+              <w:t>24Aug26</w:t>
             </w:r>
           </w:p>
         </w:tc>
@@ -3506,12 +2988,12 @@
             </w:pPr>
             <w:r>
               <w:rPr>
-                <w:color w:val="000000" w:themeColor="text1"/>
-                <w:sz w:val="14"/>
-                <w:szCs w:val="14"/>
-                <w:rFonts w:ascii="Times New Roman" w:hAnsi="Times New Roman" w:cs="Times New Roman"/>
-              </w:rPr>
-              <w:t w:space="preserve" xml:space="preserve">Pending</w:t>
+                <w:rFonts w:ascii="Times New Roman" w:hAnsi="Times New Roman"/>
+                <w:color w:val="000000" w:themeColor="text1"/>
+                <w:sz w:val="14"/>
+                <w:szCs w:val="14"/>
+              </w:rPr>
+              <w:t>ES</w:t>
             </w:r>
           </w:p>
         </w:tc>
@@ -3537,12 +3019,12 @@
             </w:pPr>
             <w:r>
               <w:rPr>
-                <w:color w:val="000000" w:themeColor="text1"/>
-                <w:sz w:val="14"/>
-                <w:szCs w:val="14"/>
-                <w:rFonts w:ascii="Times New Roman" w:hAnsi="Times New Roman" w:cs="Times New Roman"/>
-              </w:rPr>
-              <w:t xml:space="preserve">Date Before Testing</w:t>
+                <w:rFonts w:ascii="Times New Roman" w:hAnsi="Times New Roman"/>
+                <w:color w:val="000000" w:themeColor="text1"/>
+                <w:sz w:val="14"/>
+                <w:szCs w:val="14"/>
+              </w:rPr>
+              <w:t>Date Before Testing</w:t>
             </w:r>
           </w:p>
         </w:tc>
@@ -3575,49 +3057,12 @@
             </w:pPr>
             <w:r>
               <w:rPr>
-                <w:color w:val="000000" w:themeColor="text1"/>
-                <w:sz w:val="14"/>
-                <w:szCs w:val="14"/>
-                <w:rFonts w:ascii="Times New Roman" w:hAnsi="Times New Roman" w:cs="Times New Roman"/>
-              </w:rPr>
-              <w:t xml:space="preserve" w:space="preserve">No growth</w:t>
-            </w:r>
-            <w:r>
-              <w:rPr>
-                <w:color w:val="000000" w:themeColor="text1"/>
-                <w:sz w:val="14"/>
-                <w:szCs w:val="14"/>
-                <w:lang w:eastAsia="zh-CN"/>
-                <w:rFonts w:ascii="Times New Roman" w:hAnsi="Times New Roman" w:cs="Times New Roman"/>
-              </w:rPr>
-              <w:t/>
-            </w:r>
-            <w:r>
-              <w:rPr>
-                <w:color w:val="000000" w:themeColor="text1"/>
-                <w:sz w:val="14"/>
-                <w:szCs w:val="14"/>
-                <w:rFonts w:ascii="Times New Roman" w:hAnsi="Times New Roman" w:cs="Times New Roman"/>
-              </w:rPr>
-              <w:t/>
-            </w:r>
-            <w:r>
-              <w:rPr>
-                <w:color w:val="000000" w:themeColor="text1"/>
-                <w:sz w:val="14"/>
-                <w:szCs w:val="14"/>
-                <w:rFonts w:ascii="Times New Roman" w:hAnsi="Times New Roman" w:cs="Times New Roman"/>
-              </w:rPr>
-              <w:t/>
-            </w:r>
-            <w:r>
-              <w:rPr>
-                <w:color w:val="000000" w:themeColor="text1"/>
-                <w:sz w:val="14"/>
-                <w:szCs w:val="14"/>
-                <w:rFonts w:ascii="Times New Roman" w:hAnsi="Times New Roman" w:cs="Times New Roman"/>
-              </w:rPr>
-              <w:t xml:space="preserve"/>
+                <w:rFonts w:ascii="Times New Roman" w:hAnsi="Times New Roman"/>
+                <w:color w:val="000000" w:themeColor="text1"/>
+                <w:sz w:val="14"/>
+                <w:szCs w:val="14"/>
+              </w:rPr>
+              <w:t>No growth</w:t>
             </w:r>
           </w:p>
         </w:tc>
@@ -3640,49 +3085,12 @@
           <w:p>
             <w:r>
               <w:rPr>
-                <w:color w:val="000000" w:themeColor="text1"/>
-                <w:sz w:val="14"/>
-                <w:szCs w:val="14"/>
-                <w:rFonts w:ascii="Times New Roman" w:hAnsi="Times New Roman" w:cs="Times New Roman"/>
-              </w:rPr>
-              <w:t xml:space="preserve" w:space="preserve">N/A</w:t>
-            </w:r>
-            <w:r>
-              <w:rPr>
-                <w:color w:val="000000" w:themeColor="text1"/>
-                <w:sz w:val="14"/>
-                <w:szCs w:val="14"/>
-                <w:lang w:eastAsia="zh-CN"/>
-                <w:rFonts w:ascii="Times New Roman" w:hAnsi="Times New Roman" w:cs="Times New Roman"/>
-              </w:rPr>
-              <w:t/>
-            </w:r>
-            <w:r>
-              <w:rPr>
-                <w:color w:val="000000" w:themeColor="text1"/>
-                <w:sz w:val="14"/>
-                <w:szCs w:val="14"/>
-                <w:rFonts w:ascii="Times New Roman" w:hAnsi="Times New Roman" w:cs="Times New Roman"/>
-              </w:rPr>
-              <w:t/>
-            </w:r>
-            <w:r>
-              <w:rPr>
-                <w:color w:val="000000" w:themeColor="text1"/>
-                <w:sz w:val="14"/>
-                <w:szCs w:val="14"/>
-                <w:rFonts w:ascii="Times New Roman" w:hAnsi="Times New Roman" w:cs="Times New Roman"/>
-              </w:rPr>
-              <w:t/>
-            </w:r>
-            <w:r>
-              <w:rPr>
-                <w:color w:val="000000" w:themeColor="text1"/>
-                <w:sz w:val="14"/>
-                <w:szCs w:val="14"/>
-                <w:rFonts w:ascii="Times New Roman" w:hAnsi="Times New Roman" w:cs="Times New Roman"/>
-              </w:rPr>
-              <w:t xml:space="preserve"/>
+                <w:rFonts w:ascii="Times New Roman" w:hAnsi="Times New Roman"/>
+                <w:color w:val="000000" w:themeColor="text1"/>
+                <w:sz w:val="14"/>
+                <w:szCs w:val="14"/>
+              </w:rPr>
+              <w:t>N/A</w:t>
             </w:r>
           </w:p>
         </w:tc>
@@ -3705,49 +3113,12 @@
           <w:p>
             <w:r>
               <w:rPr>
-                <w:color w:val="000000" w:themeColor="text1"/>
-                <w:sz w:val="14"/>
-                <w:szCs w:val="14"/>
-                <w:rFonts w:ascii="Times New Roman" w:hAnsi="Times New Roman" w:cs="Times New Roman"/>
-              </w:rPr>
-              <w:t xml:space="preserve" w:space="preserve">N/A</w:t>
-            </w:r>
-            <w:r>
-              <w:rPr>
-                <w:color w:val="000000" w:themeColor="text1"/>
-                <w:sz w:val="14"/>
-                <w:szCs w:val="14"/>
-                <w:lang w:eastAsia="zh-CN"/>
-                <w:rFonts w:ascii="Times New Roman" w:hAnsi="Times New Roman" w:cs="Times New Roman"/>
-              </w:rPr>
-              <w:t/>
-            </w:r>
-            <w:r>
-              <w:rPr>
-                <w:color w:val="000000" w:themeColor="text1"/>
-                <w:sz w:val="14"/>
-                <w:szCs w:val="14"/>
-                <w:rFonts w:ascii="Times New Roman" w:hAnsi="Times New Roman" w:cs="Times New Roman"/>
-              </w:rPr>
-              <w:t/>
-            </w:r>
-            <w:r>
-              <w:rPr>
-                <w:color w:val="000000" w:themeColor="text1"/>
-                <w:sz w:val="14"/>
-                <w:szCs w:val="14"/>
-                <w:rFonts w:ascii="Times New Roman" w:hAnsi="Times New Roman" w:cs="Times New Roman"/>
-              </w:rPr>
-              <w:t/>
-            </w:r>
-            <w:r>
-              <w:rPr>
-                <w:color w:val="000000" w:themeColor="text1"/>
-                <w:sz w:val="14"/>
-                <w:szCs w:val="14"/>
-                <w:rFonts w:ascii="Times New Roman" w:hAnsi="Times New Roman" w:cs="Times New Roman"/>
-              </w:rPr>
-              <w:t xml:space="preserve"/>
+                <w:rFonts w:ascii="Times New Roman" w:hAnsi="Times New Roman"/>
+                <w:color w:val="000000" w:themeColor="text1"/>
+                <w:sz w:val="14"/>
+                <w:szCs w:val="14"/>
+              </w:rPr>
+              <w:t>N/A</w:t>
             </w:r>
           </w:p>
         </w:tc>
@@ -3780,10 +3151,10 @@
             </w:pPr>
             <w:r>
               <w:rPr>
-                <w:color w:val="000000" w:themeColor="text1"/>
-                <w:sz w:val="14"/>
-                <w:szCs w:val="14"/>
-                <w:rFonts w:ascii="Times New Roman" w:hAnsi="Times New Roman" w:cs="Times New Roman"/>
+                <w:rFonts w:ascii="Times New Roman" w:hAnsi="Times New Roman"/>
+                <w:color w:val="000000" w:themeColor="text1"/>
+                <w:sz w:val="14"/>
+                <w:szCs w:val="14"/>
               </w:rPr>
               <w:t xml:space="preserve">None </w:t>
             </w:r>
@@ -3816,10 +3187,10 @@
             </w:pPr>
             <w:r>
               <w:rPr>
-                <w:color w:val="000000" w:themeColor="text1"/>
-                <w:sz w:val="14"/>
-                <w:szCs w:val="14"/>
-                <w:rFonts w:ascii="Times New Roman" w:hAnsi="Times New Roman" w:cs="Times New Roman"/>
+                <w:rFonts w:ascii="Times New Roman" w:hAnsi="Times New Roman"/>
+                <w:color w:val="000000" w:themeColor="text1"/>
+                <w:sz w:val="14"/>
+                <w:szCs w:val="14"/>
               </w:rPr>
               <w:t>Settling Sampling of ISO 5 (2 locations)</w:t>
             </w:r>
@@ -3848,12 +3219,12 @@
             </w:pPr>
             <w:r>
               <w:rPr>
-                <w:color w:val="000000" w:themeColor="text1"/>
-                <w:sz w:val="14"/>
-                <w:szCs w:val="14"/>
-                <w:rFonts w:ascii="Times New Roman" w:hAnsi="Times New Roman" w:cs="Times New Roman"/>
-              </w:rPr>
-              <w:t xml:space="preserve">Daily</w:t>
+                <w:rFonts w:ascii="Times New Roman" w:hAnsi="Times New Roman"/>
+                <w:color w:val="000000" w:themeColor="text1"/>
+                <w:sz w:val="14"/>
+                <w:szCs w:val="14"/>
+              </w:rPr>
+              <w:t>Daily</w:t>
             </w:r>
           </w:p>
         </w:tc>
@@ -3885,21 +3256,12 @@
             </w:pPr>
             <w:r>
               <w:rPr>
-                <w:color w:val="000000" w:themeColor="text1"/>
-                <w:sz w:val="14"/>
-                <w:szCs w:val="14"/>
-                <w:rFonts w:ascii="Times New Roman" w:hAnsi="Times New Roman" w:cs="Times New Roman"/>
-              </w:rPr>
-              <w:t xml:space="preserve" w:space="preserve"> 25Aug26</w:t>
-            </w:r>
-            <w:r>
-              <w:rPr>
-                <w:color w:val="000000" w:themeColor="text1"/>
-                <w:sz w:val="14"/>
-                <w:szCs w:val="14"/>
-                <w:rFonts w:ascii="Times New Roman" w:hAnsi="Times New Roman" w:cs="Times New Roman"/>
-              </w:rPr>
-              <w:t/>
+                <w:rFonts w:ascii="Times New Roman" w:hAnsi="Times New Roman"/>
+                <w:color w:val="000000" w:themeColor="text1"/>
+                <w:sz w:val="14"/>
+                <w:szCs w:val="14"/>
+              </w:rPr>
+              <w:t xml:space="preserve"> 25Aug26</w:t>
             </w:r>
           </w:p>
         </w:tc>
@@ -3932,21 +3294,12 @@
             </w:pPr>
             <w:r>
               <w:rPr>
-                <w:color w:val="000000" w:themeColor="text1"/>
-                <w:sz w:val="14"/>
-                <w:szCs w:val="14"/>
-                <w:rFonts w:ascii="Times New Roman" w:hAnsi="Times New Roman" w:cs="Times New Roman"/>
-              </w:rPr>
-              <w:t w:space="preserve" xml:space="preserve">Pending </w:t>
-            </w:r>
-            <w:r>
-              <w:rPr>
-                <w:color w:val="000000" w:themeColor="text1"/>
-                <w:sz w:val="14"/>
-                <w:szCs w:val="14"/>
-                <w:rFonts w:ascii="Times New Roman" w:hAnsi="Times New Roman" w:cs="Times New Roman"/>
-              </w:rPr>
-              <w:t xml:space="preserve"/>
+                <w:rFonts w:ascii="Times New Roman" w:hAnsi="Times New Roman"/>
+                <w:color w:val="000000" w:themeColor="text1"/>
+                <w:sz w:val="14"/>
+                <w:szCs w:val="14"/>
+              </w:rPr>
+              <w:t xml:space="preserve">GS </w:t>
             </w:r>
           </w:p>
         </w:tc>
@@ -3972,12 +3325,12 @@
             </w:pPr>
             <w:r>
               <w:rPr>
-                <w:color w:val="000000" w:themeColor="text1"/>
-                <w:sz w:val="14"/>
-                <w:szCs w:val="14"/>
-                <w:rFonts w:ascii="Times New Roman" w:hAnsi="Times New Roman" w:cs="Times New Roman"/>
-              </w:rPr>
-              <w:t xml:space="preserve">Date of Testing</w:t>
+                <w:rFonts w:ascii="Times New Roman" w:hAnsi="Times New Roman"/>
+                <w:color w:val="000000" w:themeColor="text1"/>
+                <w:sz w:val="14"/>
+                <w:szCs w:val="14"/>
+              </w:rPr>
+              <w:t>Date of Testing</w:t>
             </w:r>
           </w:p>
         </w:tc>
@@ -4010,30 +3363,12 @@
             </w:pPr>
             <w:r>
               <w:rPr>
-                <w:color w:val="000000" w:themeColor="text1"/>
-                <w:sz w:val="14"/>
-                <w:szCs w:val="14"/>
-                <w:rFonts w:ascii="Times New Roman" w:hAnsi="Times New Roman" w:cs="Times New Roman"/>
-              </w:rPr>
-              <w:t w:space="preserve" xml:space="preserve">No growth</w:t>
-            </w:r>
-            <w:r>
-              <w:rPr>
-                <w:color w:val="000000" w:themeColor="text1"/>
-                <w:sz w:val="14"/>
-                <w:szCs w:val="14"/>
-                <w:rFonts w:ascii="Times New Roman" w:hAnsi="Times New Roman" w:cs="Times New Roman"/>
-              </w:rPr>
-              <w:t/>
-            </w:r>
-            <w:r>
-              <w:rPr>
-                <w:color w:val="000000" w:themeColor="text1"/>
-                <w:sz w:val="14"/>
-                <w:szCs w:val="14"/>
-                <w:rFonts w:ascii="Times New Roman" w:hAnsi="Times New Roman" w:cs="Times New Roman"/>
-              </w:rPr>
-              <w:t xml:space="preserve"/>
+                <w:rFonts w:ascii="Times New Roman" w:hAnsi="Times New Roman"/>
+                <w:color w:val="000000" w:themeColor="text1"/>
+                <w:sz w:val="14"/>
+                <w:szCs w:val="14"/>
+              </w:rPr>
+              <w:t>No growth</w:t>
             </w:r>
           </w:p>
         </w:tc>
@@ -4064,30 +3399,12 @@
             </w:pPr>
             <w:r>
               <w:rPr>
-                <w:color w:val="000000" w:themeColor="text1"/>
-                <w:sz w:val="14"/>
-                <w:szCs w:val="14"/>
-                <w:rFonts w:ascii="Times New Roman" w:hAnsi="Times New Roman" w:cs="Times New Roman"/>
-              </w:rPr>
-              <w:t w:space="preserve" xml:space="preserve">N/A</w:t>
-            </w:r>
-            <w:r>
-              <w:rPr>
-                <w:color w:val="000000" w:themeColor="text1"/>
-                <w:sz w:val="14"/>
-                <w:szCs w:val="14"/>
-                <w:rFonts w:ascii="Times New Roman" w:hAnsi="Times New Roman" w:cs="Times New Roman"/>
-              </w:rPr>
-              <w:t/>
-            </w:r>
-            <w:r>
-              <w:rPr>
-                <w:color w:val="000000" w:themeColor="text1"/>
-                <w:sz w:val="14"/>
-                <w:szCs w:val="14"/>
-                <w:rFonts w:ascii="Times New Roman" w:hAnsi="Times New Roman" w:cs="Times New Roman"/>
-              </w:rPr>
-              <w:t xml:space="preserve"/>
+                <w:rFonts w:ascii="Times New Roman" w:hAnsi="Times New Roman"/>
+                <w:color w:val="000000" w:themeColor="text1"/>
+                <w:sz w:val="14"/>
+                <w:szCs w:val="14"/>
+              </w:rPr>
+              <w:t>N/A</w:t>
             </w:r>
           </w:p>
         </w:tc>
@@ -4118,30 +3435,12 @@
             </w:pPr>
             <w:r>
               <w:rPr>
-                <w:color w:val="000000" w:themeColor="text1"/>
-                <w:sz w:val="14"/>
-                <w:szCs w:val="14"/>
-                <w:rFonts w:ascii="Times New Roman" w:hAnsi="Times New Roman" w:cs="Times New Roman"/>
-              </w:rPr>
-              <w:t w:space="preserve" xml:space="preserve">N/A</w:t>
-            </w:r>
-            <w:r>
-              <w:rPr>
-                <w:color w:val="000000" w:themeColor="text1"/>
-                <w:sz w:val="14"/>
-                <w:szCs w:val="14"/>
-                <w:rFonts w:ascii="Times New Roman" w:hAnsi="Times New Roman" w:cs="Times New Roman"/>
-              </w:rPr>
-              <w:t/>
-            </w:r>
-            <w:r>
-              <w:rPr>
-                <w:color w:val="000000" w:themeColor="text1"/>
-                <w:sz w:val="14"/>
-                <w:szCs w:val="14"/>
-                <w:rFonts w:ascii="Times New Roman" w:hAnsi="Times New Roman" w:cs="Times New Roman"/>
-              </w:rPr>
-              <w:t xml:space="preserve"/>
+                <w:rFonts w:ascii="Times New Roman" w:hAnsi="Times New Roman"/>
+                <w:color w:val="000000" w:themeColor="text1"/>
+                <w:sz w:val="14"/>
+                <w:szCs w:val="14"/>
+              </w:rPr>
+              <w:t>N/A</w:t>
             </w:r>
           </w:p>
         </w:tc>
@@ -4174,10 +3473,10 @@
             </w:pPr>
             <w:r>
               <w:rPr>
-                <w:color w:val="000000" w:themeColor="text1"/>
-                <w:sz w:val="14"/>
-                <w:szCs w:val="14"/>
-                <w:rFonts w:ascii="Times New Roman" w:hAnsi="Times New Roman" w:cs="Times New Roman"/>
+                <w:rFonts w:ascii="Times New Roman" w:hAnsi="Times New Roman"/>
+                <w:color w:val="000000" w:themeColor="text1"/>
+                <w:sz w:val="14"/>
+                <w:szCs w:val="14"/>
               </w:rPr>
               <w:t xml:space="preserve"> None</w:t>
             </w:r>
@@ -4210,10 +3509,10 @@
             </w:pPr>
             <w:r>
               <w:rPr>
-                <w:color w:val="000000" w:themeColor="text1"/>
-                <w:sz w:val="14"/>
-                <w:szCs w:val="14"/>
-                <w:rFonts w:ascii="Times New Roman" w:hAnsi="Times New Roman" w:cs="Times New Roman"/>
+                <w:rFonts w:ascii="Times New Roman" w:hAnsi="Times New Roman"/>
+                <w:color w:val="000000" w:themeColor="text1"/>
+                <w:sz w:val="14"/>
+                <w:szCs w:val="14"/>
               </w:rPr>
               <w:t>Settling Sampling of ISO 5 (2 locations)</w:t>
             </w:r>
@@ -4242,12 +3541,12 @@
             </w:pPr>
             <w:r>
               <w:rPr>
-                <w:color w:val="000000" w:themeColor="text1"/>
-                <w:sz w:val="14"/>
-                <w:szCs w:val="14"/>
-                <w:rFonts w:ascii="Times New Roman" w:hAnsi="Times New Roman" w:cs="Times New Roman"/>
-              </w:rPr>
-              <w:t xml:space="preserve">Daily</w:t>
+                <w:rFonts w:ascii="Times New Roman" w:hAnsi="Times New Roman"/>
+                <w:color w:val="000000" w:themeColor="text1"/>
+                <w:sz w:val="14"/>
+                <w:szCs w:val="14"/>
+              </w:rPr>
+              <w:t>Daily</w:t>
             </w:r>
           </w:p>
         </w:tc>
@@ -4279,21 +3578,12 @@
             </w:pPr>
             <w:r>
               <w:rPr>
-                <w:color w:val="000000" w:themeColor="text1"/>
-                <w:sz w:val="14"/>
-                <w:szCs w:val="14"/>
-                <w:rFonts w:ascii="Times New Roman" w:hAnsi="Times New Roman" w:cs="Times New Roman"/>
-              </w:rPr>
-              <w:t xml:space="preserve" w:space="preserve"> 26Aug26</w:t>
-            </w:r>
-            <w:r>
-              <w:rPr>
-                <w:color w:val="000000" w:themeColor="text1"/>
-                <w:sz w:val="14"/>
-                <w:szCs w:val="14"/>
-                <w:rFonts w:ascii="Times New Roman" w:hAnsi="Times New Roman" w:cs="Times New Roman"/>
-              </w:rPr>
-              <w:t/>
+                <w:rFonts w:ascii="Times New Roman" w:hAnsi="Times New Roman"/>
+                <w:color w:val="000000" w:themeColor="text1"/>
+                <w:sz w:val="14"/>
+                <w:szCs w:val="14"/>
+              </w:rPr>
+              <w:t xml:space="preserve"> 26Aug26</w:t>
             </w:r>
           </w:p>
         </w:tc>
@@ -4326,21 +3616,12 @@
             </w:pPr>
             <w:r>
               <w:rPr>
-                <w:color w:val="000000" w:themeColor="text1"/>
-                <w:sz w:val="14"/>
-                <w:szCs w:val="14"/>
-                <w:rFonts w:ascii="Times New Roman" w:hAnsi="Times New Roman" w:cs="Times New Roman"/>
-              </w:rPr>
-              <w:t w:space="preserve" xml:space="preserve">Pending </w:t>
-            </w:r>
-            <w:r>
-              <w:rPr>
-                <w:color w:val="000000" w:themeColor="text1"/>
-                <w:sz w:val="14"/>
-                <w:szCs w:val="14"/>
-                <w:rFonts w:ascii="Times New Roman" w:hAnsi="Times New Roman" w:cs="Times New Roman"/>
-              </w:rPr>
-              <w:t xml:space="preserve"/>
+                <w:rFonts w:ascii="Times New Roman" w:hAnsi="Times New Roman"/>
+                <w:color w:val="000000" w:themeColor="text1"/>
+                <w:sz w:val="14"/>
+                <w:szCs w:val="14"/>
+              </w:rPr>
+              <w:t xml:space="preserve">GS </w:t>
             </w:r>
           </w:p>
         </w:tc>
@@ -4366,12 +3647,12 @@
             </w:pPr>
             <w:r>
               <w:rPr>
-                <w:color w:val="000000" w:themeColor="text1"/>
-                <w:sz w:val="14"/>
-                <w:szCs w:val="14"/>
-                <w:rFonts w:ascii="Times New Roman" w:hAnsi="Times New Roman" w:cs="Times New Roman"/>
-              </w:rPr>
-              <w:t xml:space="preserve">Date After Testing</w:t>
+                <w:rFonts w:ascii="Times New Roman" w:hAnsi="Times New Roman"/>
+                <w:color w:val="000000" w:themeColor="text1"/>
+                <w:sz w:val="14"/>
+                <w:szCs w:val="14"/>
+              </w:rPr>
+              <w:t>Date After Testing</w:t>
             </w:r>
           </w:p>
         </w:tc>
@@ -4404,49 +3685,12 @@
             </w:pPr>
             <w:r>
               <w:rPr>
-                <w:color w:val="000000" w:themeColor="text1"/>
-                <w:sz w:val="14"/>
-                <w:szCs w:val="14"/>
-                <w:rFonts w:ascii="Times New Roman" w:hAnsi="Times New Roman" w:cs="Times New Roman"/>
-              </w:rPr>
-              <w:t xml:space="preserve" w:space="preserve">No growth</w:t>
-            </w:r>
-            <w:r>
-              <w:rPr>
-                <w:color w:val="000000" w:themeColor="text1"/>
-                <w:sz w:val="14"/>
-                <w:szCs w:val="14"/>
-                <w:lang w:eastAsia="zh-CN"/>
-                <w:rFonts w:ascii="Times New Roman" w:hAnsi="Times New Roman" w:cs="Times New Roman"/>
-              </w:rPr>
-              <w:t/>
-            </w:r>
-            <w:r>
-              <w:rPr>
-                <w:color w:val="000000" w:themeColor="text1"/>
-                <w:sz w:val="14"/>
-                <w:szCs w:val="14"/>
-                <w:rFonts w:ascii="Times New Roman" w:hAnsi="Times New Roman" w:cs="Times New Roman"/>
-              </w:rPr>
-              <w:t/>
-            </w:r>
-            <w:r>
-              <w:rPr>
-                <w:color w:val="000000" w:themeColor="text1"/>
-                <w:sz w:val="14"/>
-                <w:szCs w:val="14"/>
-                <w:rFonts w:ascii="Times New Roman" w:hAnsi="Times New Roman" w:cs="Times New Roman"/>
-              </w:rPr>
-              <w:t/>
-            </w:r>
-            <w:r>
-              <w:rPr>
-                <w:color w:val="000000" w:themeColor="text1"/>
-                <w:sz w:val="14"/>
-                <w:szCs w:val="14"/>
-                <w:rFonts w:ascii="Times New Roman" w:hAnsi="Times New Roman" w:cs="Times New Roman"/>
-              </w:rPr>
-              <w:t xml:space="preserve"/>
+                <w:rFonts w:ascii="Times New Roman" w:hAnsi="Times New Roman"/>
+                <w:color w:val="000000" w:themeColor="text1"/>
+                <w:sz w:val="14"/>
+                <w:szCs w:val="14"/>
+              </w:rPr>
+              <w:t>No growth</w:t>
             </w:r>
           </w:p>
         </w:tc>
@@ -4469,49 +3713,12 @@
           <w:p>
             <w:r>
               <w:rPr>
-                <w:color w:val="000000" w:themeColor="text1"/>
-                <w:sz w:val="14"/>
-                <w:szCs w:val="14"/>
-                <w:rFonts w:ascii="Times New Roman" w:hAnsi="Times New Roman" w:cs="Times New Roman"/>
-              </w:rPr>
-              <w:t xml:space="preserve" w:space="preserve">N/A</w:t>
-            </w:r>
-            <w:r>
-              <w:rPr>
-                <w:color w:val="000000" w:themeColor="text1"/>
-                <w:sz w:val="14"/>
-                <w:szCs w:val="14"/>
-                <w:lang w:eastAsia="zh-CN"/>
-                <w:rFonts w:ascii="Times New Roman" w:hAnsi="Times New Roman" w:cs="Times New Roman"/>
-              </w:rPr>
-              <w:t/>
-            </w:r>
-            <w:r>
-              <w:rPr>
-                <w:color w:val="000000" w:themeColor="text1"/>
-                <w:sz w:val="14"/>
-                <w:szCs w:val="14"/>
-                <w:rFonts w:ascii="Times New Roman" w:hAnsi="Times New Roman" w:cs="Times New Roman"/>
-              </w:rPr>
-              <w:t/>
-            </w:r>
-            <w:r>
-              <w:rPr>
-                <w:color w:val="000000" w:themeColor="text1"/>
-                <w:sz w:val="14"/>
-                <w:szCs w:val="14"/>
-                <w:rFonts w:ascii="Times New Roman" w:hAnsi="Times New Roman" w:cs="Times New Roman"/>
-              </w:rPr>
-              <w:t/>
-            </w:r>
-            <w:r>
-              <w:rPr>
-                <w:color w:val="000000" w:themeColor="text1"/>
-                <w:sz w:val="14"/>
-                <w:szCs w:val="14"/>
-                <w:rFonts w:ascii="Times New Roman" w:hAnsi="Times New Roman" w:cs="Times New Roman"/>
-              </w:rPr>
-              <w:t xml:space="preserve"/>
+                <w:rFonts w:ascii="Times New Roman" w:hAnsi="Times New Roman"/>
+                <w:color w:val="000000" w:themeColor="text1"/>
+                <w:sz w:val="14"/>
+                <w:szCs w:val="14"/>
+              </w:rPr>
+              <w:t>N/A</w:t>
             </w:r>
           </w:p>
         </w:tc>
@@ -4534,49 +3741,12 @@
           <w:p>
             <w:r>
               <w:rPr>
-                <w:color w:val="000000" w:themeColor="text1"/>
-                <w:sz w:val="14"/>
-                <w:szCs w:val="14"/>
-                <w:rFonts w:ascii="Times New Roman" w:hAnsi="Times New Roman" w:cs="Times New Roman"/>
-              </w:rPr>
-              <w:t xml:space="preserve" w:space="preserve"/>
-            </w:r>
-            <w:r>
-              <w:rPr>
-                <w:color w:val="000000" w:themeColor="text1"/>
-                <w:sz w:val="14"/>
-                <w:szCs w:val="14"/>
-                <w:lang w:eastAsia="zh-CN"/>
-                <w:rFonts w:ascii="Times New Roman" w:hAnsi="Times New Roman" w:cs="Times New Roman"/>
-              </w:rPr>
-              <w:t/>
-            </w:r>
-            <w:r>
-              <w:rPr>
-                <w:color w:val="000000" w:themeColor="text1"/>
-                <w:sz w:val="14"/>
-                <w:szCs w:val="14"/>
-                <w:rFonts w:ascii="Times New Roman" w:hAnsi="Times New Roman" w:cs="Times New Roman"/>
-              </w:rPr>
-              <w:t/>
-            </w:r>
-            <w:r>
-              <w:rPr>
-                <w:color w:val="000000" w:themeColor="text1"/>
-                <w:sz w:val="14"/>
-                <w:szCs w:val="14"/>
-                <w:rFonts w:ascii="Times New Roman" w:hAnsi="Times New Roman" w:cs="Times New Roman"/>
-              </w:rPr>
-              <w:t/>
-            </w:r>
-            <w:r>
-              <w:rPr>
-                <w:color w:val="000000" w:themeColor="text1"/>
-                <w:sz w:val="14"/>
-                <w:szCs w:val="14"/>
-                <w:rFonts w:ascii="Times New Roman" w:hAnsi="Times New Roman" w:cs="Times New Roman"/>
-              </w:rPr>
-              <w:t xml:space="preserve"/>
+                <w:rFonts w:ascii="Times New Roman" w:hAnsi="Times New Roman"/>
+                <w:color w:val="000000" w:themeColor="text1"/>
+                <w:sz w:val="14"/>
+                <w:szCs w:val="14"/>
+              </w:rPr>
+              <w:t>N/A</w:t>
             </w:r>
           </w:p>
         </w:tc>
@@ -4609,10 +3779,10 @@
             </w:pPr>
             <w:r>
               <w:rPr>
-                <w:color w:val="000000" w:themeColor="text1"/>
-                <w:sz w:val="14"/>
-                <w:szCs w:val="14"/>
-                <w:rFonts w:ascii="Times New Roman" w:hAnsi="Times New Roman" w:cs="Times New Roman"/>
+                <w:rFonts w:ascii="Times New Roman" w:hAnsi="Times New Roman"/>
+                <w:color w:val="000000" w:themeColor="text1"/>
+                <w:sz w:val="14"/>
+                <w:szCs w:val="14"/>
               </w:rPr>
               <w:t xml:space="preserve"> None</w:t>
             </w:r>
@@ -4639,12 +3809,12 @@
           <w:p>
             <w:r>
               <w:rPr>
+                <w:rFonts w:ascii="Times New Roman" w:hAnsi="Times New Roman"/>
                 <w:b/>
                 <w:bCs/>
                 <w:color w:val="000000" w:themeColor="text1"/>
                 <w:sz w:val="14"/>
                 <w:szCs w:val="14"/>
-                <w:rFonts w:ascii="Times New Roman" w:hAnsi="Times New Roman" w:cs="Times New Roman"/>
               </w:rPr>
               <w:t xml:space="preserve">   Weekly Active Air Sampling Bracketing</w:t>
             </w:r>
@@ -4673,10 +3843,10 @@
             </w:pPr>
             <w:r>
               <w:rPr>
-                <w:color w:val="000000" w:themeColor="text1"/>
-                <w:sz w:val="14"/>
-                <w:szCs w:val="14"/>
-                <w:rFonts w:ascii="Times New Roman" w:hAnsi="Times New Roman" w:cs="Times New Roman"/>
+                <w:rFonts w:ascii="Times New Roman" w:hAnsi="Times New Roman"/>
+                <w:color w:val="000000" w:themeColor="text1"/>
+                <w:sz w:val="14"/>
+                <w:szCs w:val="14"/>
               </w:rPr>
               <w:t>Active Air Sampling of Cleanrooms</w:t>
             </w:r>
@@ -4699,12 +3869,12 @@
             </w:pPr>
             <w:r>
               <w:rPr>
-                <w:color w:val="000000" w:themeColor="text1"/>
-                <w:sz w:val="14"/>
-                <w:szCs w:val="14"/>
-                <w:rFonts w:ascii="Times New Roman" w:hAnsi="Times New Roman" w:cs="Times New Roman"/>
-              </w:rPr>
-              <w:t xml:space="preserve">Weekly</w:t>
+                <w:rFonts w:ascii="Times New Roman" w:hAnsi="Times New Roman"/>
+                <w:color w:val="000000" w:themeColor="text1"/>
+                <w:sz w:val="14"/>
+                <w:szCs w:val="14"/>
+              </w:rPr>
+              <w:t>Weekly</w:t>
             </w:r>
           </w:p>
         </w:tc>
@@ -4731,12 +3901,12 @@
             </w:pPr>
             <w:r>
               <w:rPr>
-                <w:color w:val="000000" w:themeColor="text1"/>
-                <w:sz w:val="14"/>
-                <w:szCs w:val="14"/>
-                <w:rFonts w:ascii="Times New Roman" w:hAnsi="Times New Roman" w:cs="Times New Roman"/>
-              </w:rPr>
-              <w:t w:space="preserve" xml:space="preserve">25Aug26</w:t>
+                <w:rFonts w:ascii="Times New Roman" w:hAnsi="Times New Roman"/>
+                <w:color w:val="000000" w:themeColor="text1"/>
+                <w:sz w:val="14"/>
+                <w:szCs w:val="14"/>
+              </w:rPr>
+              <w:t>25Aug26</w:t>
             </w:r>
           </w:p>
         </w:tc>
@@ -4757,9 +3927,9 @@
             </w:pPr>
             <w:r>
               <w:rPr>
-                <w:sz w:val="14"/>
-                <w:szCs w:val="14"/>
-                <w:rFonts w:ascii="Times New Roman" w:hAnsi="Times New Roman" w:cs="Times New Roman"/>
+                <w:rFonts w:ascii="Times New Roman" w:hAnsi="Times New Roman"/>
+                <w:sz w:val="14"/>
+                <w:szCs w:val="14"/>
               </w:rPr>
               <w:t xml:space="preserve"> SMO</w:t>
             </w:r>
@@ -4783,12 +3953,12 @@
             </w:pPr>
             <w:r>
               <w:rPr>
-                <w:color w:val="000000" w:themeColor="text1"/>
-                <w:sz w:val="14"/>
-                <w:szCs w:val="14"/>
-                <w:rFonts w:ascii="Times New Roman" w:hAnsi="Times New Roman" w:cs="Times New Roman"/>
-              </w:rPr>
-              <w:t xml:space="preserve">Week on Testing Date</w:t>
+                <w:rFonts w:ascii="Times New Roman" w:hAnsi="Times New Roman"/>
+                <w:color w:val="000000" w:themeColor="text1"/>
+                <w:sz w:val="14"/>
+                <w:szCs w:val="14"/>
+              </w:rPr>
+              <w:t>Week on Testing Date</w:t>
             </w:r>
           </w:p>
         </w:tc>
@@ -4814,12 +3984,12 @@
             </w:pPr>
             <w:r>
               <w:rPr>
-                <w:color w:val="000000" w:themeColor="text1"/>
-                <w:sz w:val="14"/>
-                <w:szCs w:val="14"/>
-                <w:rFonts w:ascii="Times New Roman" w:hAnsi="Times New Roman" w:cs="Times New Roman"/>
-              </w:rPr>
-              <w:t w:space="preserve" xml:space="preserve">4 CFU (ISO 8 114)</w:t>
+                <w:rFonts w:ascii="Times New Roman" w:hAnsi="Times New Roman"/>
+                <w:color w:val="000000" w:themeColor="text1"/>
+                <w:sz w:val="14"/>
+                <w:szCs w:val="14"/>
+              </w:rPr>
+              <w:t>4 CFU (ISO 8 114)</w:t>
             </w:r>
           </w:p>
         </w:tc>
@@ -4845,12 +4015,12 @@
             </w:pPr>
             <w:r>
               <w:rPr>
-                <w:color w:val="000000" w:themeColor="text1"/>
-                <w:sz w:val="14"/>
-                <w:szCs w:val="14"/>
-                <w:rFonts w:ascii="Times New Roman" w:hAnsi="Times New Roman" w:cs="Times New Roman"/>
-              </w:rPr>
-              <w:t w:space="preserve" xml:space="preserve">ETX-260901-0112</w:t>
+                <w:rFonts w:ascii="Times New Roman" w:hAnsi="Times New Roman"/>
+                <w:color w:val="000000" w:themeColor="text1"/>
+                <w:sz w:val="14"/>
+                <w:szCs w:val="14"/>
+              </w:rPr>
+              <w:t>ETX-260901-0112</w:t>
             </w:r>
           </w:p>
         </w:tc>
@@ -4877,14 +4047,22 @@
             </w:pPr>
             <w:r>
               <w:rPr>
-                <w:color w:val="000000" w:themeColor="text1"/>
-                <w:sz w:val="14"/>
-                <w:szCs w:val="14"/>
-                <w:rFonts w:ascii="Times New Roman" w:hAnsi="Times New Roman" w:cs="Times New Roman"/>
-              </w:rPr>
-              <w:t w:space="preserve" xml:space="preserve">3 Gram (+) cocci,</w:t>
+                <w:rFonts w:ascii="Times New Roman" w:hAnsi="Times New Roman"/>
+                <w:color w:val="000000" w:themeColor="text1"/>
+                <w:sz w:val="14"/>
+                <w:szCs w:val="14"/>
+              </w:rPr>
+              <w:t>3 Gram (+) cocci,</w:t>
+            </w:r>
+            <w:r>
+              <w:rPr>
+                <w:rFonts w:ascii="Times New Roman" w:hAnsi="Times New Roman"/>
+                <w:color w:val="000000" w:themeColor="text1"/>
+                <w:sz w:val="14"/>
+                <w:szCs w:val="14"/>
+              </w:rPr>
               <w:br/>
-              <w:t xml:space="preserve">1 Hyphae</w:t>
+              <w:t>1 Hyphae</w:t>
             </w:r>
           </w:p>
         </w:tc>
@@ -4910,9 +4088,9 @@
             </w:pPr>
             <w:r>
               <w:rPr>
-                <w:sz w:val="14"/>
-                <w:szCs w:val="14"/>
-                <w:rFonts w:ascii="Times New Roman" w:hAnsi="Times New Roman" w:cs="Times New Roman"/>
+                <w:rFonts w:ascii="Times New Roman" w:hAnsi="Times New Roman"/>
+                <w:sz w:val="14"/>
+                <w:szCs w:val="14"/>
               </w:rPr>
               <w:t xml:space="preserve">None </w:t>
             </w:r>
@@ -4939,12 +4117,12 @@
           <w:p>
             <w:r>
               <w:rPr>
+                <w:rFonts w:ascii="Times New Roman" w:hAnsi="Times New Roman"/>
                 <w:b/>
                 <w:bCs/>
                 <w:color w:val="000000" w:themeColor="text1"/>
                 <w:sz w:val="14"/>
                 <w:szCs w:val="14"/>
-                <w:rFonts w:ascii="Times New Roman" w:hAnsi="Times New Roman" w:cs="Times New Roman"/>
               </w:rPr>
               <w:t xml:space="preserve">   Surface Sampling of Anteroom and Cleanroom Bracketing </w:t>
             </w:r>
@@ -4973,10 +4151,10 @@
             </w:pPr>
             <w:r>
               <w:rPr>
-                <w:color w:val="000000" w:themeColor="text1"/>
-                <w:sz w:val="14"/>
-                <w:szCs w:val="14"/>
-                <w:rFonts w:ascii="Times New Roman" w:hAnsi="Times New Roman" w:cs="Times New Roman"/>
+                <w:rFonts w:ascii="Times New Roman" w:hAnsi="Times New Roman"/>
+                <w:color w:val="000000" w:themeColor="text1"/>
+                <w:sz w:val="14"/>
+                <w:szCs w:val="14"/>
               </w:rPr>
               <w:t>Surface Sampling of Cleanrooms</w:t>
             </w:r>
@@ -4999,12 +4177,12 @@
             </w:pPr>
             <w:r>
               <w:rPr>
-                <w:color w:val="000000" w:themeColor="text1"/>
-                <w:sz w:val="14"/>
-                <w:szCs w:val="14"/>
-                <w:rFonts w:ascii="Times New Roman" w:hAnsi="Times New Roman" w:cs="Times New Roman"/>
-              </w:rPr>
-              <w:t xml:space="preserve">Weekly</w:t>
+                <w:rFonts w:ascii="Times New Roman" w:hAnsi="Times New Roman"/>
+                <w:color w:val="000000" w:themeColor="text1"/>
+                <w:sz w:val="14"/>
+                <w:szCs w:val="14"/>
+              </w:rPr>
+              <w:t>Weekly</w:t>
             </w:r>
           </w:p>
         </w:tc>
@@ -5031,10 +4209,10 @@
             </w:pPr>
             <w:r>
               <w:rPr>
-                <w:color w:val="000000" w:themeColor="text1"/>
-                <w:sz w:val="14"/>
-                <w:szCs w:val="14"/>
-                <w:rFonts w:ascii="Times New Roman" w:hAnsi="Times New Roman" w:cs="Times New Roman"/>
+                <w:rFonts w:ascii="Times New Roman" w:hAnsi="Times New Roman"/>
+                <w:color w:val="000000" w:themeColor="text1"/>
+                <w:sz w:val="14"/>
+                <w:szCs w:val="14"/>
               </w:rPr>
               <w:t xml:space="preserve"> 25Aug26</w:t>
             </w:r>
@@ -5057,9 +4235,9 @@
             </w:pPr>
             <w:r>
               <w:rPr>
-                <w:sz w:val="14"/>
-                <w:szCs w:val="14"/>
-                <w:rFonts w:ascii="Times New Roman" w:hAnsi="Times New Roman" w:cs="Times New Roman"/>
+                <w:rFonts w:ascii="Times New Roman" w:hAnsi="Times New Roman"/>
+                <w:sz w:val="14"/>
+                <w:szCs w:val="14"/>
               </w:rPr>
               <w:t xml:space="preserve"> SMO</w:t>
             </w:r>
@@ -5083,12 +4261,12 @@
             </w:pPr>
             <w:r>
               <w:rPr>
-                <w:color w:val="000000" w:themeColor="text1"/>
-                <w:sz w:val="14"/>
-                <w:szCs w:val="14"/>
-                <w:rFonts w:ascii="Times New Roman" w:hAnsi="Times New Roman" w:cs="Times New Roman"/>
-              </w:rPr>
-              <w:t xml:space="preserve">Week on Testing Date</w:t>
+                <w:rFonts w:ascii="Times New Roman" w:hAnsi="Times New Roman"/>
+                <w:color w:val="000000" w:themeColor="text1"/>
+                <w:sz w:val="14"/>
+                <w:szCs w:val="14"/>
+              </w:rPr>
+              <w:t>Week on Testing Date</w:t>
             </w:r>
           </w:p>
         </w:tc>
@@ -5114,12 +4292,12 @@
             </w:pPr>
             <w:r>
               <w:rPr>
-                <w:color w:val="000000" w:themeColor="text1"/>
-                <w:sz w:val="14"/>
-                <w:szCs w:val="14"/>
-                <w:rFonts w:ascii="Times New Roman" w:hAnsi="Times New Roman" w:cs="Times New Roman"/>
-              </w:rPr>
-              <w:t w:space="preserve" xml:space="preserve">No growth</w:t>
+                <w:rFonts w:ascii="Times New Roman" w:hAnsi="Times New Roman"/>
+                <w:color w:val="000000" w:themeColor="text1"/>
+                <w:sz w:val="14"/>
+                <w:szCs w:val="14"/>
+              </w:rPr>
+              <w:t>No growth</w:t>
             </w:r>
           </w:p>
         </w:tc>
@@ -5145,12 +4323,12 @@
             </w:pPr>
             <w:r>
               <w:rPr>
-                <w:color w:val="000000" w:themeColor="text1"/>
-                <w:sz w:val="14"/>
-                <w:szCs w:val="14"/>
-                <w:rFonts w:ascii="Times New Roman" w:hAnsi="Times New Roman" w:cs="Times New Roman"/>
-              </w:rPr>
-              <w:t w:space="preserve" xml:space="preserve">N/A</w:t>
+                <w:rFonts w:ascii="Times New Roman" w:hAnsi="Times New Roman"/>
+                <w:color w:val="000000" w:themeColor="text1"/>
+                <w:sz w:val="14"/>
+                <w:szCs w:val="14"/>
+              </w:rPr>
+              <w:t>N/A</w:t>
             </w:r>
           </w:p>
         </w:tc>
@@ -5177,12 +4355,12 @@
             </w:pPr>
             <w:r>
               <w:rPr>
-                <w:color w:val="000000" w:themeColor="text1"/>
-                <w:sz w:val="14"/>
-                <w:szCs w:val="14"/>
-                <w:rFonts w:ascii="Times New Roman" w:hAnsi="Times New Roman" w:cs="Times New Roman"/>
-              </w:rPr>
-              <w:t w:space="preserve" xml:space="preserve">N/A</w:t>
+                <w:rFonts w:ascii="Times New Roman" w:hAnsi="Times New Roman"/>
+                <w:color w:val="000000" w:themeColor="text1"/>
+                <w:sz w:val="14"/>
+                <w:szCs w:val="14"/>
+              </w:rPr>
+              <w:t>N/A</w:t>
             </w:r>
           </w:p>
         </w:tc>
@@ -5208,9 +4386,9 @@
             </w:pPr>
             <w:r>
               <w:rPr>
-                <w:sz w:val="14"/>
-                <w:szCs w:val="14"/>
-                <w:rFonts w:ascii="Times New Roman" w:hAnsi="Times New Roman" w:cs="Times New Roman"/>
+                <w:rFonts w:ascii="Times New Roman" w:hAnsi="Times New Roman"/>
+                <w:sz w:val="14"/>
+                <w:szCs w:val="14"/>
               </w:rPr>
               <w:t>None</w:t>
             </w:r>

</xml_diff>